<commit_message>
Business plan v6: product live on Apple App Store and Google Play
Co-Authored-By: Claude Opus 5.5 <noreply@anthropic.com>
Claude-Session: https://claude.ai/code/session_0146q3FtAYmgQ1rtNsNNpdiD
</commit_message>
<xml_diff>
--- a/visa_appendices/docx/DEQUAD_UKES_Business_Plan_v6.docx
+++ b/visa_appendices/docx/DEQUAD_UKES_Business_Plan_v6.docx
@@ -192,23 +192,56 @@
               <w:jc w:val="left"/>
             </w:pPr>
             <w:r>
-              <w:t xml:space="preserve">Live in production at</w:t>
+              <w:rPr>
+                <w:bCs/>
+                <w:b/>
+              </w:rPr>
+              <w:t xml:space="preserve">Live and fully functional</w:t>
             </w:r>
             <w:r>
               <w:t xml:space="preserve"> </w:t>
             </w:r>
             <w:r>
+              <w:t xml:space="preserve">on the</w:t>
+            </w:r>
+            <w:r>
+              <w:t xml:space="preserve"> </w:t>
+            </w:r>
+            <w:r>
+              <w:rPr>
+                <w:bCs/>
+                <w:b/>
+              </w:rPr>
+              <w:t xml:space="preserve">Apple App Store</w:t>
+            </w:r>
+            <w:r>
+              <w:t xml:space="preserve"> </w:t>
+            </w:r>
+            <w:r>
+              <w:t xml:space="preserve">and</w:t>
+            </w:r>
+            <w:r>
+              <w:t xml:space="preserve"> </w:t>
+            </w:r>
+            <w:r>
+              <w:rPr>
+                <w:bCs/>
+                <w:b/>
+              </w:rPr>
+              <w:t xml:space="preserve">Google Play Store</w:t>
+            </w:r>
+            <w:r>
+              <w:t xml:space="preserve">, and on the web at</w:t>
+            </w:r>
+            <w:r>
+              <w:t xml:space="preserve"> </w:t>
+            </w:r>
+            <w:r>
               <w:rPr>
                 <w:bCs/>
                 <w:b/>
               </w:rPr>
               <w:t xml:space="preserve">dequad.co.uk</w:t>
-            </w:r>
-            <w:r>
-              <w:t xml:space="preserve"> </w:t>
-            </w:r>
-            <w:r>
-              <w:t xml:space="preserve">(web), Android and iOS</w:t>
             </w:r>
           </w:p>
         </w:tc>
@@ -918,13 +951,10 @@
                 <w:bCs/>
                 <w:b/>
               </w:rPr>
-              <w:t xml:space="preserve">Built and live.</w:t>
-            </w:r>
-            <w:r>
-              <w:t xml:space="preserve"> </w:t>
-            </w:r>
-            <w:r>
-              <w:t xml:space="preserve">Web, Android and iOS. The live product includes verified matching, chat, daily mood tracking, lecture feedback, graded safeguarding alerts, admin verification queue, university dashboard, AI cohort analysis, CSV exports, Stripe and in-app billing, and partner-university licence management.</w:t>
+              <w:t xml:space="preserve">Live and fully functional on the Apple App Store and Google Play Store</w:t>
+            </w:r>
+            <w:r>
+              <w:t xml:space="preserve">, and on the web at dequad.co.uk. Anyone with a UK university email can download it today. The live product includes verified matching, chat, daily mood tracking, lecture feedback, graded safeguarding alerts, admin verification queue, university dashboard, AI cohort analysis, CSV exports, Stripe and in-app billing, and partner-university licence management.</w:t>
             </w:r>
           </w:p>
         </w:tc>
@@ -1627,7 +1657,39 @@
         <w:pStyle w:val="FirstParagraph"/>
       </w:pPr>
       <w:r>
-        <w:t xml:space="preserve">DEQUAD is a single codebase serving web (dequad.co.uk), Android and iOS (Expo / React Native), backed by a Python FastAPI service and MongoDB. It is built from five modules.</w:t>
+        <w:t xml:space="preserve">DEQUAD is live and fully functional on the</w:t>
+      </w:r>
+      <w:r>
+        <w:t xml:space="preserve"> </w:t>
+      </w:r>
+      <w:r>
+        <w:rPr>
+          <w:bCs/>
+          <w:b/>
+        </w:rPr>
+        <w:t xml:space="preserve">Apple App Store</w:t>
+      </w:r>
+      <w:r>
+        <w:t xml:space="preserve"> </w:t>
+      </w:r>
+      <w:r>
+        <w:t xml:space="preserve">(iOS) and</w:t>
+      </w:r>
+      <w:r>
+        <w:t xml:space="preserve"> </w:t>
+      </w:r>
+      <w:r>
+        <w:rPr>
+          <w:bCs/>
+          <w:b/>
+        </w:rPr>
+        <w:t xml:space="preserve">Google Play Store</w:t>
+      </w:r>
+      <w:r>
+        <w:t xml:space="preserve"> </w:t>
+      </w:r>
+      <w:r>
+        <w:t xml:space="preserve">(Android), and on the web at dequad.co.uk. All three run from a single codebase (Expo / React Native), backed by a Python FastAPI service and MongoDB. Both app stores reviewed and approved it against their privacy, safety and in-app-purchase rules before publication. It is built from five modules.</w:t>
       </w:r>
     </w:p>
     <w:tbl>
@@ -2543,7 +2605,7 @@
         <w:t xml:space="preserve"> </w:t>
       </w:r>
       <w:r>
-        <w:t xml:space="preserve">The product is live on web, Android and iOS, with billing, safeguarding and university tooling in production. Year 1 needs no development spend beyond hosting and tools.</w:t>
+        <w:t xml:space="preserve">DEQUAD is live and fully functional on the Apple App Store and Google Play Store, as well as the web. It has passed both stores’ review processes, and billing, safeguarding and university tooling are all in production. Year 1 needs no development spend beyond hosting and tools.</w:t>
       </w:r>
     </w:p>
     <w:p>
@@ -8269,6 +8331,61 @@
           <w:bCs/>
           <w:b/>
         </w:rPr>
+        <w:t xml:space="preserve">App-store presence.</w:t>
+      </w:r>
+      <w:r>
+        <w:t xml:space="preserve"> </w:t>
+      </w:r>
+      <w:r>
+        <w:t xml:space="preserve">DEQUAD is live on the Apple App Store and Google Play, so every campus campaign sends students straight to a one-tap download. App-store optimisation (keywords such as</w:t>
+      </w:r>
+      <w:r>
+        <w:t xml:space="preserve"> </w:t>
+      </w:r>
+      <w:r>
+        <w:t xml:space="preserve">“</w:t>
+      </w:r>
+      <w:r>
+        <w:t xml:space="preserve">uni friends</w:t>
+      </w:r>
+      <w:r>
+        <w:t xml:space="preserve">”</w:t>
+      </w:r>
+      <w:r>
+        <w:t xml:space="preserve"> </w:t>
+      </w:r>
+      <w:r>
+        <w:t xml:space="preserve">and</w:t>
+      </w:r>
+      <w:r>
+        <w:t xml:space="preserve"> </w:t>
+      </w:r>
+      <w:r>
+        <w:t xml:space="preserve">“</w:t>
+      </w:r>
+      <w:r>
+        <w:t xml:space="preserve">student wellbeing</w:t>
+      </w:r>
+      <w:r>
+        <w:t xml:space="preserve">”</w:t>
+      </w:r>
+      <w:r>
+        <w:t xml:space="preserve">, screenshots and ratings prompts after a first match) is a free, always-on acquisition channel.</w:t>
+      </w:r>
+    </w:p>
+    <w:p>
+      <w:pPr>
+        <w:numPr>
+          <w:ilvl w:val="0"/>
+          <w:numId w:val="1010"/>
+        </w:numPr>
+        <w:pStyle w:val="Compact"/>
+      </w:pPr>
+      <w:r>
+        <w:rPr>
+          <w:bCs/>
+          <w:b/>
+        </w:rPr>
         <w:t xml:space="preserve">In-product virality.</w:t>
       </w:r>
       <w:r>
@@ -8800,7 +8917,7 @@
               <w:jc w:val="left"/>
             </w:pPr>
             <w:r>
-              <w:t xml:space="preserve">Live, full-featured product on web, Android and iOS, so build risk is retired</w:t>
+              <w:t xml:space="preserve">Fully functional product live on the Apple App Store, Google Play and web, so build and distribution risk is retired</w:t>
             </w:r>
           </w:p>
         </w:tc>

</xml_diff>

<commit_message>
Business plan v6: patent attorney consulted; patent exploration in Year 3
Co-Authored-By: Claude Opus 5.5 <noreply@anthropic.com>
Claude-Session: https://claude.ai/code/session_0146q3FtAYmgQ1rtNsNNpdiD
</commit_message>
<xml_diff>
--- a/visa_appendices/docx/DEQUAD_UKES_Business_Plan_v6.docx
+++ b/visa_appendices/docx/DEQUAD_UKES_Business_Plan_v6.docx
@@ -1320,19 +1320,19 @@
               <w:jc w:val="right"/>
             </w:pPr>
             <w:r>
-              <w:t xml:space="preserve">£8,111</w:t>
-            </w:r>
-          </w:p>
-        </w:tc>
-        <w:tc>
-          <w:tcPr/>
-          <w:p>
-            <w:pPr>
-              <w:pStyle w:val="Compact"/>
-              <w:jc w:val="right"/>
-            </w:pPr>
-            <w:r>
-              <w:t xml:space="preserve">(£420)</w:t>
+              <w:t xml:space="preserve">£8,597</w:t>
+            </w:r>
+          </w:p>
+        </w:tc>
+        <w:tc>
+          <w:tcPr/>
+          <w:p>
+            <w:pPr>
+              <w:pStyle w:val="Compact"/>
+              <w:jc w:val="right"/>
+            </w:pPr>
+            <w:r>
+              <w:t xml:space="preserve">(£1,020)</w:t>
             </w:r>
           </w:p>
         </w:tc>
@@ -1370,19 +1370,19 @@
               <w:jc w:val="right"/>
             </w:pPr>
             <w:r>
-              <w:t xml:space="preserve">£18,526</w:t>
-            </w:r>
-          </w:p>
-        </w:tc>
-        <w:tc>
-          <w:tcPr/>
-          <w:p>
-            <w:pPr>
-              <w:pStyle w:val="Compact"/>
-              <w:jc w:val="right"/>
-            </w:pPr>
-            <w:r>
-              <w:t xml:space="preserve">£23,230</w:t>
+              <w:t xml:space="preserve">£19,126</w:t>
+            </w:r>
+          </w:p>
+        </w:tc>
+        <w:tc>
+          <w:tcPr/>
+          <w:p>
+            <w:pPr>
+              <w:pStyle w:val="Compact"/>
+              <w:jc w:val="right"/>
+            </w:pPr>
+            <w:r>
+              <w:t xml:space="preserve">£23,116</w:t>
             </w:r>
           </w:p>
         </w:tc>
@@ -1622,7 +1622,7 @@
         <w:t xml:space="preserve">four full-time UK jobs (a £30,000 Software Engineer and three roles at £25,000) plus a part-time safeguarding role</w:t>
       </w:r>
       <w:r>
-        <w:t xml:space="preserve">, pays the founder, and still ends Year 3 with £21,064 in the bank.</w:t>
+        <w:t xml:space="preserve">, pays the founder, and still ends Year 3 with £20,950 in the bank.</w:t>
       </w:r>
     </w:p>
     <w:p>
@@ -3369,12 +3369,28 @@
               <w:jc w:val="left"/>
             </w:pPr>
             <w:r>
-              <w:t xml:space="preserve">No patent has been filed yet. Software</w:t>
+              <w:t xml:space="preserve">No patent has been filed yet. The founder has</w:t>
             </w:r>
             <w:r>
               <w:t xml:space="preserve"> </w:t>
             </w:r>
             <w:r>
+              <w:rPr>
+                <w:bCs/>
+                <w:b/>
+              </w:rPr>
+              <w:t xml:space="preserve">already consulted a UK patent attorney</w:t>
+            </w:r>
+            <w:r>
+              <w:t xml:space="preserve"> </w:t>
+            </w:r>
+            <w:r>
+              <w:t xml:space="preserve">about the most technical candidate: the method of combining verified-identity, mood-trajectory and engagement signals to produce graded, routed safeguarding alerts with per-institution data scoping. Software</w:t>
+            </w:r>
+            <w:r>
+              <w:t xml:space="preserve"> </w:t>
+            </w:r>
+            <w:r>
               <w:t xml:space="preserve">“</w:t>
             </w:r>
             <w:r>
@@ -3387,57 +3403,54 @@
               <w:t xml:space="preserve"> </w:t>
             </w:r>
             <w:r>
-              <w:t xml:space="preserve">is excluded from patent protection in the UK, so DEQUAD will only file if a specialist confirms a technical contribution</w:t>
-            </w:r>
-          </w:p>
-        </w:tc>
-        <w:tc>
-          <w:tcPr/>
-          <w:p>
-            <w:pPr>
-              <w:pStyle w:val="Compact"/>
-              <w:jc w:val="left"/>
-            </w:pPr>
-            <w:r>
-              <w:rPr>
-                <w:bCs/>
-                <w:b/>
-              </w:rPr>
-              <w:t xml:space="preserve">Patent search and patentability opinion</w:t>
+              <w:t xml:space="preserve">is excluded from UK patent protection, so DEQUAD will only file if the attorney confirms a technical contribution</w:t>
+            </w:r>
+          </w:p>
+        </w:tc>
+        <w:tc>
+          <w:tcPr/>
+          <w:p>
+            <w:pPr>
+              <w:pStyle w:val="Compact"/>
+              <w:jc w:val="left"/>
+            </w:pPr>
+            <w:r>
+              <w:rPr>
+                <w:bCs/>
+                <w:b/>
+              </w:rPr>
+              <w:t xml:space="preserve">Patent exploration in Year 3</w:t>
+            </w:r>
+            <w:r>
+              <w:t xml:space="preserve">, with the same attorney: a formal prior-art search and patentability opinion, followed by a</w:t>
             </w:r>
             <w:r>
               <w:t xml:space="preserve"> </w:t>
             </w:r>
             <w:r>
-              <w:t xml:space="preserve">from a UK patent attorney on the most technical candidate: the method of combining verified-identity, mood-trajectory and engagement signals to produce graded, routed safeguarding alerts with per-institution data scoping. If the opinion is positive, a</w:t>
+              <w:rPr>
+                <w:bCs/>
+                <w:b/>
+              </w:rPr>
+              <w:t xml:space="preserve">UK priority application</w:t>
             </w:r>
             <w:r>
               <w:t xml:space="preserve"> </w:t>
             </w:r>
             <w:r>
-              <w:rPr>
-                <w:bCs/>
-                <w:b/>
-              </w:rPr>
-              <w:t xml:space="preserve">UK priority application</w:t>
-            </w:r>
-            <w:r>
-              <w:t xml:space="preserve"> </w:t>
-            </w:r>
-            <w:r>
-              <w:t xml:space="preserve">at the UK IPO</w:t>
-            </w:r>
-          </w:p>
-        </w:tc>
-        <w:tc>
-          <w:tcPr/>
-          <w:p>
-            <w:pPr>
-              <w:pStyle w:val="Compact"/>
-              <w:jc w:val="left"/>
-            </w:pPr>
-            <w:r>
-              <w:t xml:space="preserve">Opinion in Year 2 (May 2028, £600); UK filing in Year 3 (Feb 2029, £1,500), both in the financial forecast (Section 13, legal &amp; IP line)</w:t>
+              <w:t xml:space="preserve">at the UK IPO if the opinion is positive. Year 3 timing means the claims can draw on two years of real alert data and the personal-baseline model (Section 4.2)</w:t>
+            </w:r>
+          </w:p>
+        </w:tc>
+        <w:tc>
+          <w:tcPr/>
+          <w:p>
+            <w:pPr>
+              <w:pStyle w:val="Compact"/>
+              <w:jc w:val="left"/>
+            </w:pPr>
+            <w:r>
+              <w:t xml:space="preserve">Opinion Oct 2028 (£600); UK filing May 2029 (£1,500) if positive; both in the Year 3 forecast (Section 13, legal &amp; IP line)</w:t>
             </w:r>
           </w:p>
         </w:tc>
@@ -9619,7 +9632,7 @@
               <w:jc w:val="left"/>
             </w:pPr>
             <w:r>
-              <w:t xml:space="preserve">No patent filed or exclusivity agreed yet: both are planned (Section 3.4), not in place</w:t>
+              <w:t xml:space="preserve">No patent filed yet (patent attorney consulted; exploration planned for Year 3) and no exclusivity agreed yet (Section 3.4)</w:t>
             </w:r>
           </w:p>
         </w:tc>
@@ -10030,7 +10043,7 @@
               <w:jc w:val="left"/>
             </w:pPr>
             <w:r>
-              <w:t xml:space="preserve">Barriers in Section 3.4: server-side trade secrets and IP-assignment deeds, a growing proprietary verified dataset, preferred-supplier terms sought in the LOI and licences, a patentability opinion and possible UK filing, and a UK trademark; plus positioning DEQUAD as complementary to clinical incumbents</w:t>
+              <w:t xml:space="preserve">Barriers in Section 3.4: server-side trade secrets and IP-assignment deeds, a growing proprietary verified dataset, preferred-supplier terms sought in the LOI and licences, patent exploration with an attorney already consulted (Year 3), and a UK trademark; plus positioning DEQUAD as complementary to clinical incumbents</w:t>
             </w:r>
           </w:p>
         </w:tc>
@@ -11000,19 +11013,19 @@
               <w:jc w:val="right"/>
             </w:pPr>
             <w:r>
-              <w:t xml:space="preserve">£20,174</w:t>
-            </w:r>
-          </w:p>
-        </w:tc>
-        <w:tc>
-          <w:tcPr/>
-          <w:p>
-            <w:pPr>
-              <w:pStyle w:val="Compact"/>
-              <w:jc w:val="right"/>
-            </w:pPr>
-            <w:r>
-              <w:t xml:space="preserve">(£35,726)</w:t>
+              <w:t xml:space="preserve">£20,774</w:t>
+            </w:r>
+          </w:p>
+        </w:tc>
+        <w:tc>
+          <w:tcPr/>
+          <w:p>
+            <w:pPr>
+              <w:pStyle w:val="Compact"/>
+              <w:jc w:val="right"/>
+            </w:pPr>
+            <w:r>
+              <w:t xml:space="preserve">(£36,326)</w:t>
             </w:r>
           </w:p>
         </w:tc>
@@ -11050,19 +11063,19 @@
               <w:jc w:val="right"/>
             </w:pPr>
             <w:r>
-              <w:t xml:space="preserve">£36,712</w:t>
-            </w:r>
-          </w:p>
-        </w:tc>
-        <w:tc>
-          <w:tcPr/>
-          <w:p>
-            <w:pPr>
-              <w:pStyle w:val="Compact"/>
-              <w:jc w:val="right"/>
-            </w:pPr>
-            <w:r>
-              <w:t xml:space="preserve">£21,064</w:t>
+              <w:t xml:space="preserve">£37,312</w:t>
+            </w:r>
+          </w:p>
+        </w:tc>
+        <w:tc>
+          <w:tcPr/>
+          <w:p>
+            <w:pPr>
+              <w:pStyle w:val="Compact"/>
+              <w:jc w:val="right"/>
+            </w:pPr>
+            <w:r>
+              <w:t xml:space="preserve">£20,950</w:t>
             </w:r>
           </w:p>
         </w:tc>
@@ -14597,7 +14610,7 @@
               <w:jc w:val="right"/>
             </w:pPr>
             <w:r>
-              <w:t xml:space="preserve">£18,526</w:t>
+              <w:t xml:space="preserve">£19,126</w:t>
             </w:r>
           </w:p>
         </w:tc>
@@ -15101,19 +15114,19 @@
               <w:jc w:val="right"/>
             </w:pPr>
             <w:r>
-              <w:t xml:space="preserve">(£6,861)</w:t>
-            </w:r>
-          </w:p>
-        </w:tc>
-        <w:tc>
-          <w:tcPr/>
-          <w:p>
-            <w:pPr>
-              <w:pStyle w:val="Compact"/>
-              <w:jc w:val="right"/>
-            </w:pPr>
-            <w:r>
-              <w:t xml:space="preserve">(£10,221)</w:t>
+              <w:t xml:space="preserve">(£6,261)</w:t>
+            </w:r>
+          </w:p>
+        </w:tc>
+        <w:tc>
+          <w:tcPr/>
+          <w:p>
+            <w:pPr>
+              <w:pStyle w:val="Compact"/>
+              <w:jc w:val="right"/>
+            </w:pPr>
+            <w:r>
+              <w:t xml:space="preserve">(£10,821)</w:t>
             </w:r>
           </w:p>
         </w:tc>
@@ -15237,19 +15250,19 @@
               <w:jc w:val="right"/>
             </w:pPr>
             <w:r>
-              <w:t xml:space="preserve">(£543)</w:t>
-            </w:r>
-          </w:p>
-        </w:tc>
-        <w:tc>
-          <w:tcPr/>
-          <w:p>
-            <w:pPr>
-              <w:pStyle w:val="Compact"/>
-              <w:jc w:val="right"/>
-            </w:pPr>
-            <w:r>
-              <w:t xml:space="preserve">(£543)</w:t>
+              <w:t xml:space="preserve">(£657)</w:t>
+            </w:r>
+          </w:p>
+        </w:tc>
+        <w:tc>
+          <w:tcPr/>
+          <w:p>
+            <w:pPr>
+              <w:pStyle w:val="Compact"/>
+              <w:jc w:val="right"/>
+            </w:pPr>
+            <w:r>
+              <w:t xml:space="preserve">(£657)</w:t>
             </w:r>
           </w:p>
         </w:tc>
@@ -15299,39 +15312,39 @@
                 <w:bCs/>
                 <w:b/>
               </w:rPr>
-              <w:t xml:space="preserve">(£13,932)</w:t>
-            </w:r>
-          </w:p>
-        </w:tc>
-        <w:tc>
-          <w:tcPr/>
-          <w:p>
-            <w:pPr>
-              <w:pStyle w:val="Compact"/>
-              <w:jc w:val="right"/>
-            </w:pPr>
-            <w:r>
-              <w:rPr>
-                <w:bCs/>
-                <w:b/>
-              </w:rPr>
-              <w:t xml:space="preserve">(£55,604)</w:t>
-            </w:r>
-          </w:p>
-        </w:tc>
-        <w:tc>
-          <w:tcPr/>
-          <w:p>
-            <w:pPr>
-              <w:pStyle w:val="Compact"/>
-              <w:jc w:val="right"/>
-            </w:pPr>
-            <w:r>
-              <w:rPr>
-                <w:bCs/>
-                <w:b/>
-              </w:rPr>
-              <w:t xml:space="preserve">(£75,425)</w:t>
+              <w:t xml:space="preserve">(£13,332)</w:t>
+            </w:r>
+          </w:p>
+        </w:tc>
+        <w:tc>
+          <w:tcPr/>
+          <w:p>
+            <w:pPr>
+              <w:pStyle w:val="Compact"/>
+              <w:jc w:val="right"/>
+            </w:pPr>
+            <w:r>
+              <w:rPr>
+                <w:bCs/>
+                <w:b/>
+              </w:rPr>
+              <w:t xml:space="preserve">(£56,318)</w:t>
+            </w:r>
+          </w:p>
+        </w:tc>
+        <w:tc>
+          <w:tcPr/>
+          <w:p>
+            <w:pPr>
+              <w:pStyle w:val="Compact"/>
+              <w:jc w:val="right"/>
+            </w:pPr>
+            <w:r>
+              <w:rPr>
+                <w:bCs/>
+                <w:b/>
+              </w:rPr>
+              <w:t xml:space="preserve">(£75,539)</w:t>
             </w:r>
           </w:p>
         </w:tc>
@@ -15381,39 +15394,39 @@
                 <w:bCs/>
                 <w:b/>
               </w:rPr>
-              <w:t xml:space="preserve">£9,846</w:t>
-            </w:r>
-          </w:p>
-        </w:tc>
-        <w:tc>
-          <w:tcPr/>
-          <w:p>
-            <w:pPr>
-              <w:pStyle w:val="Compact"/>
-              <w:jc w:val="right"/>
-            </w:pPr>
-            <w:r>
-              <w:rPr>
-                <w:bCs/>
-                <w:b/>
-              </w:rPr>
-              <w:t xml:space="preserve">£4,704</w:t>
-            </w:r>
-          </w:p>
-        </w:tc>
-        <w:tc>
-          <w:tcPr/>
-          <w:p>
-            <w:pPr>
-              <w:pStyle w:val="Compact"/>
-              <w:jc w:val="right"/>
-            </w:pPr>
-            <w:r>
-              <w:rPr>
-                <w:bCs/>
-                <w:b/>
-              </w:rPr>
-              <w:t xml:space="preserve">£20,230</w:t>
+              <w:t xml:space="preserve">£10,446</w:t>
+            </w:r>
+          </w:p>
+        </w:tc>
+        <w:tc>
+          <w:tcPr/>
+          <w:p>
+            <w:pPr>
+              <w:pStyle w:val="Compact"/>
+              <w:jc w:val="right"/>
+            </w:pPr>
+            <w:r>
+              <w:rPr>
+                <w:bCs/>
+                <w:b/>
+              </w:rPr>
+              <w:t xml:space="preserve">£3,990</w:t>
+            </w:r>
+          </w:p>
+        </w:tc>
+        <w:tc>
+          <w:tcPr/>
+          <w:p>
+            <w:pPr>
+              <w:pStyle w:val="Compact"/>
+              <w:jc w:val="right"/>
+            </w:pPr>
+            <w:r>
+              <w:rPr>
+                <w:bCs/>
+                <w:b/>
+              </w:rPr>
+              <w:t xml:space="preserve">£20,116</w:t>
             </w:r>
           </w:p>
         </w:tc>
@@ -15463,39 +15476,39 @@
                 <w:bCs/>
                 <w:b/>
               </w:rPr>
-              <w:t xml:space="preserve">£18,526</w:t>
-            </w:r>
-          </w:p>
-        </w:tc>
-        <w:tc>
-          <w:tcPr/>
-          <w:p>
-            <w:pPr>
-              <w:pStyle w:val="Compact"/>
-              <w:jc w:val="right"/>
-            </w:pPr>
-            <w:r>
-              <w:rPr>
-                <w:bCs/>
-                <w:b/>
-              </w:rPr>
-              <w:t xml:space="preserve">£23,230</w:t>
-            </w:r>
-          </w:p>
-        </w:tc>
-        <w:tc>
-          <w:tcPr/>
-          <w:p>
-            <w:pPr>
-              <w:pStyle w:val="Compact"/>
-              <w:jc w:val="right"/>
-            </w:pPr>
-            <w:r>
-              <w:rPr>
-                <w:bCs/>
-                <w:b/>
-              </w:rPr>
-              <w:t xml:space="preserve">£23,230</w:t>
+              <w:t xml:space="preserve">£19,126</w:t>
+            </w:r>
+          </w:p>
+        </w:tc>
+        <w:tc>
+          <w:tcPr/>
+          <w:p>
+            <w:pPr>
+              <w:pStyle w:val="Compact"/>
+              <w:jc w:val="right"/>
+            </w:pPr>
+            <w:r>
+              <w:rPr>
+                <w:bCs/>
+                <w:b/>
+              </w:rPr>
+              <w:t xml:space="preserve">£23,116</w:t>
+            </w:r>
+          </w:p>
+        </w:tc>
+        <w:tc>
+          <w:tcPr/>
+          <w:p>
+            <w:pPr>
+              <w:pStyle w:val="Compact"/>
+              <w:jc w:val="right"/>
+            </w:pPr>
+            <w:r>
+              <w:rPr>
+                <w:bCs/>
+                <w:b/>
+              </w:rPr>
+              <w:t xml:space="preserve">£23,116</w:t>
             </w:r>
           </w:p>
         </w:tc>
@@ -18089,43 +18102,43 @@
               <w:jc w:val="right"/>
             </w:pPr>
             <w:r>
-              <w:t xml:space="preserve">£20,864</w:t>
-            </w:r>
-          </w:p>
-        </w:tc>
-        <w:tc>
-          <w:tcPr/>
-          <w:p>
-            <w:pPr>
-              <w:pStyle w:val="Compact"/>
-              <w:jc w:val="right"/>
-            </w:pPr>
-            <w:r>
-              <w:t xml:space="preserve">£20,192</w:t>
-            </w:r>
-          </w:p>
-        </w:tc>
-        <w:tc>
-          <w:tcPr/>
-          <w:p>
-            <w:pPr>
-              <w:pStyle w:val="Compact"/>
-              <w:jc w:val="right"/>
-            </w:pPr>
-            <w:r>
-              <w:t xml:space="preserve">£19,938</w:t>
-            </w:r>
-          </w:p>
-        </w:tc>
-        <w:tc>
-          <w:tcPr/>
-          <w:p>
-            <w:pPr>
-              <w:pStyle w:val="Compact"/>
-              <w:jc w:val="right"/>
-            </w:pPr>
-            <w:r>
-              <w:t xml:space="preserve">£19,678</w:t>
+              <w:t xml:space="preserve">£21,464</w:t>
+            </w:r>
+          </w:p>
+        </w:tc>
+        <w:tc>
+          <w:tcPr/>
+          <w:p>
+            <w:pPr>
+              <w:pStyle w:val="Compact"/>
+              <w:jc w:val="right"/>
+            </w:pPr>
+            <w:r>
+              <w:t xml:space="preserve">£20,792</w:t>
+            </w:r>
+          </w:p>
+        </w:tc>
+        <w:tc>
+          <w:tcPr/>
+          <w:p>
+            <w:pPr>
+              <w:pStyle w:val="Compact"/>
+              <w:jc w:val="right"/>
+            </w:pPr>
+            <w:r>
+              <w:t xml:space="preserve">£20,538</w:t>
+            </w:r>
+          </w:p>
+        </w:tc>
+        <w:tc>
+          <w:tcPr/>
+          <w:p>
+            <w:pPr>
+              <w:pStyle w:val="Compact"/>
+              <w:jc w:val="right"/>
+            </w:pPr>
+            <w:r>
+              <w:t xml:space="preserve">£20,278</w:t>
             </w:r>
           </w:p>
         </w:tc>
@@ -19149,7 +19162,7 @@
               <w:jc w:val="right"/>
             </w:pPr>
             <w:r>
-              <w:t xml:space="preserve">(£950)</w:t>
+              <w:t xml:space="preserve">(£350)</w:t>
             </w:r>
           </w:p>
         </w:tc>
@@ -19209,7 +19222,7 @@
               <w:jc w:val="right"/>
             </w:pPr>
             <w:r>
-              <w:t xml:space="preserve">(£6,861)</w:t>
+              <w:t xml:space="preserve">(£6,261)</w:t>
             </w:r>
           </w:p>
         </w:tc>
@@ -19695,7 +19708,7 @@
                 <w:bCs/>
                 <w:b/>
               </w:rPr>
-              <w:t xml:space="preserve">(£971)</w:t>
+              <w:t xml:space="preserve">(£371)</w:t>
             </w:r>
           </w:p>
         </w:tc>
@@ -19775,7 +19788,7 @@
                 <w:bCs/>
                 <w:b/>
               </w:rPr>
-              <w:t xml:space="preserve">£9,846</w:t>
+              <w:t xml:space="preserve">£10,446</w:t>
             </w:r>
           </w:p>
         </w:tc>
@@ -19921,71 +19934,71 @@
                 <w:bCs/>
                 <w:b/>
               </w:rPr>
-              <w:t xml:space="preserve">£20,864</w:t>
-            </w:r>
-          </w:p>
-        </w:tc>
-        <w:tc>
-          <w:tcPr/>
-          <w:p>
-            <w:pPr>
-              <w:pStyle w:val="Compact"/>
-              <w:jc w:val="right"/>
-            </w:pPr>
-            <w:r>
-              <w:rPr>
-                <w:bCs/>
-                <w:b/>
-              </w:rPr>
-              <w:t xml:space="preserve">£20,192</w:t>
-            </w:r>
-          </w:p>
-        </w:tc>
-        <w:tc>
-          <w:tcPr/>
-          <w:p>
-            <w:pPr>
-              <w:pStyle w:val="Compact"/>
-              <w:jc w:val="right"/>
-            </w:pPr>
-            <w:r>
-              <w:rPr>
-                <w:bCs/>
-                <w:b/>
-              </w:rPr>
-              <w:t xml:space="preserve">£19,938</w:t>
-            </w:r>
-          </w:p>
-        </w:tc>
-        <w:tc>
-          <w:tcPr/>
-          <w:p>
-            <w:pPr>
-              <w:pStyle w:val="Compact"/>
-              <w:jc w:val="right"/>
-            </w:pPr>
-            <w:r>
-              <w:rPr>
-                <w:bCs/>
-                <w:b/>
-              </w:rPr>
-              <w:t xml:space="preserve">£19,678</w:t>
-            </w:r>
-          </w:p>
-        </w:tc>
-        <w:tc>
-          <w:tcPr/>
-          <w:p>
-            <w:pPr>
-              <w:pStyle w:val="Compact"/>
-              <w:jc w:val="right"/>
-            </w:pPr>
-            <w:r>
-              <w:rPr>
-                <w:bCs/>
-                <w:b/>
-              </w:rPr>
-              <w:t xml:space="preserve">£18,526</w:t>
+              <w:t xml:space="preserve">£21,464</w:t>
+            </w:r>
+          </w:p>
+        </w:tc>
+        <w:tc>
+          <w:tcPr/>
+          <w:p>
+            <w:pPr>
+              <w:pStyle w:val="Compact"/>
+              <w:jc w:val="right"/>
+            </w:pPr>
+            <w:r>
+              <w:rPr>
+                <w:bCs/>
+                <w:b/>
+              </w:rPr>
+              <w:t xml:space="preserve">£20,792</w:t>
+            </w:r>
+          </w:p>
+        </w:tc>
+        <w:tc>
+          <w:tcPr/>
+          <w:p>
+            <w:pPr>
+              <w:pStyle w:val="Compact"/>
+              <w:jc w:val="right"/>
+            </w:pPr>
+            <w:r>
+              <w:rPr>
+                <w:bCs/>
+                <w:b/>
+              </w:rPr>
+              <w:t xml:space="preserve">£20,538</w:t>
+            </w:r>
+          </w:p>
+        </w:tc>
+        <w:tc>
+          <w:tcPr/>
+          <w:p>
+            <w:pPr>
+              <w:pStyle w:val="Compact"/>
+              <w:jc w:val="right"/>
+            </w:pPr>
+            <w:r>
+              <w:rPr>
+                <w:bCs/>
+                <w:b/>
+              </w:rPr>
+              <w:t xml:space="preserve">£20,278</w:t>
+            </w:r>
+          </w:p>
+        </w:tc>
+        <w:tc>
+          <w:tcPr/>
+          <w:p>
+            <w:pPr>
+              <w:pStyle w:val="Compact"/>
+              <w:jc w:val="right"/>
+            </w:pPr>
+            <w:r>
+              <w:rPr>
+                <w:bCs/>
+                <w:b/>
+              </w:rPr>
+              <w:t xml:space="preserve">£19,126</w:t>
             </w:r>
           </w:p>
         </w:tc>
@@ -20228,19 +20241,19 @@
               <w:jc w:val="right"/>
             </w:pPr>
             <w:r>
-              <w:t xml:space="preserve">£18,526</w:t>
-            </w:r>
-          </w:p>
-        </w:tc>
-        <w:tc>
-          <w:tcPr/>
-          <w:p>
-            <w:pPr>
-              <w:pStyle w:val="Compact"/>
-              <w:jc w:val="right"/>
-            </w:pPr>
-            <w:r>
-              <w:t xml:space="preserve">£33,432</w:t>
+              <w:t xml:space="preserve">£19,126</w:t>
+            </w:r>
+          </w:p>
+        </w:tc>
+        <w:tc>
+          <w:tcPr/>
+          <w:p>
+            <w:pPr>
+              <w:pStyle w:val="Compact"/>
+              <w:jc w:val="right"/>
+            </w:pPr>
+            <w:r>
+              <w:t xml:space="preserve">£34,032</w:t>
             </w:r>
           </w:p>
         </w:tc>
@@ -20300,31 +20313,31 @@
               <w:jc w:val="right"/>
             </w:pPr>
             <w:r>
-              <w:t xml:space="preserve">£32,112</w:t>
-            </w:r>
-          </w:p>
-        </w:tc>
-        <w:tc>
-          <w:tcPr/>
-          <w:p>
-            <w:pPr>
-              <w:pStyle w:val="Compact"/>
-              <w:jc w:val="right"/>
-            </w:pPr>
-            <w:r>
-              <w:t xml:space="preserve">£40,186</w:t>
-            </w:r>
-          </w:p>
-        </w:tc>
-        <w:tc>
-          <w:tcPr/>
-          <w:p>
-            <w:pPr>
-              <w:pStyle w:val="Compact"/>
-              <w:jc w:val="right"/>
-            </w:pPr>
-            <w:r>
-              <w:t xml:space="preserve">£36,978</w:t>
+              <w:t xml:space="preserve">£33,612</w:t>
+            </w:r>
+          </w:p>
+        </w:tc>
+        <w:tc>
+          <w:tcPr/>
+          <w:p>
+            <w:pPr>
+              <w:pStyle w:val="Compact"/>
+              <w:jc w:val="right"/>
+            </w:pPr>
+            <w:r>
+              <w:t xml:space="preserve">£41,686</w:t>
+            </w:r>
+          </w:p>
+        </w:tc>
+        <w:tc>
+          <w:tcPr/>
+          <w:p>
+            <w:pPr>
+              <w:pStyle w:val="Compact"/>
+              <w:jc w:val="right"/>
+            </w:pPr>
+            <w:r>
+              <w:t xml:space="preserve">£38,478</w:t>
             </w:r>
           </w:p>
         </w:tc>
@@ -20348,19 +20361,19 @@
               <w:jc w:val="right"/>
             </w:pPr>
             <w:r>
-              <w:t xml:space="preserve">£29,892</w:t>
-            </w:r>
-          </w:p>
-        </w:tc>
-        <w:tc>
-          <w:tcPr/>
-          <w:p>
-            <w:pPr>
-              <w:pStyle w:val="Compact"/>
-              <w:jc w:val="right"/>
-            </w:pPr>
-            <w:r>
-              <w:t xml:space="preserve">£26,880</w:t>
+              <w:t xml:space="preserve">£29,778</w:t>
+            </w:r>
+          </w:p>
+        </w:tc>
+        <w:tc>
+          <w:tcPr/>
+          <w:p>
+            <w:pPr>
+              <w:pStyle w:val="Compact"/>
+              <w:jc w:val="right"/>
+            </w:pPr>
+            <w:r>
+              <w:t xml:space="preserve">£26,766</w:t>
             </w:r>
           </w:p>
         </w:tc>
@@ -21312,6 +21325,18 @@
               <w:jc w:val="right"/>
             </w:pPr>
             <w:r>
+              <w:t xml:space="preserve">(£1,184)</w:t>
+            </w:r>
+          </w:p>
+        </w:tc>
+        <w:tc>
+          <w:tcPr/>
+          <w:p>
+            <w:pPr>
+              <w:pStyle w:val="Compact"/>
+              <w:jc w:val="right"/>
+            </w:pPr>
+            <w:r>
               <w:t xml:space="preserve">(£584)</w:t>
             </w:r>
           </w:p>
@@ -21324,6 +21349,18 @@
               <w:jc w:val="right"/>
             </w:pPr>
             <w:r>
+              <w:t xml:space="preserve">(£1,334)</w:t>
+            </w:r>
+          </w:p>
+        </w:tc>
+        <w:tc>
+          <w:tcPr/>
+          <w:p>
+            <w:pPr>
+              <w:pStyle w:val="Compact"/>
+              <w:jc w:val="right"/>
+            </w:pPr>
+            <w:r>
               <w:t xml:space="preserve">(£584)</w:t>
             </w:r>
           </w:p>
@@ -21336,7 +21373,7 @@
               <w:jc w:val="right"/>
             </w:pPr>
             <w:r>
-              <w:t xml:space="preserve">(£1,334)</w:t>
+              <w:t xml:space="preserve">(£984)</w:t>
             </w:r>
           </w:p>
         </w:tc>
@@ -21360,18 +21397,6 @@
               <w:jc w:val="right"/>
             </w:pPr>
             <w:r>
-              <w:t xml:space="preserve">(£2,484)</w:t>
-            </w:r>
-          </w:p>
-        </w:tc>
-        <w:tc>
-          <w:tcPr/>
-          <w:p>
-            <w:pPr>
-              <w:pStyle w:val="Compact"/>
-              <w:jc w:val="right"/>
-            </w:pPr>
-            <w:r>
               <w:t xml:space="preserve">(£584)</w:t>
             </w:r>
           </w:p>
@@ -21384,6 +21409,18 @@
               <w:jc w:val="right"/>
             </w:pPr>
             <w:r>
+              <w:t xml:space="preserve">(£2,468)</w:t>
+            </w:r>
+          </w:p>
+        </w:tc>
+        <w:tc>
+          <w:tcPr/>
+          <w:p>
+            <w:pPr>
+              <w:pStyle w:val="Compact"/>
+              <w:jc w:val="right"/>
+            </w:pPr>
+            <w:r>
               <w:t xml:space="preserve">(£584)</w:t>
             </w:r>
           </w:p>
@@ -21396,18 +21433,6 @@
               <w:jc w:val="right"/>
             </w:pPr>
             <w:r>
-              <w:t xml:space="preserve">(£968)</w:t>
-            </w:r>
-          </w:p>
-        </w:tc>
-        <w:tc>
-          <w:tcPr/>
-          <w:p>
-            <w:pPr>
-              <w:pStyle w:val="Compact"/>
-              <w:jc w:val="right"/>
-            </w:pPr>
-            <w:r>
               <w:t xml:space="preserve">(£584)</w:t>
             </w:r>
           </w:p>
@@ -21420,18 +21445,6 @@
               <w:jc w:val="right"/>
             </w:pPr>
             <w:r>
-              <w:t xml:space="preserve">(£584)</w:t>
-            </w:r>
-          </w:p>
-        </w:tc>
-        <w:tc>
-          <w:tcPr/>
-          <w:p>
-            <w:pPr>
-              <w:pStyle w:val="Compact"/>
-              <w:jc w:val="right"/>
-            </w:pPr>
-            <w:r>
               <w:t xml:space="preserve">(£634)</w:t>
             </w:r>
           </w:p>
@@ -21444,7 +21457,7 @@
               <w:jc w:val="right"/>
             </w:pPr>
             <w:r>
-              <w:t xml:space="preserve">(£10,221)</w:t>
+              <w:t xml:space="preserve">(£10,821)</w:t>
             </w:r>
           </w:p>
         </w:tc>
@@ -21748,7 +21761,7 @@
               <w:jc w:val="right"/>
             </w:pPr>
             <w:r>
-              <w:t xml:space="preserve">(£543)</w:t>
+              <w:t xml:space="preserve">(£657)</w:t>
             </w:r>
           </w:p>
         </w:tc>
@@ -21784,7 +21797,7 @@
               <w:jc w:val="right"/>
             </w:pPr>
             <w:r>
-              <w:t xml:space="preserve">(£543)</w:t>
+              <w:t xml:space="preserve">(£657)</w:t>
             </w:r>
           </w:p>
         </w:tc>
@@ -21834,7 +21847,7 @@
                 <w:bCs/>
                 <w:b/>
               </w:rPr>
-              <w:t xml:space="preserve">£14,995</w:t>
+              <w:t xml:space="preserve">£14,395</w:t>
             </w:r>
           </w:p>
         </w:tc>
@@ -21898,7 +21911,7 @@
                 <w:bCs/>
                 <w:b/>
               </w:rPr>
-              <w:t xml:space="preserve">(£5,337)</w:t>
+              <w:t xml:space="preserve">(£3,837)</w:t>
             </w:r>
           </w:p>
         </w:tc>
@@ -21946,23 +21959,23 @@
                 <w:bCs/>
                 <w:b/>
               </w:rPr>
-              <w:t xml:space="preserve">(£3,490)</w:t>
-            </w:r>
-          </w:p>
-        </w:tc>
-        <w:tc>
-          <w:tcPr/>
-          <w:p>
-            <w:pPr>
-              <w:pStyle w:val="Compact"/>
-              <w:jc w:val="right"/>
-            </w:pPr>
-            <w:r>
-              <w:rPr>
-                <w:bCs/>
-                <w:b/>
-              </w:rPr>
-              <w:t xml:space="preserve">(£3,596)</w:t>
+              <w:t xml:space="preserve">(£4,990)</w:t>
+            </w:r>
+          </w:p>
+        </w:tc>
+        <w:tc>
+          <w:tcPr/>
+          <w:p>
+            <w:pPr>
+              <w:pStyle w:val="Compact"/>
+              <w:jc w:val="right"/>
+            </w:pPr>
+            <w:r>
+              <w:rPr>
+                <w:bCs/>
+                <w:b/>
+              </w:rPr>
+              <w:t xml:space="preserve">(£3,710)</w:t>
             </w:r>
           </w:p>
         </w:tc>
@@ -22010,7 +22023,7 @@
                 <w:bCs/>
                 <w:b/>
               </w:rPr>
-              <w:t xml:space="preserve">£4,704</w:t>
+              <w:t xml:space="preserve">£3,990</w:t>
             </w:r>
           </w:p>
         </w:tc>
@@ -22044,7 +22057,7 @@
                 <w:bCs/>
                 <w:b/>
               </w:rPr>
-              <w:t xml:space="preserve">£33,432</w:t>
+              <w:t xml:space="preserve">£34,032</w:t>
             </w:r>
           </w:p>
         </w:tc>
@@ -22124,39 +22137,39 @@
                 <w:bCs/>
                 <w:b/>
               </w:rPr>
-              <w:t xml:space="preserve">£32,112</w:t>
-            </w:r>
-          </w:p>
-        </w:tc>
-        <w:tc>
-          <w:tcPr/>
-          <w:p>
-            <w:pPr>
-              <w:pStyle w:val="Compact"/>
-              <w:jc w:val="right"/>
-            </w:pPr>
-            <w:r>
-              <w:rPr>
-                <w:bCs/>
-                <w:b/>
-              </w:rPr>
-              <w:t xml:space="preserve">£40,186</w:t>
-            </w:r>
-          </w:p>
-        </w:tc>
-        <w:tc>
-          <w:tcPr/>
-          <w:p>
-            <w:pPr>
-              <w:pStyle w:val="Compact"/>
-              <w:jc w:val="right"/>
-            </w:pPr>
-            <w:r>
-              <w:rPr>
-                <w:bCs/>
-                <w:b/>
-              </w:rPr>
-              <w:t xml:space="preserve">£36,978</w:t>
+              <w:t xml:space="preserve">£33,612</w:t>
+            </w:r>
+          </w:p>
+        </w:tc>
+        <w:tc>
+          <w:tcPr/>
+          <w:p>
+            <w:pPr>
+              <w:pStyle w:val="Compact"/>
+              <w:jc w:val="right"/>
+            </w:pPr>
+            <w:r>
+              <w:rPr>
+                <w:bCs/>
+                <w:b/>
+              </w:rPr>
+              <w:t xml:space="preserve">£41,686</w:t>
+            </w:r>
+          </w:p>
+        </w:tc>
+        <w:tc>
+          <w:tcPr/>
+          <w:p>
+            <w:pPr>
+              <w:pStyle w:val="Compact"/>
+              <w:jc w:val="right"/>
+            </w:pPr>
+            <w:r>
+              <w:rPr>
+                <w:bCs/>
+                <w:b/>
+              </w:rPr>
+              <w:t xml:space="preserve">£38,478</w:t>
             </w:r>
           </w:p>
         </w:tc>
@@ -22188,39 +22201,39 @@
                 <w:bCs/>
                 <w:b/>
               </w:rPr>
-              <w:t xml:space="preserve">£29,892</w:t>
-            </w:r>
-          </w:p>
-        </w:tc>
-        <w:tc>
-          <w:tcPr/>
-          <w:p>
-            <w:pPr>
-              <w:pStyle w:val="Compact"/>
-              <w:jc w:val="right"/>
-            </w:pPr>
-            <w:r>
-              <w:rPr>
-                <w:bCs/>
-                <w:b/>
-              </w:rPr>
-              <w:t xml:space="preserve">£26,880</w:t>
-            </w:r>
-          </w:p>
-        </w:tc>
-        <w:tc>
-          <w:tcPr/>
-          <w:p>
-            <w:pPr>
-              <w:pStyle w:val="Compact"/>
-              <w:jc w:val="right"/>
-            </w:pPr>
-            <w:r>
-              <w:rPr>
-                <w:bCs/>
-                <w:b/>
-              </w:rPr>
-              <w:t xml:space="preserve">£23,230</w:t>
+              <w:t xml:space="preserve">£29,778</w:t>
+            </w:r>
+          </w:p>
+        </w:tc>
+        <w:tc>
+          <w:tcPr/>
+          <w:p>
+            <w:pPr>
+              <w:pStyle w:val="Compact"/>
+              <w:jc w:val="right"/>
+            </w:pPr>
+            <w:r>
+              <w:rPr>
+                <w:bCs/>
+                <w:b/>
+              </w:rPr>
+              <w:t xml:space="preserve">£26,766</w:t>
+            </w:r>
+          </w:p>
+        </w:tc>
+        <w:tc>
+          <w:tcPr/>
+          <w:p>
+            <w:pPr>
+              <w:pStyle w:val="Compact"/>
+              <w:jc w:val="right"/>
+            </w:pPr>
+            <w:r>
+              <w:rPr>
+                <w:bCs/>
+                <w:b/>
+              </w:rPr>
+              <w:t xml:space="preserve">£23,116</w:t>
             </w:r>
           </w:p>
         </w:tc>
@@ -23132,19 +23145,19 @@
               <w:jc w:val="right"/>
             </w:pPr>
             <w:r>
-              <w:t xml:space="preserve">(£1,500)</w:t>
-            </w:r>
-          </w:p>
-        </w:tc>
-        <w:tc>
-          <w:tcPr/>
-          <w:p>
-            <w:pPr>
-              <w:pStyle w:val="Compact"/>
-              <w:jc w:val="right"/>
-            </w:pPr>
-            <w:r>
-              <w:t xml:space="preserve">(£1,900)</w:t>
+              <w:t xml:space="preserve">(£900)</w:t>
+            </w:r>
+          </w:p>
+        </w:tc>
+        <w:tc>
+          <w:tcPr/>
+          <w:p>
+            <w:pPr>
+              <w:pStyle w:val="Compact"/>
+              <w:jc w:val="right"/>
+            </w:pPr>
+            <w:r>
+              <w:t xml:space="preserve">(£2,500)</w:t>
             </w:r>
           </w:p>
         </w:tc>
@@ -23454,23 +23467,23 @@
                 <w:bCs/>
                 <w:b/>
               </w:rPr>
-              <w:t xml:space="preserve">(£10,361)</w:t>
-            </w:r>
-          </w:p>
-        </w:tc>
-        <w:tc>
-          <w:tcPr/>
-          <w:p>
-            <w:pPr>
-              <w:pStyle w:val="Compact"/>
-              <w:jc w:val="right"/>
-            </w:pPr>
-            <w:r>
-              <w:rPr>
-                <w:bCs/>
-                <w:b/>
-              </w:rPr>
-              <w:t xml:space="preserve">(£48,056)</w:t>
+              <w:t xml:space="preserve">(£9,761)</w:t>
+            </w:r>
+          </w:p>
+        </w:tc>
+        <w:tc>
+          <w:tcPr/>
+          <w:p>
+            <w:pPr>
+              <w:pStyle w:val="Compact"/>
+              <w:jc w:val="right"/>
+            </w:pPr>
+            <w:r>
+              <w:rPr>
+                <w:bCs/>
+                <w:b/>
+              </w:rPr>
+              <w:t xml:space="preserve">(£48,656)</w:t>
             </w:r>
           </w:p>
         </w:tc>
@@ -23536,23 +23549,23 @@
                 <w:bCs/>
                 <w:b/>
               </w:rPr>
-              <w:t xml:space="preserve">£9,079</w:t>
-            </w:r>
-          </w:p>
-        </w:tc>
-        <w:tc>
-          <w:tcPr/>
-          <w:p>
-            <w:pPr>
-              <w:pStyle w:val="Compact"/>
-              <w:jc w:val="right"/>
-            </w:pPr>
-            <w:r>
-              <w:rPr>
-                <w:bCs/>
-                <w:b/>
-              </w:rPr>
-              <w:t xml:space="preserve">£447</w:t>
+              <w:t xml:space="preserve">£9,679</w:t>
+            </w:r>
+          </w:p>
+        </w:tc>
+        <w:tc>
+          <w:tcPr/>
+          <w:p>
+            <w:pPr>
+              <w:pStyle w:val="Compact"/>
+              <w:jc w:val="right"/>
+            </w:pPr>
+            <w:r>
+              <w:rPr>
+                <w:bCs/>
+                <w:b/>
+              </w:rPr>
+              <w:t xml:space="preserve">(£153)</w:t>
             </w:r>
           </w:p>
         </w:tc>
@@ -23680,23 +23693,23 @@
                 <w:bCs/>
                 <w:b/>
               </w:rPr>
-              <w:t xml:space="preserve">£8,654</w:t>
-            </w:r>
-          </w:p>
-        </w:tc>
-        <w:tc>
-          <w:tcPr/>
-          <w:p>
-            <w:pPr>
-              <w:pStyle w:val="Compact"/>
-              <w:jc w:val="right"/>
-            </w:pPr>
-            <w:r>
-              <w:rPr>
-                <w:bCs/>
-                <w:b/>
-              </w:rPr>
-              <w:t xml:space="preserve">(£420)</w:t>
+              <w:t xml:space="preserve">£9,254</w:t>
+            </w:r>
+          </w:p>
+        </w:tc>
+        <w:tc>
+          <w:tcPr/>
+          <w:p>
+            <w:pPr>
+              <w:pStyle w:val="Compact"/>
+              <w:jc w:val="right"/>
+            </w:pPr>
+            <w:r>
+              <w:rPr>
+                <w:bCs/>
+                <w:b/>
+              </w:rPr>
+              <w:t xml:space="preserve">(£1,020)</w:t>
             </w:r>
           </w:p>
         </w:tc>
@@ -23750,7 +23763,7 @@
               <w:jc w:val="right"/>
             </w:pPr>
             <w:r>
-              <w:t xml:space="preserve">(£543)</w:t>
+              <w:t xml:space="preserve">(£657)</w:t>
             </w:r>
           </w:p>
         </w:tc>
@@ -23774,7 +23787,7 @@
               <w:jc w:val="right"/>
             </w:pPr>
             <w:r>
-              <w:t xml:space="preserve">(£543)</w:t>
+              <w:t xml:space="preserve">(£657)</w:t>
             </w:r>
           </w:p>
         </w:tc>
@@ -23824,39 +23837,39 @@
                 <w:bCs/>
                 <w:b/>
               </w:rPr>
-              <w:t xml:space="preserve">£8,111</w:t>
-            </w:r>
-          </w:p>
-        </w:tc>
-        <w:tc>
-          <w:tcPr/>
-          <w:p>
-            <w:pPr>
-              <w:pStyle w:val="Compact"/>
-              <w:jc w:val="right"/>
-            </w:pPr>
-            <w:r>
-              <w:rPr>
-                <w:bCs/>
-                <w:b/>
-              </w:rPr>
-              <w:t xml:space="preserve">(£420)</w:t>
-            </w:r>
-          </w:p>
-        </w:tc>
-        <w:tc>
-          <w:tcPr/>
-          <w:p>
-            <w:pPr>
-              <w:pStyle w:val="Compact"/>
-              <w:jc w:val="right"/>
-            </w:pPr>
-            <w:r>
-              <w:rPr>
-                <w:bCs/>
-                <w:b/>
-              </w:rPr>
-              <w:t xml:space="preserve">£2,888</w:t>
+              <w:t xml:space="preserve">£8,597</w:t>
+            </w:r>
+          </w:p>
+        </w:tc>
+        <w:tc>
+          <w:tcPr/>
+          <w:p>
+            <w:pPr>
+              <w:pStyle w:val="Compact"/>
+              <w:jc w:val="right"/>
+            </w:pPr>
+            <w:r>
+              <w:rPr>
+                <w:bCs/>
+                <w:b/>
+              </w:rPr>
+              <w:t xml:space="preserve">(£1,020)</w:t>
+            </w:r>
+          </w:p>
+        </w:tc>
+        <w:tc>
+          <w:tcPr/>
+          <w:p>
+            <w:pPr>
+              <w:pStyle w:val="Compact"/>
+              <w:jc w:val="right"/>
+            </w:pPr>
+            <w:r>
+              <w:rPr>
+                <w:bCs/>
+                <w:b/>
+              </w:rPr>
+              <w:t xml:space="preserve">£2,774</w:t>
             </w:r>
           </w:p>
         </w:tc>
@@ -23894,19 +23907,19 @@
               <w:jc w:val="right"/>
             </w:pPr>
             <w:r>
-              <w:t xml:space="preserve">36.7%</w:t>
-            </w:r>
-          </w:p>
-        </w:tc>
-        <w:tc>
-          <w:tcPr/>
-          <w:p>
-            <w:pPr>
-              <w:pStyle w:val="Compact"/>
-              <w:jc w:val="right"/>
-            </w:pPr>
-            <w:r>
-              <w:t xml:space="preserve">-0.8%</w:t>
+              <w:t xml:space="preserve">38.9%</w:t>
+            </w:r>
+          </w:p>
+        </w:tc>
+        <w:tc>
+          <w:tcPr/>
+          <w:p>
+            <w:pPr>
+              <w:pStyle w:val="Compact"/>
+              <w:jc w:val="right"/>
+            </w:pPr>
+            <w:r>
+              <w:t xml:space="preserve">-1.9%</w:t>
             </w:r>
           </w:p>
         </w:tc>
@@ -24174,7 +24187,7 @@
               <w:jc w:val="right"/>
             </w:pPr>
             <w:r>
-              <w:t xml:space="preserve">£8,654</w:t>
+              <w:t xml:space="preserve">£9,254</w:t>
             </w:r>
           </w:p>
         </w:tc>
@@ -24210,7 +24223,7 @@
               <w:jc w:val="right"/>
             </w:pPr>
             <w:r>
-              <w:t xml:space="preserve">£8,179</w:t>
+              <w:t xml:space="preserve">£8,779</w:t>
             </w:r>
           </w:p>
         </w:tc>
@@ -24234,7 +24247,7 @@
               <w:jc w:val="right"/>
             </w:pPr>
             <w:r>
-              <w:t xml:space="preserve">£543</w:t>
+              <w:t xml:space="preserve">£657</w:t>
             </w:r>
           </w:p>
         </w:tc>
@@ -24272,7 +24285,7 @@
               <w:jc w:val="right"/>
             </w:pPr>
             <w:r>
-              <w:t xml:space="preserve">(£420)</w:t>
+              <w:t xml:space="preserve">(£1,020)</w:t>
             </w:r>
           </w:p>
         </w:tc>
@@ -24308,19 +24321,19 @@
               <w:jc w:val="right"/>
             </w:pPr>
             <w:r>
-              <w:t xml:space="preserve">(£753)</w:t>
-            </w:r>
-          </w:p>
-        </w:tc>
-        <w:tc>
-          <w:tcPr/>
-          <w:p>
-            <w:pPr>
-              <w:pStyle w:val="Compact"/>
-              <w:jc w:val="right"/>
-            </w:pPr>
-            <w:r>
-              <w:t xml:space="preserve">£753</w:t>
+              <w:t xml:space="preserve">(£1,353)</w:t>
+            </w:r>
+          </w:p>
+        </w:tc>
+        <w:tc>
+          <w:tcPr/>
+          <w:p>
+            <w:pPr>
+              <w:pStyle w:val="Compact"/>
+              <w:jc w:val="right"/>
+            </w:pPr>
+            <w:r>
+              <w:t xml:space="preserve">£1,353</w:t>
             </w:r>
           </w:p>
         </w:tc>
@@ -24373,7 +24386,7 @@
         <w:t xml:space="preserve"> </w:t>
       </w:r>
       <w:r>
-        <w:t xml:space="preserve">Year 1 is a deliberate investment year, with a loss of (£4,803) funded from the equity raised. Year 2 turns profitable (£8,111 after tax) on the first licence and a cost base still carried by an unpaid founder. In Year 3 the company starts paying the founder, makes its first two part-time hires and invests in a UK patent application, and still roughly breaks even, with an after-tax result of (£420). Profit is not the aim in the early years; showing that the company can pay for its own team from revenue is.</w:t>
+        <w:t xml:space="preserve">Year 1 is a deliberate investment year, with a loss of (£4,803) funded from the equity raised. Year 2 turns profitable (£8,597 after tax) on the first licence and a cost base still carried by an unpaid founder. In Year 3 the company starts paying the founder, makes its first two part-time hires and explores patent protection with its patent attorney, and still roughly breaks even, with an after-tax result of (£1,020). Profit is not the aim in the early years; showing that the company can pay for its own team from revenue is.</w:t>
       </w:r>
     </w:p>
     <w:p>
@@ -24758,19 +24771,19 @@
               <w:jc w:val="right"/>
             </w:pPr>
             <w:r>
-              <w:t xml:space="preserve">£18,526</w:t>
-            </w:r>
-          </w:p>
-        </w:tc>
-        <w:tc>
-          <w:tcPr/>
-          <w:p>
-            <w:pPr>
-              <w:pStyle w:val="Compact"/>
-              <w:jc w:val="right"/>
-            </w:pPr>
-            <w:r>
-              <w:t xml:space="preserve">£23,230</w:t>
+              <w:t xml:space="preserve">£19,126</w:t>
+            </w:r>
+          </w:p>
+        </w:tc>
+        <w:tc>
+          <w:tcPr/>
+          <w:p>
+            <w:pPr>
+              <w:pStyle w:val="Compact"/>
+              <w:jc w:val="right"/>
+            </w:pPr>
+            <w:r>
+              <w:t xml:space="preserve">£23,116</w:t>
             </w:r>
           </w:p>
         </w:tc>
@@ -24820,23 +24833,23 @@
                 <w:bCs/>
                 <w:b/>
               </w:rPr>
-              <w:t xml:space="preserve">£39,517</w:t>
-            </w:r>
-          </w:p>
-        </w:tc>
-        <w:tc>
-          <w:tcPr/>
-          <w:p>
-            <w:pPr>
-              <w:pStyle w:val="Compact"/>
-              <w:jc w:val="right"/>
-            </w:pPr>
-            <w:r>
-              <w:rPr>
-                <w:bCs/>
-                <w:b/>
-              </w:rPr>
-              <w:t xml:space="preserve">£44,555</w:t>
+              <w:t xml:space="preserve">£40,117</w:t>
+            </w:r>
+          </w:p>
+        </w:tc>
+        <w:tc>
+          <w:tcPr/>
+          <w:p>
+            <w:pPr>
+              <w:pStyle w:val="Compact"/>
+              <w:jc w:val="right"/>
+            </w:pPr>
+            <w:r>
+              <w:rPr>
+                <w:bCs/>
+                <w:b/>
+              </w:rPr>
+              <w:t xml:space="preserve">£44,441</w:t>
             </w:r>
           </w:p>
         </w:tc>
@@ -24924,7 +24937,7 @@
               <w:jc w:val="right"/>
             </w:pPr>
             <w:r>
-              <w:t xml:space="preserve">(£543)</w:t>
+              <w:t xml:space="preserve">(£657)</w:t>
             </w:r>
           </w:p>
         </w:tc>
@@ -24986,7 +24999,7 @@
                 <w:bCs/>
                 <w:b/>
               </w:rPr>
-              <w:t xml:space="preserve">(£22,210)</w:t>
+              <w:t xml:space="preserve">(£22,324)</w:t>
             </w:r>
           </w:p>
         </w:tc>
@@ -25052,23 +25065,23 @@
                 <w:bCs/>
                 <w:b/>
               </w:rPr>
-              <w:t xml:space="preserve">£17,308</w:t>
-            </w:r>
-          </w:p>
-        </w:tc>
-        <w:tc>
-          <w:tcPr/>
-          <w:p>
-            <w:pPr>
-              <w:pStyle w:val="Compact"/>
-              <w:jc w:val="right"/>
-            </w:pPr>
-            <w:r>
-              <w:rPr>
-                <w:bCs/>
-                <w:b/>
-              </w:rPr>
-              <w:t xml:space="preserve">£16,888</w:t>
+              <w:t xml:space="preserve">£17,794</w:t>
+            </w:r>
+          </w:p>
+        </w:tc>
+        <w:tc>
+          <w:tcPr/>
+          <w:p>
+            <w:pPr>
+              <w:pStyle w:val="Compact"/>
+              <w:jc w:val="right"/>
+            </w:pPr>
+            <w:r>
+              <w:rPr>
+                <w:bCs/>
+                <w:b/>
+              </w:rPr>
+              <w:t xml:space="preserve">£16,774</w:t>
             </w:r>
           </w:p>
         </w:tc>
@@ -25156,19 +25169,19 @@
               <w:jc w:val="right"/>
             </w:pPr>
             <w:r>
-              <w:t xml:space="preserve">£3,308</w:t>
-            </w:r>
-          </w:p>
-        </w:tc>
-        <w:tc>
-          <w:tcPr/>
-          <w:p>
-            <w:pPr>
-              <w:pStyle w:val="Compact"/>
-              <w:jc w:val="right"/>
-            </w:pPr>
-            <w:r>
-              <w:t xml:space="preserve">£2,888</w:t>
+              <w:t xml:space="preserve">£3,794</w:t>
+            </w:r>
+          </w:p>
+        </w:tc>
+        <w:tc>
+          <w:tcPr/>
+          <w:p>
+            <w:pPr>
+              <w:pStyle w:val="Compact"/>
+              <w:jc w:val="right"/>
+            </w:pPr>
+            <w:r>
+              <w:t xml:space="preserve">£2,774</w:t>
             </w:r>
           </w:p>
         </w:tc>
@@ -25218,23 +25231,23 @@
                 <w:bCs/>
                 <w:b/>
               </w:rPr>
-              <w:t xml:space="preserve">£17,308</w:t>
-            </w:r>
-          </w:p>
-        </w:tc>
-        <w:tc>
-          <w:tcPr/>
-          <w:p>
-            <w:pPr>
-              <w:pStyle w:val="Compact"/>
-              <w:jc w:val="right"/>
-            </w:pPr>
-            <w:r>
-              <w:rPr>
-                <w:bCs/>
-                <w:b/>
-              </w:rPr>
-              <w:t xml:space="preserve">£16,888</w:t>
+              <w:t xml:space="preserve">£17,794</w:t>
+            </w:r>
+          </w:p>
+        </w:tc>
+        <w:tc>
+          <w:tcPr/>
+          <w:p>
+            <w:pPr>
+              <w:pStyle w:val="Compact"/>
+              <w:jc w:val="right"/>
+            </w:pPr>
+            <w:r>
+              <w:rPr>
+                <w:bCs/>
+                <w:b/>
+              </w:rPr>
+              <w:t xml:space="preserve">£16,774</w:t>
             </w:r>
           </w:p>
         </w:tc>
@@ -31269,19 +31282,19 @@
               <w:jc w:val="right"/>
             </w:pPr>
             <w:r>
-              <w:t xml:space="preserve">(£1,500)</w:t>
-            </w:r>
-          </w:p>
-        </w:tc>
-        <w:tc>
-          <w:tcPr/>
-          <w:p>
-            <w:pPr>
-              <w:pStyle w:val="Compact"/>
-              <w:jc w:val="right"/>
-            </w:pPr>
-            <w:r>
-              <w:t xml:space="preserve">(£1,900)</w:t>
+              <w:t xml:space="preserve">(£900)</w:t>
+            </w:r>
+          </w:p>
+        </w:tc>
+        <w:tc>
+          <w:tcPr/>
+          <w:p>
+            <w:pPr>
+              <w:pStyle w:val="Compact"/>
+              <w:jc w:val="right"/>
+            </w:pPr>
+            <w:r>
+              <w:t xml:space="preserve">(£2,500)</w:t>
             </w:r>
           </w:p>
         </w:tc>
@@ -31591,23 +31604,23 @@
                 <w:bCs/>
                 <w:b/>
               </w:rPr>
-              <w:t xml:space="preserve">(£12,111)</w:t>
-            </w:r>
-          </w:p>
-        </w:tc>
-        <w:tc>
-          <w:tcPr/>
-          <w:p>
-            <w:pPr>
-              <w:pStyle w:val="Compact"/>
-              <w:jc w:val="right"/>
-            </w:pPr>
-            <w:r>
-              <w:rPr>
-                <w:bCs/>
-                <w:b/>
-              </w:rPr>
-              <w:t xml:space="preserve">(£170,419)</w:t>
+              <w:t xml:space="preserve">(£11,511)</w:t>
+            </w:r>
+          </w:p>
+        </w:tc>
+        <w:tc>
+          <w:tcPr/>
+          <w:p>
+            <w:pPr>
+              <w:pStyle w:val="Compact"/>
+              <w:jc w:val="right"/>
+            </w:pPr>
+            <w:r>
+              <w:rPr>
+                <w:bCs/>
+                <w:b/>
+              </w:rPr>
+              <w:t xml:space="preserve">(£171,019)</w:t>
             </w:r>
           </w:p>
         </w:tc>
@@ -31673,23 +31686,23 @@
                 <w:bCs/>
                 <w:b/>
               </w:rPr>
-              <w:t xml:space="preserve">£20,599</w:t>
-            </w:r>
-          </w:p>
-        </w:tc>
-        <w:tc>
-          <w:tcPr/>
-          <w:p>
-            <w:pPr>
-              <w:pStyle w:val="Compact"/>
-              <w:jc w:val="right"/>
-            </w:pPr>
-            <w:r>
-              <w:rPr>
-                <w:bCs/>
-                <w:b/>
-              </w:rPr>
-              <w:t xml:space="preserve">(£34,000)</w:t>
+              <w:t xml:space="preserve">£21,199</w:t>
+            </w:r>
+          </w:p>
+        </w:tc>
+        <w:tc>
+          <w:tcPr/>
+          <w:p>
+            <w:pPr>
+              <w:pStyle w:val="Compact"/>
+              <w:jc w:val="right"/>
+            </w:pPr>
+            <w:r>
+              <w:rPr>
+                <w:bCs/>
+                <w:b/>
+              </w:rPr>
+              <w:t xml:space="preserve">(£34,600)</w:t>
             </w:r>
           </w:p>
         </w:tc>
@@ -31817,23 +31830,23 @@
                 <w:bCs/>
                 <w:b/>
               </w:rPr>
-              <w:t xml:space="preserve">£20,174</w:t>
-            </w:r>
-          </w:p>
-        </w:tc>
-        <w:tc>
-          <w:tcPr/>
-          <w:p>
-            <w:pPr>
-              <w:pStyle w:val="Compact"/>
-              <w:jc w:val="right"/>
-            </w:pPr>
-            <w:r>
-              <w:rPr>
-                <w:bCs/>
-                <w:b/>
-              </w:rPr>
-              <w:t xml:space="preserve">(£35,726)</w:t>
+              <w:t xml:space="preserve">£20,774</w:t>
+            </w:r>
+          </w:p>
+        </w:tc>
+        <w:tc>
+          <w:tcPr/>
+          <w:p>
+            <w:pPr>
+              <w:pStyle w:val="Compact"/>
+              <w:jc w:val="right"/>
+            </w:pPr>
+            <w:r>
+              <w:rPr>
+                <w:bCs/>
+                <w:b/>
+              </w:rPr>
+              <w:t xml:space="preserve">(£36,326)</w:t>
             </w:r>
           </w:p>
         </w:tc>
@@ -31887,7 +31900,7 @@
               <w:jc w:val="right"/>
             </w:pPr>
             <w:r>
-              <w:t xml:space="preserve">(£2,732)</w:t>
+              <w:t xml:space="preserve">(£2,846)</w:t>
             </w:r>
           </w:p>
         </w:tc>
@@ -31911,7 +31924,7 @@
               <w:jc w:val="right"/>
             </w:pPr>
             <w:r>
-              <w:t xml:space="preserve">(£2,732)</w:t>
+              <w:t xml:space="preserve">(£2,846)</w:t>
             </w:r>
           </w:p>
         </w:tc>
@@ -31961,39 +31974,39 @@
                 <w:bCs/>
                 <w:b/>
               </w:rPr>
-              <w:t xml:space="preserve">£17,442</w:t>
-            </w:r>
-          </w:p>
-        </w:tc>
-        <w:tc>
-          <w:tcPr/>
-          <w:p>
-            <w:pPr>
-              <w:pStyle w:val="Compact"/>
-              <w:jc w:val="right"/>
-            </w:pPr>
-            <w:r>
-              <w:rPr>
-                <w:bCs/>
-                <w:b/>
-              </w:rPr>
-              <w:t xml:space="preserve">(£35,726)</w:t>
-            </w:r>
-          </w:p>
-        </w:tc>
-        <w:tc>
-          <w:tcPr/>
-          <w:p>
-            <w:pPr>
-              <w:pStyle w:val="Compact"/>
-              <w:jc w:val="right"/>
-            </w:pPr>
-            <w:r>
-              <w:rPr>
-                <w:bCs/>
-                <w:b/>
-              </w:rPr>
-              <w:t xml:space="preserve">(£23,087)</w:t>
+              <w:t xml:space="preserve">£17,928</w:t>
+            </w:r>
+          </w:p>
+        </w:tc>
+        <w:tc>
+          <w:tcPr/>
+          <w:p>
+            <w:pPr>
+              <w:pStyle w:val="Compact"/>
+              <w:jc w:val="right"/>
+            </w:pPr>
+            <w:r>
+              <w:rPr>
+                <w:bCs/>
+                <w:b/>
+              </w:rPr>
+              <w:t xml:space="preserve">(£36,326)</w:t>
+            </w:r>
+          </w:p>
+        </w:tc>
+        <w:tc>
+          <w:tcPr/>
+          <w:p>
+            <w:pPr>
+              <w:pStyle w:val="Compact"/>
+              <w:jc w:val="right"/>
+            </w:pPr>
+            <w:r>
+              <w:rPr>
+                <w:bCs/>
+                <w:b/>
+              </w:rPr>
+              <w:t xml:space="preserve">(£23,201)</w:t>
             </w:r>
           </w:p>
         </w:tc>
@@ -32031,19 +32044,19 @@
               <w:jc w:val="right"/>
             </w:pPr>
             <w:r>
-              <w:t xml:space="preserve">47.4%</w:t>
-            </w:r>
-          </w:p>
-        </w:tc>
-        <w:tc>
-          <w:tcPr/>
-          <w:p>
-            <w:pPr>
-              <w:pStyle w:val="Compact"/>
-              <w:jc w:val="right"/>
-            </w:pPr>
-            <w:r>
-              <w:t xml:space="preserve">-23.9%</w:t>
+              <w:t xml:space="preserve">48.8%</w:t>
+            </w:r>
+          </w:p>
+        </w:tc>
+        <w:tc>
+          <w:tcPr/>
+          <w:p>
+            <w:pPr>
+              <w:pStyle w:val="Compact"/>
+              <w:jc w:val="right"/>
+            </w:pPr>
+            <w:r>
+              <w:t xml:space="preserve">-24.3%</w:t>
             </w:r>
           </w:p>
         </w:tc>
@@ -32187,7 +32200,7 @@
               <w:jc w:val="right"/>
             </w:pPr>
             <w:r>
-              <w:t xml:space="preserve">£36,712</w:t>
+              <w:t xml:space="preserve">£37,312</w:t>
             </w:r>
           </w:p>
         </w:tc>
@@ -32691,19 +32704,19 @@
               <w:jc w:val="right"/>
             </w:pPr>
             <w:r>
-              <w:t xml:space="preserve">(£6,861)</w:t>
-            </w:r>
-          </w:p>
-        </w:tc>
-        <w:tc>
-          <w:tcPr/>
-          <w:p>
-            <w:pPr>
-              <w:pStyle w:val="Compact"/>
-              <w:jc w:val="right"/>
-            </w:pPr>
-            <w:r>
-              <w:t xml:space="preserve">(£15,501)</w:t>
+              <w:t xml:space="preserve">(£6,261)</w:t>
+            </w:r>
+          </w:p>
+        </w:tc>
+        <w:tc>
+          <w:tcPr/>
+          <w:p>
+            <w:pPr>
+              <w:pStyle w:val="Compact"/>
+              <w:jc w:val="right"/>
+            </w:pPr>
+            <w:r>
+              <w:t xml:space="preserve">(£16,101)</w:t>
             </w:r>
           </w:p>
         </w:tc>
@@ -32827,19 +32840,19 @@
               <w:jc w:val="right"/>
             </w:pPr>
             <w:r>
-              <w:t xml:space="preserve">(£2,732)</w:t>
-            </w:r>
-          </w:p>
-        </w:tc>
-        <w:tc>
-          <w:tcPr/>
-          <w:p>
-            <w:pPr>
-              <w:pStyle w:val="Compact"/>
-              <w:jc w:val="right"/>
-            </w:pPr>
-            <w:r>
-              <w:t xml:space="preserve">(£2,732)</w:t>
+              <w:t xml:space="preserve">(£2,846)</w:t>
+            </w:r>
+          </w:p>
+        </w:tc>
+        <w:tc>
+          <w:tcPr/>
+          <w:p>
+            <w:pPr>
+              <w:pStyle w:val="Compact"/>
+              <w:jc w:val="right"/>
+            </w:pPr>
+            <w:r>
+              <w:t xml:space="preserve">(£2,846)</w:t>
             </w:r>
           </w:p>
         </w:tc>
@@ -32889,39 +32902,39 @@
                 <w:bCs/>
                 <w:b/>
               </w:rPr>
-              <w:t xml:space="preserve">(£17,064)</w:t>
-            </w:r>
-          </w:p>
-        </w:tc>
-        <w:tc>
-          <w:tcPr/>
-          <w:p>
-            <w:pPr>
-              <w:pStyle w:val="Compact"/>
-              <w:jc w:val="right"/>
-            </w:pPr>
-            <w:r>
-              <w:rPr>
-                <w:bCs/>
-                <w:b/>
-              </w:rPr>
-              <w:t xml:space="preserve">(£189,783)</w:t>
-            </w:r>
-          </w:p>
-        </w:tc>
-        <w:tc>
-          <w:tcPr/>
-          <w:p>
-            <w:pPr>
-              <w:pStyle w:val="Compact"/>
-              <w:jc w:val="right"/>
-            </w:pPr>
-            <w:r>
-              <w:rPr>
-                <w:bCs/>
-                <w:b/>
-              </w:rPr>
-              <w:t xml:space="preserve">(£212,736)</w:t>
+              <w:t xml:space="preserve">(£16,464)</w:t>
+            </w:r>
+          </w:p>
+        </w:tc>
+        <w:tc>
+          <w:tcPr/>
+          <w:p>
+            <w:pPr>
+              <w:pStyle w:val="Compact"/>
+              <w:jc w:val="right"/>
+            </w:pPr>
+            <w:r>
+              <w:rPr>
+                <w:bCs/>
+                <w:b/>
+              </w:rPr>
+              <w:t xml:space="preserve">(£190,497)</w:t>
+            </w:r>
+          </w:p>
+        </w:tc>
+        <w:tc>
+          <w:tcPr/>
+          <w:p>
+            <w:pPr>
+              <w:pStyle w:val="Compact"/>
+              <w:jc w:val="right"/>
+            </w:pPr>
+            <w:r>
+              <w:rPr>
+                <w:bCs/>
+                <w:b/>
+              </w:rPr>
+              <w:t xml:space="preserve">(£212,850)</w:t>
             </w:r>
           </w:p>
         </w:tc>
@@ -32971,39 +32984,39 @@
                 <w:bCs/>
                 <w:b/>
               </w:rPr>
-              <w:t xml:space="preserve">£28,033</w:t>
-            </w:r>
-          </w:p>
-        </w:tc>
-        <w:tc>
-          <w:tcPr/>
-          <w:p>
-            <w:pPr>
-              <w:pStyle w:val="Compact"/>
-              <w:jc w:val="right"/>
-            </w:pPr>
-            <w:r>
-              <w:rPr>
-                <w:bCs/>
-                <w:b/>
-              </w:rPr>
-              <w:t xml:space="preserve">(£15,648)</w:t>
-            </w:r>
-          </w:p>
-        </w:tc>
-        <w:tc>
-          <w:tcPr/>
-          <w:p>
-            <w:pPr>
-              <w:pStyle w:val="Compact"/>
-              <w:jc w:val="right"/>
-            </w:pPr>
-            <w:r>
-              <w:rPr>
-                <w:bCs/>
-                <w:b/>
-              </w:rPr>
-              <w:t xml:space="preserve">£18,064</w:t>
+              <w:t xml:space="preserve">£28,633</w:t>
+            </w:r>
+          </w:p>
+        </w:tc>
+        <w:tc>
+          <w:tcPr/>
+          <w:p>
+            <w:pPr>
+              <w:pStyle w:val="Compact"/>
+              <w:jc w:val="right"/>
+            </w:pPr>
+            <w:r>
+              <w:rPr>
+                <w:bCs/>
+                <w:b/>
+              </w:rPr>
+              <w:t xml:space="preserve">(£16,362)</w:t>
+            </w:r>
+          </w:p>
+        </w:tc>
+        <w:tc>
+          <w:tcPr/>
+          <w:p>
+            <w:pPr>
+              <w:pStyle w:val="Compact"/>
+              <w:jc w:val="right"/>
+            </w:pPr>
+            <w:r>
+              <w:rPr>
+                <w:bCs/>
+                <w:b/>
+              </w:rPr>
+              <w:t xml:space="preserve">£17,950</w:t>
             </w:r>
           </w:p>
         </w:tc>
@@ -33053,39 +33066,39 @@
                 <w:bCs/>
                 <w:b/>
               </w:rPr>
-              <w:t xml:space="preserve">£36,712</w:t>
-            </w:r>
-          </w:p>
-        </w:tc>
-        <w:tc>
-          <w:tcPr/>
-          <w:p>
-            <w:pPr>
-              <w:pStyle w:val="Compact"/>
-              <w:jc w:val="right"/>
-            </w:pPr>
-            <w:r>
-              <w:rPr>
-                <w:bCs/>
-                <w:b/>
-              </w:rPr>
-              <w:t xml:space="preserve">£21,064</w:t>
-            </w:r>
-          </w:p>
-        </w:tc>
-        <w:tc>
-          <w:tcPr/>
-          <w:p>
-            <w:pPr>
-              <w:pStyle w:val="Compact"/>
-              <w:jc w:val="right"/>
-            </w:pPr>
-            <w:r>
-              <w:rPr>
-                <w:bCs/>
-                <w:b/>
-              </w:rPr>
-              <w:t xml:space="preserve">£21,064</w:t>
+              <w:t xml:space="preserve">£37,312</w:t>
+            </w:r>
+          </w:p>
+        </w:tc>
+        <w:tc>
+          <w:tcPr/>
+          <w:p>
+            <w:pPr>
+              <w:pStyle w:val="Compact"/>
+              <w:jc w:val="right"/>
+            </w:pPr>
+            <w:r>
+              <w:rPr>
+                <w:bCs/>
+                <w:b/>
+              </w:rPr>
+              <w:t xml:space="preserve">£20,950</w:t>
+            </w:r>
+          </w:p>
+        </w:tc>
+        <w:tc>
+          <w:tcPr/>
+          <w:p>
+            <w:pPr>
+              <w:pStyle w:val="Compact"/>
+              <w:jc w:val="right"/>
+            </w:pPr>
+            <w:r>
+              <w:rPr>
+                <w:bCs/>
+                <w:b/>
+              </w:rPr>
+              <w:t xml:space="preserve">£20,950</w:t>
             </w:r>
           </w:p>
         </w:tc>

</xml_diff>

<commit_message>
Business plan v6: add CIPA IP Clinic patent consultation details and costs
Co-Authored-By: Claude Opus 5.5 <noreply@anthropic.com>
Claude-Session: https://claude.ai/code/session_0146q3FtAYmgQ1rtNsNNpdiD
</commit_message>
<xml_diff>
--- a/visa_appendices/docx/DEQUAD_UKES_Business_Plan_v6.docx
+++ b/visa_appendices/docx/DEQUAD_UKES_Business_Plan_v6.docx
@@ -1332,7 +1332,7 @@
               <w:jc w:val="right"/>
             </w:pPr>
             <w:r>
-              <w:t xml:space="preserve">(£1,020)</w:t>
+              <w:t xml:space="preserve">(£2,270)</w:t>
             </w:r>
           </w:p>
         </w:tc>
@@ -1382,7 +1382,7 @@
               <w:jc w:val="right"/>
             </w:pPr>
             <w:r>
-              <w:t xml:space="preserve">£23,116</w:t>
+              <w:t xml:space="preserve">£21,866</w:t>
             </w:r>
           </w:p>
         </w:tc>
@@ -1622,7 +1622,7 @@
         <w:t xml:space="preserve">four full-time UK jobs (a £30,000 Software Engineer and three roles at £25,000) plus a part-time safeguarding role</w:t>
       </w:r>
       <w:r>
-        <w:t xml:space="preserve">, pays the founder, and still ends Year 3 with £20,950 in the bank.</w:t>
+        <w:t xml:space="preserve">, pays the founder, and still ends Year 3 with £19,700 in the bank.</w:t>
       </w:r>
     </w:p>
     <w:p>
@@ -3369,7 +3369,7 @@
               <w:jc w:val="left"/>
             </w:pPr>
             <w:r>
-              <w:t xml:space="preserve">No patent has been filed yet. The founder has</w:t>
+              <w:t xml:space="preserve">No patent has been filed yet. On</w:t>
             </w:r>
             <w:r>
               <w:t xml:space="preserve"> </w:t>
@@ -3379,22 +3379,54 @@
                 <w:bCs/>
                 <w:b/>
               </w:rPr>
-              <w:t xml:space="preserve">already consulted a UK patent attorney</w:t>
+              <w:t xml:space="preserve">8 April 2026</w:t>
             </w:r>
             <w:r>
               <w:t xml:space="preserve"> </w:t>
             </w:r>
             <w:r>
-              <w:t xml:space="preserve">about the most technical candidate: the method of combining verified-identity, mood-trajectory and engagement signals to produce graded, routed safeguarding alerts with per-institution data scoping. Software</w:t>
+              <w:t xml:space="preserve">the founder had an initial consultation through the</w:t>
             </w:r>
             <w:r>
               <w:t xml:space="preserve"> </w:t>
             </w:r>
             <w:r>
+              <w:rPr>
+                <w:bCs/>
+                <w:b/>
+              </w:rPr>
+              <w:t xml:space="preserve">CIPA IP Clinic</w:t>
+            </w:r>
+            <w:r>
+              <w:t xml:space="preserve"> </w:t>
+            </w:r>
+            <w:r>
+              <w:t xml:space="preserve">(Chartered Institute of Patent Attorneys) with</w:t>
+            </w:r>
+            <w:r>
+              <w:t xml:space="preserve"> </w:t>
+            </w:r>
+            <w:r>
+              <w:rPr>
+                <w:bCs/>
+                <w:b/>
+              </w:rPr>
+              <w:t xml:space="preserve">Shamil Rasheed, European Patent Attorney at Panoramix IP</w:t>
+            </w:r>
+            <w:r>
+              <w:t xml:space="preserve"> </w:t>
+            </w:r>
+            <w:r>
+              <w:t xml:space="preserve">(regulated by IPReg). The attorney’s written view is that software inventions face</w:t>
+            </w:r>
+            <w:r>
+              <w:t xml:space="preserve"> </w:t>
+            </w:r>
+            <w:r>
               <w:t xml:space="preserve">“</w:t>
             </w:r>
             <w:r>
-              <w:t xml:space="preserve">as such</w:t>
+              <w:t xml:space="preserve">excluded subject matter</w:t>
             </w:r>
             <w:r>
               <w:t xml:space="preserve">”</w:t>
@@ -3403,7 +3435,36 @@
               <w:t xml:space="preserve"> </w:t>
             </w:r>
             <w:r>
-              <w:t xml:space="preserve">is excluded from UK patent protection, so DEQUAD will only file if the attorney confirms a technical contribution</w:t>
+              <w:t xml:space="preserve">limits in the UK and Europe, but that</w:t>
+            </w:r>
+            <w:r>
+              <w:t xml:space="preserve"> </w:t>
+            </w:r>
+            <w:r>
+              <w:rPr>
+                <w:bCs/>
+                <w:b/>
+              </w:rPr>
+              <w:t xml:space="preserve">aspects of DEQUAD may be patentable</w:t>
+            </w:r>
+            <w:r>
+              <w:t xml:space="preserve"> </w:t>
+            </w:r>
+            <w:r>
+              <w:t xml:space="preserve">where they produce a technical effect beyond a computer program. The candidate is the threshold-based safeguarding mechanism: when a student’s wellbeing metrics cross a defined threshold, or a student signals crisis, the system automatically generates a safeguarding page with support contacts and alerts the university. The attorney describes it as</w:t>
+            </w:r>
+            <w:r>
+              <w:t xml:space="preserve"> </w:t>
+            </w:r>
+            <w:r>
+              <w:rPr>
+                <w:bCs/>
+                <w:b/>
+              </w:rPr>
+              <w:t xml:space="preserve">a borderline case</w:t>
+            </w:r>
+            <w:r>
+              <w:t xml:space="preserve">.</w:t>
             </w:r>
           </w:p>
         </w:tc>
@@ -3422,12 +3483,31 @@
               <w:t xml:space="preserve">Patent exploration in Year 3</w:t>
             </w:r>
             <w:r>
-              <w:t xml:space="preserve">, with the same attorney: a formal prior-art search and patentability opinion, followed by a</w:t>
-            </w:r>
-            <w:r>
               <w:t xml:space="preserve"> </w:t>
             </w:r>
             <w:r>
+              <w:t xml:space="preserve">with the same attorney. DEQUAD will complete the</w:t>
+            </w:r>
+            <w:r>
+              <w:t xml:space="preserve"> </w:t>
+            </w:r>
+            <w:r>
+              <w:rPr>
+                <w:bCs/>
+                <w:b/>
+              </w:rPr>
+              <w:t xml:space="preserve">invention disclosure form</w:t>
+            </w:r>
+            <w:r>
+              <w:t xml:space="preserve"> </w:t>
+            </w:r>
+            <w:r>
+              <w:t xml:space="preserve">(process workflows, system and architecture diagrams, alert-threshold logic). The attorney will then make a detailed patentability assessment and a surface-level prior-art search, both free as part of the consultation. If the assessment is positive, DEQUAD will instruct drafting and file a</w:t>
+            </w:r>
+            <w:r>
+              <w:t xml:space="preserve"> </w:t>
+            </w:r>
+            <w:r>
               <w:rPr>
                 <w:bCs/>
                 <w:b/>
@@ -3435,22 +3515,35 @@
               <w:t xml:space="preserve">UK priority application</w:t>
             </w:r>
             <w:r>
+              <w:t xml:space="preserve">. Year 3 timing means the application can draw on two years of real alert data and the personal-baseline model (Section 4.2)</w:t>
+            </w:r>
+          </w:p>
+        </w:tc>
+        <w:tc>
+          <w:tcPr/>
+          <w:p>
+            <w:pPr>
+              <w:pStyle w:val="Compact"/>
+              <w:jc w:val="left"/>
+            </w:pPr>
+            <w:r>
+              <w:t xml:space="preserve">Assessment and search Oct 2028 (no cost). If positive: drafting and filing May 2029,</w:t>
+            </w:r>
+            <w:r>
               <w:t xml:space="preserve"> </w:t>
             </w:r>
             <w:r>
-              <w:t xml:space="preserve">at the UK IPO if the opinion is positive. Year 3 timing means the claims can draw on two years of real alert data and the personal-baseline model (Section 4.2)</w:t>
-            </w:r>
-          </w:p>
-        </w:tc>
-        <w:tc>
-          <w:tcPr/>
-          <w:p>
-            <w:pPr>
-              <w:pStyle w:val="Compact"/>
-              <w:jc w:val="left"/>
-            </w:pPr>
-            <w:r>
-              <w:t xml:space="preserve">Opinion Oct 2028 (£600); UK filing May 2029 (£1,500) if positive; both in the Year 3 forecast (Section 13, legal &amp; IP line)</w:t>
+              <w:rPr>
+                <w:bCs/>
+                <w:b/>
+              </w:rPr>
+              <w:t xml:space="preserve">£3,350</w:t>
+            </w:r>
+            <w:r>
+              <w:t xml:space="preserve"> </w:t>
+            </w:r>
+            <w:r>
+              <w:t xml:space="preserve">(drafting £3,000, at the low end of the attorney’s £3,000–£5,000 estimate because a complete disclosure is supplied, plus £350 filing), included in the Year 3 forecast. Prosecution to grant (2–3 rounds at £1,000–£1,500 each; £8,000–£10,000 in total to grant) would fall after Year 3 and be funded from licence revenue</w:t>
             </w:r>
           </w:p>
         </w:tc>
@@ -9632,7 +9725,7 @@
               <w:jc w:val="left"/>
             </w:pPr>
             <w:r>
-              <w:t xml:space="preserve">No patent filed yet (patent attorney consulted; exploration planned for Year 3) and no exclusivity agreed yet (Section 3.4)</w:t>
+              <w:t xml:space="preserve">No patent filed yet: a patent attorney has assessed the invention as borderline-patentable, with exploration planned for Year 3. No exclusivity agreed yet (Section 3.4)</w:t>
             </w:r>
           </w:p>
         </w:tc>
@@ -10043,7 +10136,7 @@
               <w:jc w:val="left"/>
             </w:pPr>
             <w:r>
-              <w:t xml:space="preserve">Barriers in Section 3.4: server-side trade secrets and IP-assignment deeds, a growing proprietary verified dataset, preferred-supplier terms sought in the LOI and licences, patent exploration with an attorney already consulted (Year 3), and a UK trademark; plus positioning DEQUAD as complementary to clinical incumbents</w:t>
+              <w:t xml:space="preserve">Barriers in Section 3.4: server-side trade secrets and IP-assignment deeds, a growing proprietary verified dataset, preferred-supplier terms sought in the LOI and licences, patent exploration in Year 3 with Panoramix IP (consulted via the CIPA IP Clinic, Apr 2026), and a UK trademark; plus positioning DEQUAD as complementary to clinical incumbents</w:t>
             </w:r>
           </w:p>
         </w:tc>
@@ -11025,7 +11118,7 @@
               <w:jc w:val="right"/>
             </w:pPr>
             <w:r>
-              <w:t xml:space="preserve">(£36,326)</w:t>
+              <w:t xml:space="preserve">(£37,576)</w:t>
             </w:r>
           </w:p>
         </w:tc>
@@ -11075,7 +11168,7 @@
               <w:jc w:val="right"/>
             </w:pPr>
             <w:r>
-              <w:t xml:space="preserve">£20,950</w:t>
+              <w:t xml:space="preserve">£19,700</w:t>
             </w:r>
           </w:p>
         </w:tc>
@@ -15126,19 +15219,19 @@
               <w:jc w:val="right"/>
             </w:pPr>
             <w:r>
-              <w:t xml:space="preserve">(£10,821)</w:t>
-            </w:r>
-          </w:p>
-        </w:tc>
-        <w:tc>
-          <w:tcPr/>
-          <w:p>
-            <w:pPr>
-              <w:pStyle w:val="Compact"/>
-              <w:jc w:val="right"/>
-            </w:pPr>
-            <w:r>
-              <w:t xml:space="preserve">(£19,682)</w:t>
+              <w:t xml:space="preserve">(£12,071)</w:t>
+            </w:r>
+          </w:p>
+        </w:tc>
+        <w:tc>
+          <w:tcPr/>
+          <w:p>
+            <w:pPr>
+              <w:pStyle w:val="Compact"/>
+              <w:jc w:val="right"/>
+            </w:pPr>
+            <w:r>
+              <w:t xml:space="preserve">(£20,932)</w:t>
             </w:r>
           </w:p>
         </w:tc>
@@ -15328,23 +15421,23 @@
                 <w:bCs/>
                 <w:b/>
               </w:rPr>
-              <w:t xml:space="preserve">(£56,318)</w:t>
-            </w:r>
-          </w:p>
-        </w:tc>
-        <w:tc>
-          <w:tcPr/>
-          <w:p>
-            <w:pPr>
-              <w:pStyle w:val="Compact"/>
-              <w:jc w:val="right"/>
-            </w:pPr>
-            <w:r>
-              <w:rPr>
-                <w:bCs/>
-                <w:b/>
-              </w:rPr>
-              <w:t xml:space="preserve">(£75,539)</w:t>
+              <w:t xml:space="preserve">(£57,568)</w:t>
+            </w:r>
+          </w:p>
+        </w:tc>
+        <w:tc>
+          <w:tcPr/>
+          <w:p>
+            <w:pPr>
+              <w:pStyle w:val="Compact"/>
+              <w:jc w:val="right"/>
+            </w:pPr>
+            <w:r>
+              <w:rPr>
+                <w:bCs/>
+                <w:b/>
+              </w:rPr>
+              <w:t xml:space="preserve">(£76,789)</w:t>
             </w:r>
           </w:p>
         </w:tc>
@@ -15410,23 +15503,23 @@
                 <w:bCs/>
                 <w:b/>
               </w:rPr>
-              <w:t xml:space="preserve">£3,990</w:t>
-            </w:r>
-          </w:p>
-        </w:tc>
-        <w:tc>
-          <w:tcPr/>
-          <w:p>
-            <w:pPr>
-              <w:pStyle w:val="Compact"/>
-              <w:jc w:val="right"/>
-            </w:pPr>
-            <w:r>
-              <w:rPr>
-                <w:bCs/>
-                <w:b/>
-              </w:rPr>
-              <w:t xml:space="preserve">£20,116</w:t>
+              <w:t xml:space="preserve">£2,740</w:t>
+            </w:r>
+          </w:p>
+        </w:tc>
+        <w:tc>
+          <w:tcPr/>
+          <w:p>
+            <w:pPr>
+              <w:pStyle w:val="Compact"/>
+              <w:jc w:val="right"/>
+            </w:pPr>
+            <w:r>
+              <w:rPr>
+                <w:bCs/>
+                <w:b/>
+              </w:rPr>
+              <w:t xml:space="preserve">£18,866</w:t>
             </w:r>
           </w:p>
         </w:tc>
@@ -15492,23 +15585,23 @@
                 <w:bCs/>
                 <w:b/>
               </w:rPr>
-              <w:t xml:space="preserve">£23,116</w:t>
-            </w:r>
-          </w:p>
-        </w:tc>
-        <w:tc>
-          <w:tcPr/>
-          <w:p>
-            <w:pPr>
-              <w:pStyle w:val="Compact"/>
-              <w:jc w:val="right"/>
-            </w:pPr>
-            <w:r>
-              <w:rPr>
-                <w:bCs/>
-                <w:b/>
-              </w:rPr>
-              <w:t xml:space="preserve">£23,116</w:t>
+              <w:t xml:space="preserve">£21,866</w:t>
+            </w:r>
+          </w:p>
+        </w:tc>
+        <w:tc>
+          <w:tcPr/>
+          <w:p>
+            <w:pPr>
+              <w:pStyle w:val="Compact"/>
+              <w:jc w:val="right"/>
+            </w:pPr>
+            <w:r>
+              <w:rPr>
+                <w:bCs/>
+                <w:b/>
+              </w:rPr>
+              <w:t xml:space="preserve">£21,866</w:t>
             </w:r>
           </w:p>
         </w:tc>
@@ -20265,115 +20358,115 @@
               <w:jc w:val="right"/>
             </w:pPr>
             <w:r>
-              <w:t xml:space="preserve">£48,426</w:t>
-            </w:r>
-          </w:p>
-        </w:tc>
-        <w:tc>
-          <w:tcPr/>
-          <w:p>
-            <w:pPr>
-              <w:pStyle w:val="Compact"/>
-              <w:jc w:val="right"/>
-            </w:pPr>
-            <w:r>
-              <w:t xml:space="preserve">£44,920</w:t>
-            </w:r>
-          </w:p>
-        </w:tc>
-        <w:tc>
-          <w:tcPr/>
-          <w:p>
-            <w:pPr>
-              <w:pStyle w:val="Compact"/>
-              <w:jc w:val="right"/>
-            </w:pPr>
-            <w:r>
-              <w:t xml:space="preserve">£41,019</w:t>
-            </w:r>
-          </w:p>
-        </w:tc>
-        <w:tc>
-          <w:tcPr/>
-          <w:p>
-            <w:pPr>
-              <w:pStyle w:val="Compact"/>
-              <w:jc w:val="right"/>
-            </w:pPr>
-            <w:r>
-              <w:t xml:space="preserve">£37,449</w:t>
-            </w:r>
-          </w:p>
-        </w:tc>
-        <w:tc>
-          <w:tcPr/>
-          <w:p>
-            <w:pPr>
-              <w:pStyle w:val="Compact"/>
-              <w:jc w:val="right"/>
-            </w:pPr>
-            <w:r>
-              <w:t xml:space="preserve">£33,612</w:t>
-            </w:r>
-          </w:p>
-        </w:tc>
-        <w:tc>
-          <w:tcPr/>
-          <w:p>
-            <w:pPr>
-              <w:pStyle w:val="Compact"/>
-              <w:jc w:val="right"/>
-            </w:pPr>
-            <w:r>
-              <w:t xml:space="preserve">£41,686</w:t>
-            </w:r>
-          </w:p>
-        </w:tc>
-        <w:tc>
-          <w:tcPr/>
-          <w:p>
-            <w:pPr>
-              <w:pStyle w:val="Compact"/>
-              <w:jc w:val="right"/>
-            </w:pPr>
-            <w:r>
-              <w:t xml:space="preserve">£38,478</w:t>
-            </w:r>
-          </w:p>
-        </w:tc>
-        <w:tc>
-          <w:tcPr/>
-          <w:p>
-            <w:pPr>
-              <w:pStyle w:val="Compact"/>
-              <w:jc w:val="right"/>
-            </w:pPr>
-            <w:r>
-              <w:t xml:space="preserve">£33,488</w:t>
-            </w:r>
-          </w:p>
-        </w:tc>
-        <w:tc>
-          <w:tcPr/>
-          <w:p>
-            <w:pPr>
-              <w:pStyle w:val="Compact"/>
-              <w:jc w:val="right"/>
-            </w:pPr>
-            <w:r>
-              <w:t xml:space="preserve">£29,778</w:t>
-            </w:r>
-          </w:p>
-        </w:tc>
-        <w:tc>
-          <w:tcPr/>
-          <w:p>
-            <w:pPr>
-              <w:pStyle w:val="Compact"/>
-              <w:jc w:val="right"/>
-            </w:pPr>
-            <w:r>
-              <w:t xml:space="preserve">£26,766</w:t>
+              <w:t xml:space="preserve">£49,026</w:t>
+            </w:r>
+          </w:p>
+        </w:tc>
+        <w:tc>
+          <w:tcPr/>
+          <w:p>
+            <w:pPr>
+              <w:pStyle w:val="Compact"/>
+              <w:jc w:val="right"/>
+            </w:pPr>
+            <w:r>
+              <w:t xml:space="preserve">£45,520</w:t>
+            </w:r>
+          </w:p>
+        </w:tc>
+        <w:tc>
+          <w:tcPr/>
+          <w:p>
+            <w:pPr>
+              <w:pStyle w:val="Compact"/>
+              <w:jc w:val="right"/>
+            </w:pPr>
+            <w:r>
+              <w:t xml:space="preserve">£41,619</w:t>
+            </w:r>
+          </w:p>
+        </w:tc>
+        <w:tc>
+          <w:tcPr/>
+          <w:p>
+            <w:pPr>
+              <w:pStyle w:val="Compact"/>
+              <w:jc w:val="right"/>
+            </w:pPr>
+            <w:r>
+              <w:t xml:space="preserve">£38,049</w:t>
+            </w:r>
+          </w:p>
+        </w:tc>
+        <w:tc>
+          <w:tcPr/>
+          <w:p>
+            <w:pPr>
+              <w:pStyle w:val="Compact"/>
+              <w:jc w:val="right"/>
+            </w:pPr>
+            <w:r>
+              <w:t xml:space="preserve">£34,212</w:t>
+            </w:r>
+          </w:p>
+        </w:tc>
+        <w:tc>
+          <w:tcPr/>
+          <w:p>
+            <w:pPr>
+              <w:pStyle w:val="Compact"/>
+              <w:jc w:val="right"/>
+            </w:pPr>
+            <w:r>
+              <w:t xml:space="preserve">£42,286</w:t>
+            </w:r>
+          </w:p>
+        </w:tc>
+        <w:tc>
+          <w:tcPr/>
+          <w:p>
+            <w:pPr>
+              <w:pStyle w:val="Compact"/>
+              <w:jc w:val="right"/>
+            </w:pPr>
+            <w:r>
+              <w:t xml:space="preserve">£39,078</w:t>
+            </w:r>
+          </w:p>
+        </w:tc>
+        <w:tc>
+          <w:tcPr/>
+          <w:p>
+            <w:pPr>
+              <w:pStyle w:val="Compact"/>
+              <w:jc w:val="right"/>
+            </w:pPr>
+            <w:r>
+              <w:t xml:space="preserve">£32,238</w:t>
+            </w:r>
+          </w:p>
+        </w:tc>
+        <w:tc>
+          <w:tcPr/>
+          <w:p>
+            <w:pPr>
+              <w:pStyle w:val="Compact"/>
+              <w:jc w:val="right"/>
+            </w:pPr>
+            <w:r>
+              <w:t xml:space="preserve">£28,528</w:t>
+            </w:r>
+          </w:p>
+        </w:tc>
+        <w:tc>
+          <w:tcPr/>
+          <w:p>
+            <w:pPr>
+              <w:pStyle w:val="Compact"/>
+              <w:jc w:val="right"/>
+            </w:pPr>
+            <w:r>
+              <w:t xml:space="preserve">£25,516</w:t>
             </w:r>
           </w:p>
         </w:tc>
@@ -21325,18 +21418,6 @@
               <w:jc w:val="right"/>
             </w:pPr>
             <w:r>
-              <w:t xml:space="preserve">(£1,184)</w:t>
-            </w:r>
-          </w:p>
-        </w:tc>
-        <w:tc>
-          <w:tcPr/>
-          <w:p>
-            <w:pPr>
-              <w:pStyle w:val="Compact"/>
-              <w:jc w:val="right"/>
-            </w:pPr>
-            <w:r>
               <w:t xml:space="preserve">(£584)</w:t>
             </w:r>
           </w:p>
@@ -21349,6 +21430,18 @@
               <w:jc w:val="right"/>
             </w:pPr>
             <w:r>
+              <w:t xml:space="preserve">(£584)</w:t>
+            </w:r>
+          </w:p>
+        </w:tc>
+        <w:tc>
+          <w:tcPr/>
+          <w:p>
+            <w:pPr>
+              <w:pStyle w:val="Compact"/>
+              <w:jc w:val="right"/>
+            </w:pPr>
+            <w:r>
               <w:t xml:space="preserve">(£1,334)</w:t>
             </w:r>
           </w:p>
@@ -21409,7 +21502,7 @@
               <w:jc w:val="right"/>
             </w:pPr>
             <w:r>
-              <w:t xml:space="preserve">(£2,468)</w:t>
+              <w:t xml:space="preserve">(£4,318)</w:t>
             </w:r>
           </w:p>
         </w:tc>
@@ -21457,7 +21550,7 @@
               <w:jc w:val="right"/>
             </w:pPr>
             <w:r>
-              <w:t xml:space="preserve">(£10,821)</w:t>
+              <w:t xml:space="preserve">(£12,071)</w:t>
             </w:r>
           </w:p>
         </w:tc>
@@ -21847,7 +21940,7 @@
                 <w:bCs/>
                 <w:b/>
               </w:rPr>
-              <w:t xml:space="preserve">£14,395</w:t>
+              <w:t xml:space="preserve">£14,995</w:t>
             </w:r>
           </w:p>
         </w:tc>
@@ -21959,7 +22052,7 @@
                 <w:bCs/>
                 <w:b/>
               </w:rPr>
-              <w:t xml:space="preserve">(£4,990)</w:t>
+              <w:t xml:space="preserve">(£6,840)</w:t>
             </w:r>
           </w:p>
         </w:tc>
@@ -22023,7 +22116,7 @@
                 <w:bCs/>
                 <w:b/>
               </w:rPr>
-              <w:t xml:space="preserve">£3,990</w:t>
+              <w:t xml:space="preserve">£2,740</w:t>
             </w:r>
           </w:p>
         </w:tc>
@@ -22073,167 +22166,167 @@
                 <w:bCs/>
                 <w:b/>
               </w:rPr>
-              <w:t xml:space="preserve">£48,426</w:t>
-            </w:r>
-          </w:p>
-        </w:tc>
-        <w:tc>
-          <w:tcPr/>
-          <w:p>
-            <w:pPr>
-              <w:pStyle w:val="Compact"/>
-              <w:jc w:val="right"/>
-            </w:pPr>
-            <w:r>
-              <w:rPr>
-                <w:bCs/>
-                <w:b/>
-              </w:rPr>
-              <w:t xml:space="preserve">£44,920</w:t>
-            </w:r>
-          </w:p>
-        </w:tc>
-        <w:tc>
-          <w:tcPr/>
-          <w:p>
-            <w:pPr>
-              <w:pStyle w:val="Compact"/>
-              <w:jc w:val="right"/>
-            </w:pPr>
-            <w:r>
-              <w:rPr>
-                <w:bCs/>
-                <w:b/>
-              </w:rPr>
-              <w:t xml:space="preserve">£41,019</w:t>
-            </w:r>
-          </w:p>
-        </w:tc>
-        <w:tc>
-          <w:tcPr/>
-          <w:p>
-            <w:pPr>
-              <w:pStyle w:val="Compact"/>
-              <w:jc w:val="right"/>
-            </w:pPr>
-            <w:r>
-              <w:rPr>
-                <w:bCs/>
-                <w:b/>
-              </w:rPr>
-              <w:t xml:space="preserve">£37,449</w:t>
-            </w:r>
-          </w:p>
-        </w:tc>
-        <w:tc>
-          <w:tcPr/>
-          <w:p>
-            <w:pPr>
-              <w:pStyle w:val="Compact"/>
-              <w:jc w:val="right"/>
-            </w:pPr>
-            <w:r>
-              <w:rPr>
-                <w:bCs/>
-                <w:b/>
-              </w:rPr>
-              <w:t xml:space="preserve">£33,612</w:t>
-            </w:r>
-          </w:p>
-        </w:tc>
-        <w:tc>
-          <w:tcPr/>
-          <w:p>
-            <w:pPr>
-              <w:pStyle w:val="Compact"/>
-              <w:jc w:val="right"/>
-            </w:pPr>
-            <w:r>
-              <w:rPr>
-                <w:bCs/>
-                <w:b/>
-              </w:rPr>
-              <w:t xml:space="preserve">£41,686</w:t>
-            </w:r>
-          </w:p>
-        </w:tc>
-        <w:tc>
-          <w:tcPr/>
-          <w:p>
-            <w:pPr>
-              <w:pStyle w:val="Compact"/>
-              <w:jc w:val="right"/>
-            </w:pPr>
-            <w:r>
-              <w:rPr>
-                <w:bCs/>
-                <w:b/>
-              </w:rPr>
-              <w:t xml:space="preserve">£38,478</w:t>
-            </w:r>
-          </w:p>
-        </w:tc>
-        <w:tc>
-          <w:tcPr/>
-          <w:p>
-            <w:pPr>
-              <w:pStyle w:val="Compact"/>
-              <w:jc w:val="right"/>
-            </w:pPr>
-            <w:r>
-              <w:rPr>
-                <w:bCs/>
-                <w:b/>
-              </w:rPr>
-              <w:t xml:space="preserve">£33,488</w:t>
-            </w:r>
-          </w:p>
-        </w:tc>
-        <w:tc>
-          <w:tcPr/>
-          <w:p>
-            <w:pPr>
-              <w:pStyle w:val="Compact"/>
-              <w:jc w:val="right"/>
-            </w:pPr>
-            <w:r>
-              <w:rPr>
-                <w:bCs/>
-                <w:b/>
-              </w:rPr>
-              <w:t xml:space="preserve">£29,778</w:t>
-            </w:r>
-          </w:p>
-        </w:tc>
-        <w:tc>
-          <w:tcPr/>
-          <w:p>
-            <w:pPr>
-              <w:pStyle w:val="Compact"/>
-              <w:jc w:val="right"/>
-            </w:pPr>
-            <w:r>
-              <w:rPr>
-                <w:bCs/>
-                <w:b/>
-              </w:rPr>
-              <w:t xml:space="preserve">£26,766</w:t>
-            </w:r>
-          </w:p>
-        </w:tc>
-        <w:tc>
-          <w:tcPr/>
-          <w:p>
-            <w:pPr>
-              <w:pStyle w:val="Compact"/>
-              <w:jc w:val="right"/>
-            </w:pPr>
-            <w:r>
-              <w:rPr>
-                <w:bCs/>
-                <w:b/>
-              </w:rPr>
-              <w:t xml:space="preserve">£23,116</w:t>
+              <w:t xml:space="preserve">£49,026</w:t>
+            </w:r>
+          </w:p>
+        </w:tc>
+        <w:tc>
+          <w:tcPr/>
+          <w:p>
+            <w:pPr>
+              <w:pStyle w:val="Compact"/>
+              <w:jc w:val="right"/>
+            </w:pPr>
+            <w:r>
+              <w:rPr>
+                <w:bCs/>
+                <w:b/>
+              </w:rPr>
+              <w:t xml:space="preserve">£45,520</w:t>
+            </w:r>
+          </w:p>
+        </w:tc>
+        <w:tc>
+          <w:tcPr/>
+          <w:p>
+            <w:pPr>
+              <w:pStyle w:val="Compact"/>
+              <w:jc w:val="right"/>
+            </w:pPr>
+            <w:r>
+              <w:rPr>
+                <w:bCs/>
+                <w:b/>
+              </w:rPr>
+              <w:t xml:space="preserve">£41,619</w:t>
+            </w:r>
+          </w:p>
+        </w:tc>
+        <w:tc>
+          <w:tcPr/>
+          <w:p>
+            <w:pPr>
+              <w:pStyle w:val="Compact"/>
+              <w:jc w:val="right"/>
+            </w:pPr>
+            <w:r>
+              <w:rPr>
+                <w:bCs/>
+                <w:b/>
+              </w:rPr>
+              <w:t xml:space="preserve">£38,049</w:t>
+            </w:r>
+          </w:p>
+        </w:tc>
+        <w:tc>
+          <w:tcPr/>
+          <w:p>
+            <w:pPr>
+              <w:pStyle w:val="Compact"/>
+              <w:jc w:val="right"/>
+            </w:pPr>
+            <w:r>
+              <w:rPr>
+                <w:bCs/>
+                <w:b/>
+              </w:rPr>
+              <w:t xml:space="preserve">£34,212</w:t>
+            </w:r>
+          </w:p>
+        </w:tc>
+        <w:tc>
+          <w:tcPr/>
+          <w:p>
+            <w:pPr>
+              <w:pStyle w:val="Compact"/>
+              <w:jc w:val="right"/>
+            </w:pPr>
+            <w:r>
+              <w:rPr>
+                <w:bCs/>
+                <w:b/>
+              </w:rPr>
+              <w:t xml:space="preserve">£42,286</w:t>
+            </w:r>
+          </w:p>
+        </w:tc>
+        <w:tc>
+          <w:tcPr/>
+          <w:p>
+            <w:pPr>
+              <w:pStyle w:val="Compact"/>
+              <w:jc w:val="right"/>
+            </w:pPr>
+            <w:r>
+              <w:rPr>
+                <w:bCs/>
+                <w:b/>
+              </w:rPr>
+              <w:t xml:space="preserve">£39,078</w:t>
+            </w:r>
+          </w:p>
+        </w:tc>
+        <w:tc>
+          <w:tcPr/>
+          <w:p>
+            <w:pPr>
+              <w:pStyle w:val="Compact"/>
+              <w:jc w:val="right"/>
+            </w:pPr>
+            <w:r>
+              <w:rPr>
+                <w:bCs/>
+                <w:b/>
+              </w:rPr>
+              <w:t xml:space="preserve">£32,238</w:t>
+            </w:r>
+          </w:p>
+        </w:tc>
+        <w:tc>
+          <w:tcPr/>
+          <w:p>
+            <w:pPr>
+              <w:pStyle w:val="Compact"/>
+              <w:jc w:val="right"/>
+            </w:pPr>
+            <w:r>
+              <w:rPr>
+                <w:bCs/>
+                <w:b/>
+              </w:rPr>
+              <w:t xml:space="preserve">£28,528</w:t>
+            </w:r>
+          </w:p>
+        </w:tc>
+        <w:tc>
+          <w:tcPr/>
+          <w:p>
+            <w:pPr>
+              <w:pStyle w:val="Compact"/>
+              <w:jc w:val="right"/>
+            </w:pPr>
+            <w:r>
+              <w:rPr>
+                <w:bCs/>
+                <w:b/>
+              </w:rPr>
+              <w:t xml:space="preserve">£25,516</w:t>
+            </w:r>
+          </w:p>
+        </w:tc>
+        <w:tc>
+          <w:tcPr/>
+          <w:p>
+            <w:pPr>
+              <w:pStyle w:val="Compact"/>
+              <w:jc w:val="right"/>
+            </w:pPr>
+            <w:r>
+              <w:rPr>
+                <w:bCs/>
+                <w:b/>
+              </w:rPr>
+              <w:t xml:space="preserve">£21,866</w:t>
             </w:r>
           </w:p>
         </w:tc>
@@ -23157,19 +23250,19 @@
               <w:jc w:val="right"/>
             </w:pPr>
             <w:r>
-              <w:t xml:space="preserve">(£2,500)</w:t>
-            </w:r>
-          </w:p>
-        </w:tc>
-        <w:tc>
-          <w:tcPr/>
-          <w:p>
-            <w:pPr>
-              <w:pStyle w:val="Compact"/>
-              <w:jc w:val="right"/>
-            </w:pPr>
-            <w:r>
-              <w:t xml:space="preserve">(£3,400)</w:t>
+              <w:t xml:space="preserve">(£3,750)</w:t>
+            </w:r>
+          </w:p>
+        </w:tc>
+        <w:tc>
+          <w:tcPr/>
+          <w:p>
+            <w:pPr>
+              <w:pStyle w:val="Compact"/>
+              <w:jc w:val="right"/>
+            </w:pPr>
+            <w:r>
+              <w:t xml:space="preserve">(£4,650)</w:t>
             </w:r>
           </w:p>
         </w:tc>
@@ -23483,23 +23576,23 @@
                 <w:bCs/>
                 <w:b/>
               </w:rPr>
-              <w:t xml:space="preserve">(£48,656)</w:t>
-            </w:r>
-          </w:p>
-        </w:tc>
-        <w:tc>
-          <w:tcPr/>
-          <w:p>
-            <w:pPr>
-              <w:pStyle w:val="Compact"/>
-              <w:jc w:val="right"/>
-            </w:pPr>
-            <w:r>
-              <w:rPr>
-                <w:bCs/>
-                <w:b/>
-              </w:rPr>
-              <w:t xml:space="preserve">(£62,517)</w:t>
+              <w:t xml:space="preserve">(£49,906)</w:t>
+            </w:r>
+          </w:p>
+        </w:tc>
+        <w:tc>
+          <w:tcPr/>
+          <w:p>
+            <w:pPr>
+              <w:pStyle w:val="Compact"/>
+              <w:jc w:val="right"/>
+            </w:pPr>
+            <w:r>
+              <w:rPr>
+                <w:bCs/>
+                <w:b/>
+              </w:rPr>
+              <w:t xml:space="preserve">(£63,767)</w:t>
             </w:r>
           </w:p>
         </w:tc>
@@ -23565,23 +23658,23 @@
                 <w:bCs/>
                 <w:b/>
               </w:rPr>
-              <w:t xml:space="preserve">(£153)</w:t>
-            </w:r>
-          </w:p>
-        </w:tc>
-        <w:tc>
-          <w:tcPr/>
-          <w:p>
-            <w:pPr>
-              <w:pStyle w:val="Compact"/>
-              <w:jc w:val="right"/>
-            </w:pPr>
-            <w:r>
-              <w:rPr>
-                <w:bCs/>
-                <w:b/>
-              </w:rPr>
-              <w:t xml:space="preserve">£4,806</w:t>
+              <w:t xml:space="preserve">(£1,403)</w:t>
+            </w:r>
+          </w:p>
+        </w:tc>
+        <w:tc>
+          <w:tcPr/>
+          <w:p>
+            <w:pPr>
+              <w:pStyle w:val="Compact"/>
+              <w:jc w:val="right"/>
+            </w:pPr>
+            <w:r>
+              <w:rPr>
+                <w:bCs/>
+                <w:b/>
+              </w:rPr>
+              <w:t xml:space="preserve">£3,556</w:t>
             </w:r>
           </w:p>
         </w:tc>
@@ -23709,23 +23802,23 @@
                 <w:bCs/>
                 <w:b/>
               </w:rPr>
-              <w:t xml:space="preserve">(£1,020)</w:t>
-            </w:r>
-          </w:p>
-        </w:tc>
-        <w:tc>
-          <w:tcPr/>
-          <w:p>
-            <w:pPr>
-              <w:pStyle w:val="Compact"/>
-              <w:jc w:val="right"/>
-            </w:pPr>
-            <w:r>
-              <w:rPr>
-                <w:bCs/>
-                <w:b/>
-              </w:rPr>
-              <w:t xml:space="preserve">£3,431</w:t>
+              <w:t xml:space="preserve">(£2,270)</w:t>
+            </w:r>
+          </w:p>
+        </w:tc>
+        <w:tc>
+          <w:tcPr/>
+          <w:p>
+            <w:pPr>
+              <w:pStyle w:val="Compact"/>
+              <w:jc w:val="right"/>
+            </w:pPr>
+            <w:r>
+              <w:rPr>
+                <w:bCs/>
+                <w:b/>
+              </w:rPr>
+              <w:t xml:space="preserve">£2,181</w:t>
             </w:r>
           </w:p>
         </w:tc>
@@ -23853,23 +23946,23 @@
                 <w:bCs/>
                 <w:b/>
               </w:rPr>
-              <w:t xml:space="preserve">(£1,020)</w:t>
-            </w:r>
-          </w:p>
-        </w:tc>
-        <w:tc>
-          <w:tcPr/>
-          <w:p>
-            <w:pPr>
-              <w:pStyle w:val="Compact"/>
-              <w:jc w:val="right"/>
-            </w:pPr>
-            <w:r>
-              <w:rPr>
-                <w:bCs/>
-                <w:b/>
-              </w:rPr>
-              <w:t xml:space="preserve">£2,774</w:t>
+              <w:t xml:space="preserve">(£2,270)</w:t>
+            </w:r>
+          </w:p>
+        </w:tc>
+        <w:tc>
+          <w:tcPr/>
+          <w:p>
+            <w:pPr>
+              <w:pStyle w:val="Compact"/>
+              <w:jc w:val="right"/>
+            </w:pPr>
+            <w:r>
+              <w:rPr>
+                <w:bCs/>
+                <w:b/>
+              </w:rPr>
+              <w:t xml:space="preserve">£1,524</w:t>
             </w:r>
           </w:p>
         </w:tc>
@@ -23919,7 +24012,7 @@
               <w:jc w:val="right"/>
             </w:pPr>
             <w:r>
-              <w:t xml:space="preserve">-1.9%</w:t>
+              <w:t xml:space="preserve">-4.2%</w:t>
             </w:r>
           </w:p>
         </w:tc>
@@ -24285,7 +24378,7 @@
               <w:jc w:val="right"/>
             </w:pPr>
             <w:r>
-              <w:t xml:space="preserve">(£1,020)</w:t>
+              <w:t xml:space="preserve">(£2,270)</w:t>
             </w:r>
           </w:p>
         </w:tc>
@@ -24321,19 +24414,19 @@
               <w:jc w:val="right"/>
             </w:pPr>
             <w:r>
-              <w:t xml:space="preserve">(£1,353)</w:t>
-            </w:r>
-          </w:p>
-        </w:tc>
-        <w:tc>
-          <w:tcPr/>
-          <w:p>
-            <w:pPr>
-              <w:pStyle w:val="Compact"/>
-              <w:jc w:val="right"/>
-            </w:pPr>
-            <w:r>
-              <w:t xml:space="preserve">£1,353</w:t>
+              <w:t xml:space="preserve">(£2,603)</w:t>
+            </w:r>
+          </w:p>
+        </w:tc>
+        <w:tc>
+          <w:tcPr/>
+          <w:p>
+            <w:pPr>
+              <w:pStyle w:val="Compact"/>
+              <w:jc w:val="right"/>
+            </w:pPr>
+            <w:r>
+              <w:t xml:space="preserve">£2,603</w:t>
             </w:r>
           </w:p>
         </w:tc>
@@ -24386,7 +24479,7 @@
         <w:t xml:space="preserve"> </w:t>
       </w:r>
       <w:r>
-        <w:t xml:space="preserve">Year 1 is a deliberate investment year, with a loss of (£4,803) funded from the equity raised. Year 2 turns profitable (£8,597 after tax) on the first licence and a cost base still carried by an unpaid founder. In Year 3 the company starts paying the founder, makes its first two part-time hires and explores patent protection with its patent attorney, and still roughly breaks even, with an after-tax result of (£1,020). Profit is not the aim in the early years; showing that the company can pay for its own team from revenue is.</w:t>
+        <w:t xml:space="preserve">Year 1 is a deliberate investment year, with a loss of (£4,803) funded from the equity raised. Year 2 turns profitable (£8,597 after tax) on the first licence and a cost base still carried by an unpaid founder. In Year 3 the company starts paying the founder, makes its first two part-time hires and invests £3,350 in a UK patent application (if the attorney’s assessment is positive). The after-tax result is (£2,270): a small loss caused entirely by the one-off patent cost. Without it, Year 3 would be profitable, and cash is unaffected in any way that matters. Profit is not the aim in the early years; showing that the company can pay for its own team from revenue is.</w:t>
       </w:r>
     </w:p>
     <w:p>
@@ -24783,7 +24876,7 @@
               <w:jc w:val="right"/>
             </w:pPr>
             <w:r>
-              <w:t xml:space="preserve">£23,116</w:t>
+              <w:t xml:space="preserve">£21,866</w:t>
             </w:r>
           </w:p>
         </w:tc>
@@ -24849,7 +24942,7 @@
                 <w:bCs/>
                 <w:b/>
               </w:rPr>
-              <w:t xml:space="preserve">£44,441</w:t>
+              <w:t xml:space="preserve">£43,191</w:t>
             </w:r>
           </w:p>
         </w:tc>
@@ -25081,7 +25174,7 @@
                 <w:bCs/>
                 <w:b/>
               </w:rPr>
-              <w:t xml:space="preserve">£16,774</w:t>
+              <w:t xml:space="preserve">£15,524</w:t>
             </w:r>
           </w:p>
         </w:tc>
@@ -25181,7 +25274,7 @@
               <w:jc w:val="right"/>
             </w:pPr>
             <w:r>
-              <w:t xml:space="preserve">£2,774</w:t>
+              <w:t xml:space="preserve">£1,524</w:t>
             </w:r>
           </w:p>
         </w:tc>
@@ -25247,7 +25340,7 @@
                 <w:bCs/>
                 <w:b/>
               </w:rPr>
-              <w:t xml:space="preserve">£16,774</w:t>
+              <w:t xml:space="preserve">£15,524</w:t>
             </w:r>
           </w:p>
         </w:tc>
@@ -31294,19 +31387,19 @@
               <w:jc w:val="right"/>
             </w:pPr>
             <w:r>
-              <w:t xml:space="preserve">(£2,500)</w:t>
-            </w:r>
-          </w:p>
-        </w:tc>
-        <w:tc>
-          <w:tcPr/>
-          <w:p>
-            <w:pPr>
-              <w:pStyle w:val="Compact"/>
-              <w:jc w:val="right"/>
-            </w:pPr>
-            <w:r>
-              <w:t xml:space="preserve">(£3,400)</w:t>
+              <w:t xml:space="preserve">(£3,750)</w:t>
+            </w:r>
+          </w:p>
+        </w:tc>
+        <w:tc>
+          <w:tcPr/>
+          <w:p>
+            <w:pPr>
+              <w:pStyle w:val="Compact"/>
+              <w:jc w:val="right"/>
+            </w:pPr>
+            <w:r>
+              <w:t xml:space="preserve">(£4,650)</w:t>
             </w:r>
           </w:p>
         </w:tc>
@@ -31620,23 +31713,23 @@
                 <w:bCs/>
                 <w:b/>
               </w:rPr>
-              <w:t xml:space="preserve">(£171,019)</w:t>
-            </w:r>
-          </w:p>
-        </w:tc>
-        <w:tc>
-          <w:tcPr/>
-          <w:p>
-            <w:pPr>
-              <w:pStyle w:val="Compact"/>
-              <w:jc w:val="right"/>
-            </w:pPr>
-            <w:r>
-              <w:rPr>
-                <w:bCs/>
-                <w:b/>
-              </w:rPr>
-              <w:t xml:space="preserve">(£186,630)</w:t>
+              <w:t xml:space="preserve">(£172,269)</w:t>
+            </w:r>
+          </w:p>
+        </w:tc>
+        <w:tc>
+          <w:tcPr/>
+          <w:p>
+            <w:pPr>
+              <w:pStyle w:val="Compact"/>
+              <w:jc w:val="right"/>
+            </w:pPr>
+            <w:r>
+              <w:rPr>
+                <w:bCs/>
+                <w:b/>
+              </w:rPr>
+              <w:t xml:space="preserve">(£187,880)</w:t>
             </w:r>
           </w:p>
         </w:tc>
@@ -31702,23 +31795,23 @@
                 <w:bCs/>
                 <w:b/>
               </w:rPr>
-              <w:t xml:space="preserve">(£34,600)</w:t>
-            </w:r>
-          </w:p>
-        </w:tc>
-        <w:tc>
-          <w:tcPr/>
-          <w:p>
-            <w:pPr>
-              <w:pStyle w:val="Compact"/>
-              <w:jc w:val="right"/>
-            </w:pPr>
-            <w:r>
-              <w:rPr>
-                <w:bCs/>
-                <w:b/>
-              </w:rPr>
-              <w:t xml:space="preserve">(£18,121)</w:t>
+              <w:t xml:space="preserve">(£35,850)</w:t>
+            </w:r>
+          </w:p>
+        </w:tc>
+        <w:tc>
+          <w:tcPr/>
+          <w:p>
+            <w:pPr>
+              <w:pStyle w:val="Compact"/>
+              <w:jc w:val="right"/>
+            </w:pPr>
+            <w:r>
+              <w:rPr>
+                <w:bCs/>
+                <w:b/>
+              </w:rPr>
+              <w:t xml:space="preserve">(£19,371)</w:t>
             </w:r>
           </w:p>
         </w:tc>
@@ -31846,23 +31939,23 @@
                 <w:bCs/>
                 <w:b/>
               </w:rPr>
-              <w:t xml:space="preserve">(£36,326)</w:t>
-            </w:r>
-          </w:p>
-        </w:tc>
-        <w:tc>
-          <w:tcPr/>
-          <w:p>
-            <w:pPr>
-              <w:pStyle w:val="Compact"/>
-              <w:jc w:val="right"/>
-            </w:pPr>
-            <w:r>
-              <w:rPr>
-                <w:bCs/>
-                <w:b/>
-              </w:rPr>
-              <w:t xml:space="preserve">(£20,355)</w:t>
+              <w:t xml:space="preserve">(£37,576)</w:t>
+            </w:r>
+          </w:p>
+        </w:tc>
+        <w:tc>
+          <w:tcPr/>
+          <w:p>
+            <w:pPr>
+              <w:pStyle w:val="Compact"/>
+              <w:jc w:val="right"/>
+            </w:pPr>
+            <w:r>
+              <w:rPr>
+                <w:bCs/>
+                <w:b/>
+              </w:rPr>
+              <w:t xml:space="preserve">(£21,605)</w:t>
             </w:r>
           </w:p>
         </w:tc>
@@ -31990,23 +32083,23 @@
                 <w:bCs/>
                 <w:b/>
               </w:rPr>
-              <w:t xml:space="preserve">(£36,326)</w:t>
-            </w:r>
-          </w:p>
-        </w:tc>
-        <w:tc>
-          <w:tcPr/>
-          <w:p>
-            <w:pPr>
-              <w:pStyle w:val="Compact"/>
-              <w:jc w:val="right"/>
-            </w:pPr>
-            <w:r>
-              <w:rPr>
-                <w:bCs/>
-                <w:b/>
-              </w:rPr>
-              <w:t xml:space="preserve">(£23,201)</w:t>
+              <w:t xml:space="preserve">(£37,576)</w:t>
+            </w:r>
+          </w:p>
+        </w:tc>
+        <w:tc>
+          <w:tcPr/>
+          <w:p>
+            <w:pPr>
+              <w:pStyle w:val="Compact"/>
+              <w:jc w:val="right"/>
+            </w:pPr>
+            <w:r>
+              <w:rPr>
+                <w:bCs/>
+                <w:b/>
+              </w:rPr>
+              <w:t xml:space="preserve">(£24,451)</w:t>
             </w:r>
           </w:p>
         </w:tc>
@@ -32056,7 +32149,7 @@
               <w:jc w:val="right"/>
             </w:pPr>
             <w:r>
-              <w:t xml:space="preserve">-24.3%</w:t>
+              <w:t xml:space="preserve">-25.2%</w:t>
             </w:r>
           </w:p>
         </w:tc>
@@ -32716,19 +32809,19 @@
               <w:jc w:val="right"/>
             </w:pPr>
             <w:r>
-              <w:t xml:space="preserve">(£16,101)</w:t>
-            </w:r>
-          </w:p>
-        </w:tc>
-        <w:tc>
-          <w:tcPr/>
-          <w:p>
-            <w:pPr>
-              <w:pStyle w:val="Compact"/>
-              <w:jc w:val="right"/>
-            </w:pPr>
-            <w:r>
-              <w:t xml:space="preserve">(£24,962)</w:t>
+              <w:t xml:space="preserve">(£17,351)</w:t>
+            </w:r>
+          </w:p>
+        </w:tc>
+        <w:tc>
+          <w:tcPr/>
+          <w:p>
+            <w:pPr>
+              <w:pStyle w:val="Compact"/>
+              <w:jc w:val="right"/>
+            </w:pPr>
+            <w:r>
+              <w:t xml:space="preserve">(£26,212)</w:t>
             </w:r>
           </w:p>
         </w:tc>
@@ -32918,23 +33011,23 @@
                 <w:bCs/>
                 <w:b/>
               </w:rPr>
-              <w:t xml:space="preserve">(£190,497)</w:t>
-            </w:r>
-          </w:p>
-        </w:tc>
-        <w:tc>
-          <w:tcPr/>
-          <w:p>
-            <w:pPr>
-              <w:pStyle w:val="Compact"/>
-              <w:jc w:val="right"/>
-            </w:pPr>
-            <w:r>
-              <w:rPr>
-                <w:bCs/>
-                <w:b/>
-              </w:rPr>
-              <w:t xml:space="preserve">(£212,850)</w:t>
+              <w:t xml:space="preserve">(£191,747)</w:t>
+            </w:r>
+          </w:p>
+        </w:tc>
+        <w:tc>
+          <w:tcPr/>
+          <w:p>
+            <w:pPr>
+              <w:pStyle w:val="Compact"/>
+              <w:jc w:val="right"/>
+            </w:pPr>
+            <w:r>
+              <w:rPr>
+                <w:bCs/>
+                <w:b/>
+              </w:rPr>
+              <w:t xml:space="preserve">(£214,100)</w:t>
             </w:r>
           </w:p>
         </w:tc>
@@ -33000,23 +33093,23 @@
                 <w:bCs/>
                 <w:b/>
               </w:rPr>
-              <w:t xml:space="preserve">(£16,362)</w:t>
-            </w:r>
-          </w:p>
-        </w:tc>
-        <w:tc>
-          <w:tcPr/>
-          <w:p>
-            <w:pPr>
-              <w:pStyle w:val="Compact"/>
-              <w:jc w:val="right"/>
-            </w:pPr>
-            <w:r>
-              <w:rPr>
-                <w:bCs/>
-                <w:b/>
-              </w:rPr>
-              <w:t xml:space="preserve">£17,950</w:t>
+              <w:t xml:space="preserve">(£17,612)</w:t>
+            </w:r>
+          </w:p>
+        </w:tc>
+        <w:tc>
+          <w:tcPr/>
+          <w:p>
+            <w:pPr>
+              <w:pStyle w:val="Compact"/>
+              <w:jc w:val="right"/>
+            </w:pPr>
+            <w:r>
+              <w:rPr>
+                <w:bCs/>
+                <w:b/>
+              </w:rPr>
+              <w:t xml:space="preserve">£16,700</w:t>
             </w:r>
           </w:p>
         </w:tc>
@@ -33082,23 +33175,23 @@
                 <w:bCs/>
                 <w:b/>
               </w:rPr>
-              <w:t xml:space="preserve">£20,950</w:t>
-            </w:r>
-          </w:p>
-        </w:tc>
-        <w:tc>
-          <w:tcPr/>
-          <w:p>
-            <w:pPr>
-              <w:pStyle w:val="Compact"/>
-              <w:jc w:val="right"/>
-            </w:pPr>
-            <w:r>
-              <w:rPr>
-                <w:bCs/>
-                <w:b/>
-              </w:rPr>
-              <w:t xml:space="preserve">£20,950</w:t>
+              <w:t xml:space="preserve">£19,700</w:t>
+            </w:r>
+          </w:p>
+        </w:tc>
+        <w:tc>
+          <w:tcPr/>
+          <w:p>
+            <w:pPr>
+              <w:pStyle w:val="Compact"/>
+              <w:jc w:val="right"/>
+            </w:pPr>
+            <w:r>
+              <w:rPr>
+                <w:bCs/>
+                <w:b/>
+              </w:rPr>
+              <w:t xml:space="preserve">£19,700</w:t>
             </w:r>
           </w:p>
         </w:tc>

</xml_diff>

<commit_message>
Business plan v6: patent exploration conditional on pilot conversion and first paying university
Co-Authored-By: Claude Opus 5.5 <noreply@anthropic.com>
Claude-Session: https://claude.ai/code/session_0146q3FtAYmgQ1rtNsNNpdiD
</commit_message>
<xml_diff>
--- a/visa_appendices/docx/DEQUAD_UKES_Business_Plan_v6.docx
+++ b/visa_appendices/docx/DEQUAD_UKES_Business_Plan_v6.docx
@@ -3480,13 +3480,13 @@
                 <w:bCs/>
                 <w:b/>
               </w:rPr>
-              <w:t xml:space="preserve">Patent exploration in Year 3</w:t>
+              <w:t xml:space="preserve">Patent exploration only after the pilot converts into a paying university.</w:t>
             </w:r>
             <w:r>
               <w:t xml:space="preserve"> </w:t>
             </w:r>
             <w:r>
-              <w:t xml:space="preserve">with the same attorney. DEQUAD will complete the</w:t>
+              <w:t xml:space="preserve">The trigger is a successful Bedfordshire pilot, a signed letter of intent</w:t>
             </w:r>
             <w:r>
               <w:t xml:space="preserve"> </w:t>
@@ -3496,6 +3496,22 @@
                 <w:bCs/>
                 <w:b/>
               </w:rPr>
+              <w:t xml:space="preserve">and</w:t>
+            </w:r>
+            <w:r>
+              <w:t xml:space="preserve"> </w:t>
+            </w:r>
+            <w:r>
+              <w:t xml:space="preserve">a signed, paid licence (first licence modelled from October 2027). Once that trigger is met, exploration starts in Year 3 with the same attorney. DEQUAD will complete the</w:t>
+            </w:r>
+            <w:r>
+              <w:t xml:space="preserve"> </w:t>
+            </w:r>
+            <w:r>
+              <w:rPr>
+                <w:bCs/>
+                <w:b/>
+              </w:rPr>
               <w:t xml:space="preserve">invention disclosure form</w:t>
             </w:r>
             <w:r>
@@ -3543,7 +3559,7 @@
               <w:t xml:space="preserve"> </w:t>
             </w:r>
             <w:r>
-              <w:t xml:space="preserve">(drafting £3,000, at the low end of the attorney’s £3,000–£5,000 estimate because a complete disclosure is supplied, plus £350 filing), included in the Year 3 forecast. Prosecution to grant (2–3 rounds at £1,000–£1,500 each; £8,000–£10,000 in total to grant) would fall after Year 3 and be funded from licence revenue</w:t>
+              <w:t xml:space="preserve">(drafting £3,000, at the low end of the attorney’s £3,000–£5,000 estimate because a complete disclosure is supplied, plus £350 filing), included in the Year 3 forecast. Prosecution to grant (2–3 rounds at £1,000–£1,500 each; £8,000–£10,000 in total to grant) would fall after Year 3 and be funded from licence revenue. If no university is acquired, no patent money is spent (Section 12.3)</w:t>
             </w:r>
           </w:p>
         </w:tc>
@@ -10136,7 +10152,7 @@
               <w:jc w:val="left"/>
             </w:pPr>
             <w:r>
-              <w:t xml:space="preserve">Barriers in Section 3.4: server-side trade secrets and IP-assignment deeds, a growing proprietary verified dataset, preferred-supplier terms sought in the LOI and licences, patent exploration in Year 3 with Panoramix IP (consulted via the CIPA IP Clinic, Apr 2026), and a UK trademark; plus positioning DEQUAD as complementary to clinical incumbents</w:t>
+              <w:t xml:space="preserve">Barriers in Section 3.4: server-side trade secrets and IP-assignment deeds, a growing proprietary verified dataset, preferred-supplier terms sought in the LOI and licences, patent exploration in Year 3 with Panoramix IP (consulted via the CIPA IP Clinic, Apr 2026), once the pilot has converted into a paying university, and a UK trademark; plus positioning DEQUAD as complementary to clinical incumbents</w:t>
             </w:r>
           </w:p>
         </w:tc>
@@ -22379,7 +22395,7 @@
         <w:t xml:space="preserve"> </w:t>
       </w:r>
       <w:r>
-        <w:t xml:space="preserve">the £11,000 investment depend on it. If the pilot does not lead to a letter of intent, the founder moves the business into survival mode. Overheads stay at Year 1 levels and work stays remote. Marketing is cut to a tenth of the Year 1 budget (organic and ambassador-led only). Costs that only matter for selling to universities (Cyber Essentials, trademark, equipment) are dropped, and there is no founder pay and no hiring.</w:t>
+        <w:t xml:space="preserve">the £11,000 investment depend on it. If the pilot does not lead to a letter of intent, the founder moves the business into survival mode. Overheads stay at Year 1 levels and work stays remote. Marketing is cut to a tenth of the Year 1 budget (organic and ambassador-led only). Costs that only matter for selling to universities (Cyber Essentials, trademark, equipment, patent work) are dropped, and there is no founder pay and no hiring.</w:t>
       </w:r>
     </w:p>
     <w:p>
@@ -24479,7 +24495,7 @@
         <w:t xml:space="preserve"> </w:t>
       </w:r>
       <w:r>
-        <w:t xml:space="preserve">Year 1 is a deliberate investment year, with a loss of (£4,803) funded from the equity raised. Year 2 turns profitable (£8,597 after tax) on the first licence and a cost base still carried by an unpaid founder. In Year 3 the company starts paying the founder, makes its first two part-time hires and invests £3,350 in a UK patent application (if the attorney’s assessment is positive). The after-tax result is (£2,270): a small loss caused entirely by the one-off patent cost. Without it, Year 3 would be profitable, and cash is unaffected in any way that matters. Profit is not the aim in the early years; showing that the company can pay for its own team from revenue is.</w:t>
+        <w:t xml:space="preserve">Year 1 is a deliberate investment year, with a loss of (£4,803) funded from the equity raised. Year 2 turns profitable (£8,597 after tax) on the first licence and a cost base still carried by an unpaid founder. In Year 3 the company starts paying the founder, makes its first two part-time hires and, because the first university has by then been acquired, invests £3,350 in a UK patent application (if the attorney’s assessment is positive). The after-tax result is (£2,270): a small loss caused entirely by the one-off patent cost. Without it, Year 3 would be profitable, and cash is unaffected in any way that matters. Profit is not the aim in the early years; showing that the company can pay for its own team from revenue is.</w:t>
       </w:r>
     </w:p>
     <w:p>

</xml_diff>

<commit_message>
Business plan v6: patent exploration after three-year endorsement and university conversion
Patent costs removed from the 36-month forecast; Section 3.4, SWOT, risk
table and P&L commentary updated.

Co-Authored-By: Claude Opus 5.5 <noreply@anthropic.com>
Claude-Session: https://claude.ai/code/session_0146q3FtAYmgQ1rtNsNNpdiD
</commit_message>
<xml_diff>
--- a/visa_appendices/docx/DEQUAD_UKES_Business_Plan_v6.docx
+++ b/visa_appendices/docx/DEQUAD_UKES_Business_Plan_v6.docx
@@ -1332,7 +1332,7 @@
               <w:jc w:val="right"/>
             </w:pPr>
             <w:r>
-              <w:t xml:space="preserve">(£2,270)</w:t>
+              <w:t xml:space="preserve">£938</w:t>
             </w:r>
           </w:p>
         </w:tc>
@@ -1382,7 +1382,7 @@
               <w:jc w:val="right"/>
             </w:pPr>
             <w:r>
-              <w:t xml:space="preserve">£21,866</w:t>
+              <w:t xml:space="preserve">£25,216</w:t>
             </w:r>
           </w:p>
         </w:tc>
@@ -1622,7 +1622,7 @@
         <w:t xml:space="preserve">four full-time UK jobs (a £30,000 Software Engineer and three roles at £25,000) plus a part-time safeguarding role</w:t>
       </w:r>
       <w:r>
-        <w:t xml:space="preserve">, pays the founder, and still ends Year 3 with £19,700 in the bank.</w:t>
+        <w:t xml:space="preserve">, pays the founder, and still ends Year 3 with £23,050 in the bank.</w:t>
       </w:r>
     </w:p>
     <w:p>
@@ -3480,13 +3480,13 @@
                 <w:bCs/>
                 <w:b/>
               </w:rPr>
-              <w:t xml:space="preserve">Patent exploration only after the pilot converts into a paying university.</w:t>
+              <w:t xml:space="preserve">Patent exploration only after two conditions are both met:</w:t>
             </w:r>
             <w:r>
               <w:t xml:space="preserve"> </w:t>
             </w:r>
             <w:r>
-              <w:t xml:space="preserve">The trigger is a successful Bedfordshire pilot, a signed letter of intent</w:t>
+              <w:t xml:space="preserve">(1) the</w:t>
             </w:r>
             <w:r>
               <w:t xml:space="preserve"> </w:t>
@@ -3496,18 +3496,31 @@
                 <w:bCs/>
                 <w:b/>
               </w:rPr>
-              <w:t xml:space="preserve">and</w:t>
+              <w:t xml:space="preserve">three-year endorsement period is successfully completed</w:t>
+            </w:r>
+            <w:r>
+              <w:t xml:space="preserve">, and (2) the pilot has</w:t>
             </w:r>
             <w:r>
               <w:t xml:space="preserve"> </w:t>
             </w:r>
             <w:r>
-              <w:t xml:space="preserve">a signed, paid licence (first licence modelled from October 2027). Once that trigger is met, exploration starts in Year 3 with the same attorney. DEQUAD will complete the</w:t>
+              <w:rPr>
+                <w:bCs/>
+                <w:b/>
+              </w:rPr>
+              <w:t xml:space="preserve">converted into a paying university</w:t>
             </w:r>
             <w:r>
               <w:t xml:space="preserve"> </w:t>
             </w:r>
             <w:r>
+              <w:t xml:space="preserve">(successful pilot, signed letter of intent and signed paid licence). Patent work therefore starts after this three-year plan, from Year 4 (September 2029 onwards), with the same attorney. DEQUAD will complete the</w:t>
+            </w:r>
+            <w:r>
+              <w:t xml:space="preserve"> </w:t>
+            </w:r>
+            <w:r>
               <w:rPr>
                 <w:bCs/>
                 <w:b/>
@@ -3531,35 +3544,29 @@
               <w:t xml:space="preserve">UK priority application</w:t>
             </w:r>
             <w:r>
-              <w:t xml:space="preserve">. Year 3 timing means the application can draw on two years of real alert data and the personal-baseline model (Section 4.2)</w:t>
-            </w:r>
-          </w:p>
-        </w:tc>
-        <w:tc>
-          <w:tcPr/>
-          <w:p>
-            <w:pPr>
-              <w:pStyle w:val="Compact"/>
-              <w:jc w:val="left"/>
-            </w:pPr>
-            <w:r>
-              <w:t xml:space="preserve">Assessment and search Oct 2028 (no cost). If positive: drafting and filing May 2029,</w:t>
+              <w:t xml:space="preserve">. Waiting until then means the application can draw on three years of real alert data and the personal-baseline model (Section 4.2), which strengthens the case for technical effect</w:t>
+            </w:r>
+          </w:p>
+        </w:tc>
+        <w:tc>
+          <w:tcPr/>
+          <w:p>
+            <w:pPr>
+              <w:pStyle w:val="Compact"/>
+              <w:jc w:val="left"/>
+            </w:pPr>
+            <w:r>
+              <w:rPr>
+                <w:bCs/>
+                <w:b/>
+              </w:rPr>
+              <w:t xml:space="preserve">Not in the three-year forecast.</w:t>
             </w:r>
             <w:r>
               <w:t xml:space="preserve"> </w:t>
             </w:r>
             <w:r>
-              <w:rPr>
-                <w:bCs/>
-                <w:b/>
-              </w:rPr>
-              <w:t xml:space="preserve">£3,350</w:t>
-            </w:r>
-            <w:r>
-              <w:t xml:space="preserve"> </w:t>
-            </w:r>
-            <w:r>
-              <w:t xml:space="preserve">(drafting £3,000, at the low end of the attorney’s £3,000–£5,000 estimate because a complete disclosure is supplied, plus £350 filing), included in the Year 3 forecast. Prosecution to grant (2–3 rounds at £1,000–£1,500 each; £8,000–£10,000 in total to grant) would fall after Year 3 and be funded from licence revenue. If no university is acquired, no patent money is spent (Section 12.3)</w:t>
+              <w:t xml:space="preserve">From Year 4, if positive: drafting £3,000–£5,000 plus £350 filing, then prosecution (2–3 rounds at £1,000–£1,500 each; £8,000–£10,000 in total to grant), all funded from licence revenue. Until then, DEQUAD’s algorithms are protected as trade secrets (row 1). If no university is acquired, no patent money is spent</w:t>
             </w:r>
           </w:p>
         </w:tc>
@@ -3672,7 +3679,7 @@
         <w:t xml:space="preserve"> </w:t>
       </w:r>
       <w:r>
-        <w:t xml:space="preserve">A competitor would need to copy all of them at once to catch up. That means rebuilding the safeguarding logic without access to it. It means waiting several academic years to collect a comparable verified dataset. And it means displacing DEQUAD at universities where it is already embedded in the safeguarding process, and possibly working around a patent. That is a far higher bar than copying an email-domain check.</w:t>
+        <w:t xml:space="preserve">A competitor would need to copy all of them at once to catch up. That means rebuilding the safeguarding logic without access to it. It means waiting several academic years to collect a comparable verified dataset. And it means displacing DEQUAD at universities where it is already embedded in the safeguarding process, and, from Year 4, possibly working around a patent. That is a far higher bar than copying an email-domain check.</w:t>
       </w:r>
     </w:p>
     <w:p>
@@ -9741,7 +9748,7 @@
               <w:jc w:val="left"/>
             </w:pPr>
             <w:r>
-              <w:t xml:space="preserve">No patent filed yet: a patent attorney has assessed the invention as borderline-patentable, with exploration planned for Year 3, only once the pilot has converted into a paying university. No exclusivity agreed yet (Section 3.4)</w:t>
+              <w:t xml:space="preserve">No patent filed yet: a patent attorney has assessed the invention as borderline-patentable, with exploration planned only after the three-year endorsement period and a successful university conversion. No exclusivity agreed yet (Section 3.4)</w:t>
             </w:r>
           </w:p>
         </w:tc>
@@ -10152,7 +10159,7 @@
               <w:jc w:val="left"/>
             </w:pPr>
             <w:r>
-              <w:t xml:space="preserve">Barriers in Section 3.4: server-side trade secrets and IP-assignment deeds, a growing proprietary verified dataset, preferred-supplier terms sought in the LOI and licences, patent exploration in Year 3 with Panoramix IP (consulted via the CIPA IP Clinic, Apr 2026), once the pilot has converted into a paying university, and a UK trademark; plus positioning DEQUAD as complementary to clinical incumbents</w:t>
+              <w:t xml:space="preserve">Barriers in Section 3.4: server-side trade secrets and IP-assignment deeds, a growing proprietary verified dataset, preferred-supplier terms sought in the LOI and licences, patent exploration with Panoramix IP (consulted via the CIPA IP Clinic, Apr 2026) after the three-year endorsement period and a successful university conversion, and a UK trademark; plus positioning DEQUAD as complementary to clinical incumbents</w:t>
             </w:r>
           </w:p>
         </w:tc>
@@ -11134,7 +11141,7 @@
               <w:jc w:val="right"/>
             </w:pPr>
             <w:r>
-              <w:t xml:space="preserve">(£37,576)</w:t>
+              <w:t xml:space="preserve">(£34,226)</w:t>
             </w:r>
           </w:p>
         </w:tc>
@@ -11184,7 +11191,7 @@
               <w:jc w:val="right"/>
             </w:pPr>
             <w:r>
-              <w:t xml:space="preserve">£19,700</w:t>
+              <w:t xml:space="preserve">£23,050</w:t>
             </w:r>
           </w:p>
         </w:tc>
@@ -15235,19 +15242,19 @@
               <w:jc w:val="right"/>
             </w:pPr>
             <w:r>
-              <w:t xml:space="preserve">(£12,071)</w:t>
-            </w:r>
-          </w:p>
-        </w:tc>
-        <w:tc>
-          <w:tcPr/>
-          <w:p>
-            <w:pPr>
-              <w:pStyle w:val="Compact"/>
-              <w:jc w:val="right"/>
-            </w:pPr>
-            <w:r>
-              <w:t xml:space="preserve">(£20,932)</w:t>
+              <w:t xml:space="preserve">(£8,721)</w:t>
+            </w:r>
+          </w:p>
+        </w:tc>
+        <w:tc>
+          <w:tcPr/>
+          <w:p>
+            <w:pPr>
+              <w:pStyle w:val="Compact"/>
+              <w:jc w:val="right"/>
+            </w:pPr>
+            <w:r>
+              <w:t xml:space="preserve">(£17,582)</w:t>
             </w:r>
           </w:p>
         </w:tc>
@@ -15437,23 +15444,23 @@
                 <w:bCs/>
                 <w:b/>
               </w:rPr>
-              <w:t xml:space="preserve">(£57,568)</w:t>
-            </w:r>
-          </w:p>
-        </w:tc>
-        <w:tc>
-          <w:tcPr/>
-          <w:p>
-            <w:pPr>
-              <w:pStyle w:val="Compact"/>
-              <w:jc w:val="right"/>
-            </w:pPr>
-            <w:r>
-              <w:rPr>
-                <w:bCs/>
-                <w:b/>
-              </w:rPr>
-              <w:t xml:space="preserve">(£76,789)</w:t>
+              <w:t xml:space="preserve">(£54,218)</w:t>
+            </w:r>
+          </w:p>
+        </w:tc>
+        <w:tc>
+          <w:tcPr/>
+          <w:p>
+            <w:pPr>
+              <w:pStyle w:val="Compact"/>
+              <w:jc w:val="right"/>
+            </w:pPr>
+            <w:r>
+              <w:rPr>
+                <w:bCs/>
+                <w:b/>
+              </w:rPr>
+              <w:t xml:space="preserve">(£73,439)</w:t>
             </w:r>
           </w:p>
         </w:tc>
@@ -15519,23 +15526,23 @@
                 <w:bCs/>
                 <w:b/>
               </w:rPr>
-              <w:t xml:space="preserve">£2,740</w:t>
-            </w:r>
-          </w:p>
-        </w:tc>
-        <w:tc>
-          <w:tcPr/>
-          <w:p>
-            <w:pPr>
-              <w:pStyle w:val="Compact"/>
-              <w:jc w:val="right"/>
-            </w:pPr>
-            <w:r>
-              <w:rPr>
-                <w:bCs/>
-                <w:b/>
-              </w:rPr>
-              <w:t xml:space="preserve">£18,866</w:t>
+              <w:t xml:space="preserve">£6,090</w:t>
+            </w:r>
+          </w:p>
+        </w:tc>
+        <w:tc>
+          <w:tcPr/>
+          <w:p>
+            <w:pPr>
+              <w:pStyle w:val="Compact"/>
+              <w:jc w:val="right"/>
+            </w:pPr>
+            <w:r>
+              <w:rPr>
+                <w:bCs/>
+                <w:b/>
+              </w:rPr>
+              <w:t xml:space="preserve">£22,216</w:t>
             </w:r>
           </w:p>
         </w:tc>
@@ -15601,23 +15608,23 @@
                 <w:bCs/>
                 <w:b/>
               </w:rPr>
-              <w:t xml:space="preserve">£21,866</w:t>
-            </w:r>
-          </w:p>
-        </w:tc>
-        <w:tc>
-          <w:tcPr/>
-          <w:p>
-            <w:pPr>
-              <w:pStyle w:val="Compact"/>
-              <w:jc w:val="right"/>
-            </w:pPr>
-            <w:r>
-              <w:rPr>
-                <w:bCs/>
-                <w:b/>
-              </w:rPr>
-              <w:t xml:space="preserve">£21,866</w:t>
+              <w:t xml:space="preserve">£25,216</w:t>
+            </w:r>
+          </w:p>
+        </w:tc>
+        <w:tc>
+          <w:tcPr/>
+          <w:p>
+            <w:pPr>
+              <w:pStyle w:val="Compact"/>
+              <w:jc w:val="right"/>
+            </w:pPr>
+            <w:r>
+              <w:rPr>
+                <w:bCs/>
+                <w:b/>
+              </w:rPr>
+              <w:t xml:space="preserve">£25,216</w:t>
             </w:r>
           </w:p>
         </w:tc>
@@ -20458,31 +20465,31 @@
               <w:jc w:val="right"/>
             </w:pPr>
             <w:r>
-              <w:t xml:space="preserve">£32,238</w:t>
-            </w:r>
-          </w:p>
-        </w:tc>
-        <w:tc>
-          <w:tcPr/>
-          <w:p>
-            <w:pPr>
-              <w:pStyle w:val="Compact"/>
-              <w:jc w:val="right"/>
-            </w:pPr>
-            <w:r>
-              <w:t xml:space="preserve">£28,528</w:t>
-            </w:r>
-          </w:p>
-        </w:tc>
-        <w:tc>
-          <w:tcPr/>
-          <w:p>
-            <w:pPr>
-              <w:pStyle w:val="Compact"/>
-              <w:jc w:val="right"/>
-            </w:pPr>
-            <w:r>
-              <w:t xml:space="preserve">£25,516</w:t>
+              <w:t xml:space="preserve">£35,588</w:t>
+            </w:r>
+          </w:p>
+        </w:tc>
+        <w:tc>
+          <w:tcPr/>
+          <w:p>
+            <w:pPr>
+              <w:pStyle w:val="Compact"/>
+              <w:jc w:val="right"/>
+            </w:pPr>
+            <w:r>
+              <w:t xml:space="preserve">£31,878</w:t>
+            </w:r>
+          </w:p>
+        </w:tc>
+        <w:tc>
+          <w:tcPr/>
+          <w:p>
+            <w:pPr>
+              <w:pStyle w:val="Compact"/>
+              <w:jc w:val="right"/>
+            </w:pPr>
+            <w:r>
+              <w:t xml:space="preserve">£28,866</w:t>
             </w:r>
           </w:p>
         </w:tc>
@@ -21518,7 +21525,7 @@
               <w:jc w:val="right"/>
             </w:pPr>
             <w:r>
-              <w:t xml:space="preserve">(£4,318)</w:t>
+              <w:t xml:space="preserve">(£968)</w:t>
             </w:r>
           </w:p>
         </w:tc>
@@ -21566,7 +21573,7 @@
               <w:jc w:val="right"/>
             </w:pPr>
             <w:r>
-              <w:t xml:space="preserve">(£12,071)</w:t>
+              <w:t xml:space="preserve">(£8,721)</w:t>
             </w:r>
           </w:p>
         </w:tc>
@@ -22068,7 +22075,7 @@
                 <w:bCs/>
                 <w:b/>
               </w:rPr>
-              <w:t xml:space="preserve">(£6,840)</w:t>
+              <w:t xml:space="preserve">(£3,490)</w:t>
             </w:r>
           </w:p>
         </w:tc>
@@ -22132,7 +22139,7 @@
                 <w:bCs/>
                 <w:b/>
               </w:rPr>
-              <w:t xml:space="preserve">£2,740</w:t>
+              <w:t xml:space="preserve">£6,090</w:t>
             </w:r>
           </w:p>
         </w:tc>
@@ -22294,55 +22301,55 @@
                 <w:bCs/>
                 <w:b/>
               </w:rPr>
-              <w:t xml:space="preserve">£32,238</w:t>
-            </w:r>
-          </w:p>
-        </w:tc>
-        <w:tc>
-          <w:tcPr/>
-          <w:p>
-            <w:pPr>
-              <w:pStyle w:val="Compact"/>
-              <w:jc w:val="right"/>
-            </w:pPr>
-            <w:r>
-              <w:rPr>
-                <w:bCs/>
-                <w:b/>
-              </w:rPr>
-              <w:t xml:space="preserve">£28,528</w:t>
-            </w:r>
-          </w:p>
-        </w:tc>
-        <w:tc>
-          <w:tcPr/>
-          <w:p>
-            <w:pPr>
-              <w:pStyle w:val="Compact"/>
-              <w:jc w:val="right"/>
-            </w:pPr>
-            <w:r>
-              <w:rPr>
-                <w:bCs/>
-                <w:b/>
-              </w:rPr>
-              <w:t xml:space="preserve">£25,516</w:t>
-            </w:r>
-          </w:p>
-        </w:tc>
-        <w:tc>
-          <w:tcPr/>
-          <w:p>
-            <w:pPr>
-              <w:pStyle w:val="Compact"/>
-              <w:jc w:val="right"/>
-            </w:pPr>
-            <w:r>
-              <w:rPr>
-                <w:bCs/>
-                <w:b/>
-              </w:rPr>
-              <w:t xml:space="preserve">£21,866</w:t>
+              <w:t xml:space="preserve">£35,588</w:t>
+            </w:r>
+          </w:p>
+        </w:tc>
+        <w:tc>
+          <w:tcPr/>
+          <w:p>
+            <w:pPr>
+              <w:pStyle w:val="Compact"/>
+              <w:jc w:val="right"/>
+            </w:pPr>
+            <w:r>
+              <w:rPr>
+                <w:bCs/>
+                <w:b/>
+              </w:rPr>
+              <w:t xml:space="preserve">£31,878</w:t>
+            </w:r>
+          </w:p>
+        </w:tc>
+        <w:tc>
+          <w:tcPr/>
+          <w:p>
+            <w:pPr>
+              <w:pStyle w:val="Compact"/>
+              <w:jc w:val="right"/>
+            </w:pPr>
+            <w:r>
+              <w:rPr>
+                <w:bCs/>
+                <w:b/>
+              </w:rPr>
+              <w:t xml:space="preserve">£28,866</w:t>
+            </w:r>
+          </w:p>
+        </w:tc>
+        <w:tc>
+          <w:tcPr/>
+          <w:p>
+            <w:pPr>
+              <w:pStyle w:val="Compact"/>
+              <w:jc w:val="right"/>
+            </w:pPr>
+            <w:r>
+              <w:rPr>
+                <w:bCs/>
+                <w:b/>
+              </w:rPr>
+              <w:t xml:space="preserve">£25,216</w:t>
             </w:r>
           </w:p>
         </w:tc>
@@ -22395,7 +22402,7 @@
         <w:t xml:space="preserve"> </w:t>
       </w:r>
       <w:r>
-        <w:t xml:space="preserve">the £11,000 investment depend on it. If the pilot does not lead to a letter of intent, the founder moves the business into survival mode. Overheads stay at Year 1 levels and work stays remote. Marketing is cut to a tenth of the Year 1 budget (organic and ambassador-led only). Costs that only matter for selling to universities (Cyber Essentials, trademark, equipment, patent work) are dropped, and there is no founder pay and no hiring.</w:t>
+        <w:t xml:space="preserve">the £11,000 investment depend on it. If the pilot does not lead to a letter of intent, the founder moves the business into survival mode. Overheads stay at Year 1 levels and work stays remote. Marketing is cut to a tenth of the Year 1 budget (organic and ambassador-led only). Costs that only matter for selling to universities (Cyber Essentials, trademark, equipment) are dropped, and there is no founder pay and no hiring.</w:t>
       </w:r>
     </w:p>
     <w:p>
@@ -23230,7 +23237,7 @@
               <w:jc w:val="left"/>
             </w:pPr>
             <w:r>
-              <w:t xml:space="preserve">Legal &amp; IP protection (contracts, patent search, UK patent filing)</w:t>
+              <w:t xml:space="preserve">Legal (licence contracts)</w:t>
             </w:r>
           </w:p>
         </w:tc>
@@ -23266,19 +23273,19 @@
               <w:jc w:val="right"/>
             </w:pPr>
             <w:r>
-              <w:t xml:space="preserve">(£3,750)</w:t>
-            </w:r>
-          </w:p>
-        </w:tc>
-        <w:tc>
-          <w:tcPr/>
-          <w:p>
-            <w:pPr>
-              <w:pStyle w:val="Compact"/>
-              <w:jc w:val="right"/>
-            </w:pPr>
-            <w:r>
-              <w:t xml:space="preserve">(£4,650)</w:t>
+              <w:t xml:space="preserve">(£400)</w:t>
+            </w:r>
+          </w:p>
+        </w:tc>
+        <w:tc>
+          <w:tcPr/>
+          <w:p>
+            <w:pPr>
+              <w:pStyle w:val="Compact"/>
+              <w:jc w:val="right"/>
+            </w:pPr>
+            <w:r>
+              <w:t xml:space="preserve">(£1,300)</w:t>
             </w:r>
           </w:p>
         </w:tc>
@@ -23592,23 +23599,23 @@
                 <w:bCs/>
                 <w:b/>
               </w:rPr>
-              <w:t xml:space="preserve">(£49,906)</w:t>
-            </w:r>
-          </w:p>
-        </w:tc>
-        <w:tc>
-          <w:tcPr/>
-          <w:p>
-            <w:pPr>
-              <w:pStyle w:val="Compact"/>
-              <w:jc w:val="right"/>
-            </w:pPr>
-            <w:r>
-              <w:rPr>
-                <w:bCs/>
-                <w:b/>
-              </w:rPr>
-              <w:t xml:space="preserve">(£63,767)</w:t>
+              <w:t xml:space="preserve">(£46,556)</w:t>
+            </w:r>
+          </w:p>
+        </w:tc>
+        <w:tc>
+          <w:tcPr/>
+          <w:p>
+            <w:pPr>
+              <w:pStyle w:val="Compact"/>
+              <w:jc w:val="right"/>
+            </w:pPr>
+            <w:r>
+              <w:rPr>
+                <w:bCs/>
+                <w:b/>
+              </w:rPr>
+              <w:t xml:space="preserve">(£60,417)</w:t>
             </w:r>
           </w:p>
         </w:tc>
@@ -23674,23 +23681,23 @@
                 <w:bCs/>
                 <w:b/>
               </w:rPr>
-              <w:t xml:space="preserve">(£1,403)</w:t>
-            </w:r>
-          </w:p>
-        </w:tc>
-        <w:tc>
-          <w:tcPr/>
-          <w:p>
-            <w:pPr>
-              <w:pStyle w:val="Compact"/>
-              <w:jc w:val="right"/>
-            </w:pPr>
-            <w:r>
-              <w:rPr>
-                <w:bCs/>
-                <w:b/>
-              </w:rPr>
-              <w:t xml:space="preserve">£3,556</w:t>
+              <w:t xml:space="preserve">£1,947</w:t>
+            </w:r>
+          </w:p>
+        </w:tc>
+        <w:tc>
+          <w:tcPr/>
+          <w:p>
+            <w:pPr>
+              <w:pStyle w:val="Compact"/>
+              <w:jc w:val="right"/>
+            </w:pPr>
+            <w:r>
+              <w:rPr>
+                <w:bCs/>
+                <w:b/>
+              </w:rPr>
+              <w:t xml:space="preserve">£6,906</w:t>
             </w:r>
           </w:p>
         </w:tc>
@@ -23818,23 +23825,23 @@
                 <w:bCs/>
                 <w:b/>
               </w:rPr>
-              <w:t xml:space="preserve">(£2,270)</w:t>
-            </w:r>
-          </w:p>
-        </w:tc>
-        <w:tc>
-          <w:tcPr/>
-          <w:p>
-            <w:pPr>
-              <w:pStyle w:val="Compact"/>
-              <w:jc w:val="right"/>
-            </w:pPr>
-            <w:r>
-              <w:rPr>
-                <w:bCs/>
-                <w:b/>
-              </w:rPr>
-              <w:t xml:space="preserve">£2,181</w:t>
+              <w:t xml:space="preserve">£1,080</w:t>
+            </w:r>
+          </w:p>
+        </w:tc>
+        <w:tc>
+          <w:tcPr/>
+          <w:p>
+            <w:pPr>
+              <w:pStyle w:val="Compact"/>
+              <w:jc w:val="right"/>
+            </w:pPr>
+            <w:r>
+              <w:rPr>
+                <w:bCs/>
+                <w:b/>
+              </w:rPr>
+              <w:t xml:space="preserve">£5,531</w:t>
             </w:r>
           </w:p>
         </w:tc>
@@ -23884,19 +23891,19 @@
               <w:jc w:val="right"/>
             </w:pPr>
             <w:r>
-              <w:t xml:space="preserve">–</w:t>
-            </w:r>
-          </w:p>
-        </w:tc>
-        <w:tc>
-          <w:tcPr/>
-          <w:p>
-            <w:pPr>
-              <w:pStyle w:val="Compact"/>
-              <w:jc w:val="right"/>
-            </w:pPr>
-            <w:r>
-              <w:t xml:space="preserve">(£657)</w:t>
+              <w:t xml:space="preserve">(£142)</w:t>
+            </w:r>
+          </w:p>
+        </w:tc>
+        <w:tc>
+          <w:tcPr/>
+          <w:p>
+            <w:pPr>
+              <w:pStyle w:val="Compact"/>
+              <w:jc w:val="right"/>
+            </w:pPr>
+            <w:r>
+              <w:t xml:space="preserve">(£799)</w:t>
             </w:r>
           </w:p>
         </w:tc>
@@ -23962,23 +23969,23 @@
                 <w:bCs/>
                 <w:b/>
               </w:rPr>
-              <w:t xml:space="preserve">(£2,270)</w:t>
-            </w:r>
-          </w:p>
-        </w:tc>
-        <w:tc>
-          <w:tcPr/>
-          <w:p>
-            <w:pPr>
-              <w:pStyle w:val="Compact"/>
-              <w:jc w:val="right"/>
-            </w:pPr>
-            <w:r>
-              <w:rPr>
-                <w:bCs/>
-                <w:b/>
-              </w:rPr>
-              <w:t xml:space="preserve">£1,524</w:t>
+              <w:t xml:space="preserve">£938</w:t>
+            </w:r>
+          </w:p>
+        </w:tc>
+        <w:tc>
+          <w:tcPr/>
+          <w:p>
+            <w:pPr>
+              <w:pStyle w:val="Compact"/>
+              <w:jc w:val="right"/>
+            </w:pPr>
+            <w:r>
+              <w:rPr>
+                <w:bCs/>
+                <w:b/>
+              </w:rPr>
+              <w:t xml:space="preserve">£4,732</w:t>
             </w:r>
           </w:p>
         </w:tc>
@@ -24028,7 +24035,7 @@
               <w:jc w:val="right"/>
             </w:pPr>
             <w:r>
-              <w:t xml:space="preserve">-4.2%</w:t>
+              <w:t xml:space="preserve">1.7%</w:t>
             </w:r>
           </w:p>
         </w:tc>
@@ -24394,7 +24401,7 @@
               <w:jc w:val="right"/>
             </w:pPr>
             <w:r>
-              <w:t xml:space="preserve">(£2,270)</w:t>
+              <w:t xml:space="preserve">£1,080</w:t>
             </w:r>
           </w:p>
         </w:tc>
@@ -24430,19 +24437,7 @@
               <w:jc w:val="right"/>
             </w:pPr>
             <w:r>
-              <w:t xml:space="preserve">(£2,603)</w:t>
-            </w:r>
-          </w:p>
-        </w:tc>
-        <w:tc>
-          <w:tcPr/>
-          <w:p>
-            <w:pPr>
-              <w:pStyle w:val="Compact"/>
-              <w:jc w:val="right"/>
-            </w:pPr>
-            <w:r>
-              <w:t xml:space="preserve">£2,603</w:t>
+              <w:t xml:space="preserve">£747</w:t>
             </w:r>
           </w:p>
         </w:tc>
@@ -24455,6 +24450,18 @@
             </w:pPr>
             <w:r>
               <w:t xml:space="preserve">–</w:t>
+            </w:r>
+          </w:p>
+        </w:tc>
+        <w:tc>
+          <w:tcPr/>
+          <w:p>
+            <w:pPr>
+              <w:pStyle w:val="Compact"/>
+              <w:jc w:val="right"/>
+            </w:pPr>
+            <w:r>
+              <w:t xml:space="preserve">£142</w:t>
             </w:r>
           </w:p>
         </w:tc>
@@ -24495,7 +24502,7 @@
         <w:t xml:space="preserve"> </w:t>
       </w:r>
       <w:r>
-        <w:t xml:space="preserve">Year 1 is a deliberate investment year, with a loss of (£4,803) funded from the equity raised. Year 2 turns profitable (£8,597 after tax) on the first licence and a cost base still carried by an unpaid founder. In Year 3 the company starts paying the founder, makes its first two part-time hires and, because the first university has by then been acquired, invests £3,350 in a UK patent application (if the attorney’s assessment is positive). The after-tax result is (£2,270): a small loss caused entirely by the one-off patent cost. Without it, Year 3 would be profitable, and cash is unaffected in any way that matters. Profit is not the aim in the early years; showing that the company can pay for its own team from revenue is.</w:t>
+        <w:t xml:space="preserve">Year 1 is a deliberate investment year, with a loss of (£4,803) funded from the equity raised. Year 2 turns profitable (£8,597 after tax) on the first licence and a cost base still carried by an unpaid founder. In Year 3 the company starts paying the founder and makes its first two part-time hires, and still makes a profit (£938 after tax). Patent costs fall after the three-year plan (Section 3.4). Profit is not the aim in the early years; showing that the company can pay for its own team from revenue is.</w:t>
       </w:r>
     </w:p>
     <w:p>
@@ -24892,7 +24899,7 @@
               <w:jc w:val="right"/>
             </w:pPr>
             <w:r>
-              <w:t xml:space="preserve">£21,866</w:t>
+              <w:t xml:space="preserve">£25,216</w:t>
             </w:r>
           </w:p>
         </w:tc>
@@ -24958,7 +24965,7 @@
                 <w:bCs/>
                 <w:b/>
               </w:rPr>
-              <w:t xml:space="preserve">£43,191</w:t>
+              <w:t xml:space="preserve">£46,541</w:t>
             </w:r>
           </w:p>
         </w:tc>
@@ -25058,44 +25065,44 @@
               <w:jc w:val="right"/>
             </w:pPr>
             <w:r>
+              <w:t xml:space="preserve">(£142)</w:t>
+            </w:r>
+          </w:p>
+        </w:tc>
+      </w:tr>
+      <w:tr>
+        <w:tc>
+          <w:tcPr/>
+          <w:p>
+            <w:pPr>
+              <w:pStyle w:val="Compact"/>
+              <w:jc w:val="left"/>
+            </w:pPr>
+            <w:r>
+              <w:rPr>
+                <w:bCs/>
+                <w:b/>
+              </w:rPr>
+              <w:t xml:space="preserve">Total liabilities</w:t>
+            </w:r>
+          </w:p>
+        </w:tc>
+        <w:tc>
+          <w:tcPr/>
+          <w:p>
+            <w:pPr>
+              <w:pStyle w:val="Compact"/>
+              <w:jc w:val="right"/>
+            </w:pPr>
+            <w:r>
+              <w:rPr>
+                <w:bCs/>
+                <w:b/>
+              </w:rPr>
               <w:t xml:space="preserve">–</w:t>
             </w:r>
           </w:p>
         </w:tc>
-      </w:tr>
-      <w:tr>
-        <w:tc>
-          <w:tcPr/>
-          <w:p>
-            <w:pPr>
-              <w:pStyle w:val="Compact"/>
-              <w:jc w:val="left"/>
-            </w:pPr>
-            <w:r>
-              <w:rPr>
-                <w:bCs/>
-                <w:b/>
-              </w:rPr>
-              <w:t xml:space="preserve">Total liabilities</w:t>
-            </w:r>
-          </w:p>
-        </w:tc>
-        <w:tc>
-          <w:tcPr/>
-          <w:p>
-            <w:pPr>
-              <w:pStyle w:val="Compact"/>
-              <w:jc w:val="right"/>
-            </w:pPr>
-            <w:r>
-              <w:rPr>
-                <w:bCs/>
-                <w:b/>
-              </w:rPr>
-              <w:t xml:space="preserve">–</w:t>
-            </w:r>
-          </w:p>
-        </w:tc>
         <w:tc>
           <w:tcPr/>
           <w:p>
@@ -25124,7 +25131,7 @@
                 <w:bCs/>
                 <w:b/>
               </w:rPr>
-              <w:t xml:space="preserve">(£27,667)</w:t>
+              <w:t xml:space="preserve">(£27,809)</w:t>
             </w:r>
           </w:p>
         </w:tc>
@@ -25190,7 +25197,7 @@
                 <w:bCs/>
                 <w:b/>
               </w:rPr>
-              <w:t xml:space="preserve">£15,524</w:t>
+              <w:t xml:space="preserve">£18,732</w:t>
             </w:r>
           </w:p>
         </w:tc>
@@ -25290,7 +25297,7 @@
               <w:jc w:val="right"/>
             </w:pPr>
             <w:r>
-              <w:t xml:space="preserve">£1,524</w:t>
+              <w:t xml:space="preserve">£4,732</w:t>
             </w:r>
           </w:p>
         </w:tc>
@@ -25356,7 +25363,7 @@
                 <w:bCs/>
                 <w:b/>
               </w:rPr>
-              <w:t xml:space="preserve">£15,524</w:t>
+              <w:t xml:space="preserve">£18,732</w:t>
             </w:r>
           </w:p>
         </w:tc>
@@ -31367,7 +31374,7 @@
               <w:jc w:val="left"/>
             </w:pPr>
             <w:r>
-              <w:t xml:space="preserve">Legal &amp; IP protection (contracts, patent search, UK patent filing)</w:t>
+              <w:t xml:space="preserve">Legal (licence contracts)</w:t>
             </w:r>
           </w:p>
         </w:tc>
@@ -31403,19 +31410,19 @@
               <w:jc w:val="right"/>
             </w:pPr>
             <w:r>
-              <w:t xml:space="preserve">(£3,750)</w:t>
-            </w:r>
-          </w:p>
-        </w:tc>
-        <w:tc>
-          <w:tcPr/>
-          <w:p>
-            <w:pPr>
-              <w:pStyle w:val="Compact"/>
-              <w:jc w:val="right"/>
-            </w:pPr>
-            <w:r>
-              <w:t xml:space="preserve">(£4,650)</w:t>
+              <w:t xml:space="preserve">(£400)</w:t>
+            </w:r>
+          </w:p>
+        </w:tc>
+        <w:tc>
+          <w:tcPr/>
+          <w:p>
+            <w:pPr>
+              <w:pStyle w:val="Compact"/>
+              <w:jc w:val="right"/>
+            </w:pPr>
+            <w:r>
+              <w:t xml:space="preserve">(£1,300)</w:t>
             </w:r>
           </w:p>
         </w:tc>
@@ -31729,23 +31736,23 @@
                 <w:bCs/>
                 <w:b/>
               </w:rPr>
-              <w:t xml:space="preserve">(£172,269)</w:t>
-            </w:r>
-          </w:p>
-        </w:tc>
-        <w:tc>
-          <w:tcPr/>
-          <w:p>
-            <w:pPr>
-              <w:pStyle w:val="Compact"/>
-              <w:jc w:val="right"/>
-            </w:pPr>
-            <w:r>
-              <w:rPr>
-                <w:bCs/>
-                <w:b/>
-              </w:rPr>
-              <w:t xml:space="preserve">(£187,880)</w:t>
+              <w:t xml:space="preserve">(£168,919)</w:t>
+            </w:r>
+          </w:p>
+        </w:tc>
+        <w:tc>
+          <w:tcPr/>
+          <w:p>
+            <w:pPr>
+              <w:pStyle w:val="Compact"/>
+              <w:jc w:val="right"/>
+            </w:pPr>
+            <w:r>
+              <w:rPr>
+                <w:bCs/>
+                <w:b/>
+              </w:rPr>
+              <w:t xml:space="preserve">(£184,530)</w:t>
             </w:r>
           </w:p>
         </w:tc>
@@ -31811,23 +31818,23 @@
                 <w:bCs/>
                 <w:b/>
               </w:rPr>
-              <w:t xml:space="preserve">(£35,850)</w:t>
-            </w:r>
-          </w:p>
-        </w:tc>
-        <w:tc>
-          <w:tcPr/>
-          <w:p>
-            <w:pPr>
-              <w:pStyle w:val="Compact"/>
-              <w:jc w:val="right"/>
-            </w:pPr>
-            <w:r>
-              <w:rPr>
-                <w:bCs/>
-                <w:b/>
-              </w:rPr>
-              <w:t xml:space="preserve">(£19,371)</w:t>
+              <w:t xml:space="preserve">(£32,500)</w:t>
+            </w:r>
+          </w:p>
+        </w:tc>
+        <w:tc>
+          <w:tcPr/>
+          <w:p>
+            <w:pPr>
+              <w:pStyle w:val="Compact"/>
+              <w:jc w:val="right"/>
+            </w:pPr>
+            <w:r>
+              <w:rPr>
+                <w:bCs/>
+                <w:b/>
+              </w:rPr>
+              <w:t xml:space="preserve">(£16,021)</w:t>
             </w:r>
           </w:p>
         </w:tc>
@@ -31955,23 +31962,23 @@
                 <w:bCs/>
                 <w:b/>
               </w:rPr>
-              <w:t xml:space="preserve">(£37,576)</w:t>
-            </w:r>
-          </w:p>
-        </w:tc>
-        <w:tc>
-          <w:tcPr/>
-          <w:p>
-            <w:pPr>
-              <w:pStyle w:val="Compact"/>
-              <w:jc w:val="right"/>
-            </w:pPr>
-            <w:r>
-              <w:rPr>
-                <w:bCs/>
-                <w:b/>
-              </w:rPr>
-              <w:t xml:space="preserve">(£21,605)</w:t>
+              <w:t xml:space="preserve">(£34,226)</w:t>
+            </w:r>
+          </w:p>
+        </w:tc>
+        <w:tc>
+          <w:tcPr/>
+          <w:p>
+            <w:pPr>
+              <w:pStyle w:val="Compact"/>
+              <w:jc w:val="right"/>
+            </w:pPr>
+            <w:r>
+              <w:rPr>
+                <w:bCs/>
+                <w:b/>
+              </w:rPr>
+              <w:t xml:space="preserve">(£18,255)</w:t>
             </w:r>
           </w:p>
         </w:tc>
@@ -32099,23 +32106,23 @@
                 <w:bCs/>
                 <w:b/>
               </w:rPr>
-              <w:t xml:space="preserve">(£37,576)</w:t>
-            </w:r>
-          </w:p>
-        </w:tc>
-        <w:tc>
-          <w:tcPr/>
-          <w:p>
-            <w:pPr>
-              <w:pStyle w:val="Compact"/>
-              <w:jc w:val="right"/>
-            </w:pPr>
-            <w:r>
-              <w:rPr>
-                <w:bCs/>
-                <w:b/>
-              </w:rPr>
-              <w:t xml:space="preserve">(£24,451)</w:t>
+              <w:t xml:space="preserve">(£34,226)</w:t>
+            </w:r>
+          </w:p>
+        </w:tc>
+        <w:tc>
+          <w:tcPr/>
+          <w:p>
+            <w:pPr>
+              <w:pStyle w:val="Compact"/>
+              <w:jc w:val="right"/>
+            </w:pPr>
+            <w:r>
+              <w:rPr>
+                <w:bCs/>
+                <w:b/>
+              </w:rPr>
+              <w:t xml:space="preserve">(£21,101)</w:t>
             </w:r>
           </w:p>
         </w:tc>
@@ -32165,7 +32172,7 @@
               <w:jc w:val="right"/>
             </w:pPr>
             <w:r>
-              <w:t xml:space="preserve">-25.2%</w:t>
+              <w:t xml:space="preserve">-22.9%</w:t>
             </w:r>
           </w:p>
         </w:tc>
@@ -32825,19 +32832,19 @@
               <w:jc w:val="right"/>
             </w:pPr>
             <w:r>
-              <w:t xml:space="preserve">(£17,351)</w:t>
-            </w:r>
-          </w:p>
-        </w:tc>
-        <w:tc>
-          <w:tcPr/>
-          <w:p>
-            <w:pPr>
-              <w:pStyle w:val="Compact"/>
-              <w:jc w:val="right"/>
-            </w:pPr>
-            <w:r>
-              <w:t xml:space="preserve">(£26,212)</w:t>
+              <w:t xml:space="preserve">(£14,001)</w:t>
+            </w:r>
+          </w:p>
+        </w:tc>
+        <w:tc>
+          <w:tcPr/>
+          <w:p>
+            <w:pPr>
+              <w:pStyle w:val="Compact"/>
+              <w:jc w:val="right"/>
+            </w:pPr>
+            <w:r>
+              <w:t xml:space="preserve">(£22,862)</w:t>
             </w:r>
           </w:p>
         </w:tc>
@@ -33027,23 +33034,23 @@
                 <w:bCs/>
                 <w:b/>
               </w:rPr>
-              <w:t xml:space="preserve">(£191,747)</w:t>
-            </w:r>
-          </w:p>
-        </w:tc>
-        <w:tc>
-          <w:tcPr/>
-          <w:p>
-            <w:pPr>
-              <w:pStyle w:val="Compact"/>
-              <w:jc w:val="right"/>
-            </w:pPr>
-            <w:r>
-              <w:rPr>
-                <w:bCs/>
-                <w:b/>
-              </w:rPr>
-              <w:t xml:space="preserve">(£214,100)</w:t>
+              <w:t xml:space="preserve">(£188,397)</w:t>
+            </w:r>
+          </w:p>
+        </w:tc>
+        <w:tc>
+          <w:tcPr/>
+          <w:p>
+            <w:pPr>
+              <w:pStyle w:val="Compact"/>
+              <w:jc w:val="right"/>
+            </w:pPr>
+            <w:r>
+              <w:rPr>
+                <w:bCs/>
+                <w:b/>
+              </w:rPr>
+              <w:t xml:space="preserve">(£210,750)</w:t>
             </w:r>
           </w:p>
         </w:tc>
@@ -33109,23 +33116,23 @@
                 <w:bCs/>
                 <w:b/>
               </w:rPr>
-              <w:t xml:space="preserve">(£17,612)</w:t>
-            </w:r>
-          </w:p>
-        </w:tc>
-        <w:tc>
-          <w:tcPr/>
-          <w:p>
-            <w:pPr>
-              <w:pStyle w:val="Compact"/>
-              <w:jc w:val="right"/>
-            </w:pPr>
-            <w:r>
-              <w:rPr>
-                <w:bCs/>
-                <w:b/>
-              </w:rPr>
-              <w:t xml:space="preserve">£16,700</w:t>
+              <w:t xml:space="preserve">(£14,262)</w:t>
+            </w:r>
+          </w:p>
+        </w:tc>
+        <w:tc>
+          <w:tcPr/>
+          <w:p>
+            <w:pPr>
+              <w:pStyle w:val="Compact"/>
+              <w:jc w:val="right"/>
+            </w:pPr>
+            <w:r>
+              <w:rPr>
+                <w:bCs/>
+                <w:b/>
+              </w:rPr>
+              <w:t xml:space="preserve">£20,050</w:t>
             </w:r>
           </w:p>
         </w:tc>
@@ -33191,23 +33198,23 @@
                 <w:bCs/>
                 <w:b/>
               </w:rPr>
-              <w:t xml:space="preserve">£19,700</w:t>
-            </w:r>
-          </w:p>
-        </w:tc>
-        <w:tc>
-          <w:tcPr/>
-          <w:p>
-            <w:pPr>
-              <w:pStyle w:val="Compact"/>
-              <w:jc w:val="right"/>
-            </w:pPr>
-            <w:r>
-              <w:rPr>
-                <w:bCs/>
-                <w:b/>
-              </w:rPr>
-              <w:t xml:space="preserve">£19,700</w:t>
+              <w:t xml:space="preserve">£23,050</w:t>
+            </w:r>
+          </w:p>
+        </w:tc>
+        <w:tc>
+          <w:tcPr/>
+          <w:p>
+            <w:pPr>
+              <w:pStyle w:val="Compact"/>
+              <w:jc w:val="right"/>
+            </w:pPr>
+            <w:r>
+              <w:rPr>
+                <w:bCs/>
+                <w:b/>
+              </w:rPr>
+              <w:t xml:space="preserve">£23,050</w:t>
             </w:r>
           </w:p>
         </w:tc>

</xml_diff>

<commit_message>
Business plan v7.0: rewrite as pre-pilot stage plan
Stage-gate roadmap (pre-pilot, pilot, conversion, first licence, post-
endorsement), proposed pilot design and success criteria, pre-pilot
readiness checklist, stage labels on Year 1 cash flow and SWOT.

Co-Authored-By: Claude Opus 5.5 <noreply@anthropic.com>
Claude-Session: https://claude.ai/code/session_0146q3FtAYmgQ1rtNsNNpdiD
</commit_message>
<xml_diff>
--- a/visa_appendices/docx/DEQUAD_UKES_Business_Plan_v6.docx
+++ b/visa_appendices/docx/DEQUAD_UKES_Business_Plan_v6.docx
@@ -2,7 +2,7 @@
 <file path=word/document.xml><?xml version="1.0" encoding="utf-8"?>
 <w:document xmlns:w="http://schemas.openxmlformats.org/wordprocessingml/2006/main" xmlns:m="http://schemas.openxmlformats.org/officeDocument/2006/math" xmlns:r="http://schemas.openxmlformats.org/officeDocument/2006/relationships" xmlns:o="urn:schemas-microsoft-com:office:office" xmlns:v="urn:schemas-microsoft-com:vml" xmlns:w10="urn:schemas-microsoft-com:office:word" xmlns:a="http://schemas.openxmlformats.org/drawingml/2006/main" xmlns:pic="http://schemas.openxmlformats.org/drawingml/2006/picture" xmlns:wp="http://schemas.openxmlformats.org/drawingml/2006/wordprocessingDrawing">
   <w:body>
-    <w:bookmarkStart w:id="89" w:name="dequad"/>
+    <w:bookmarkStart w:id="93" w:name="dequad"/>
     <w:p>
       <w:pPr>
         <w:pStyle w:val="Heading1"/>
@@ -11,13 +11,13 @@
         <w:t xml:space="preserve">DEQUAD</w:t>
       </w:r>
     </w:p>
-    <w:bookmarkStart w:id="21" w:name="X8ba4f8d3d900ae66d2cda7a2000a6ee57e55309"/>
+    <w:bookmarkStart w:id="21" w:name="X770188164901c2c4e68fee93e02994301152f61"/>
     <w:p>
       <w:pPr>
         <w:pStyle w:val="Heading2"/>
       </w:pPr>
       <w:r>
-        <w:t xml:space="preserve">Business Plan — UK Innovator Founder Endorsement</w:t>
+        <w:t xml:space="preserve">Pre-Pilot Stage Business Plan — UK Innovator Founder Endorsement</w:t>
       </w:r>
     </w:p>
     <w:bookmarkStart w:id="20" w:name="submitted-to-uk-endorsing-services-ukes"/>
@@ -60,6 +60,46 @@
                 <w:bCs/>
                 <w:b/>
               </w:rPr>
+              <w:t xml:space="preserve">Stage</w:t>
+            </w:r>
+          </w:p>
+        </w:tc>
+        <w:tc>
+          <w:tcPr/>
+          <w:p>
+            <w:pPr>
+              <w:pStyle w:val="Compact"/>
+              <w:jc w:val="left"/>
+            </w:pPr>
+            <w:r>
+              <w:rPr>
+                <w:bCs/>
+                <w:b/>
+              </w:rPr>
+              <w:t xml:space="preserve">Pre-pilot.</w:t>
+            </w:r>
+            <w:r>
+              <w:t xml:space="preserve"> </w:t>
+            </w:r>
+            <w:r>
+              <w:t xml:space="preserve">Product live; pilot with the University of Bedfordshire under discussion (target Jan–Mar 2027); no paying institution yet</w:t>
+            </w:r>
+          </w:p>
+        </w:tc>
+      </w:tr>
+      <w:tr>
+        <w:tc>
+          <w:tcPr/>
+          <w:p>
+            <w:pPr>
+              <w:pStyle w:val="Compact"/>
+              <w:jc w:val="left"/>
+            </w:pPr>
+            <w:r>
+              <w:rPr>
+                <w:bCs/>
+                <w:b/>
+              </w:rPr>
               <w:t xml:space="preserve">Company</w:t>
             </w:r>
           </w:p>
@@ -361,7 +401,7 @@
               <w:jc w:val="left"/>
             </w:pPr>
             <w:r>
-              <w:t xml:space="preserve">6.0 — October 2026 (supersedes v5.0, August 2026)</w:t>
+              <w:t xml:space="preserve">7.0 — October 2026, pre-pilot edition (supersedes v6.0 and v5.0)</w:t>
             </w:r>
           </w:p>
         </w:tc>
@@ -621,7 +661,7 @@
       </w:r>
     </w:p>
     <w:bookmarkEnd w:id="22"/>
-    <w:bookmarkStart w:id="29" w:name="executive-summary"/>
+    <w:bookmarkStart w:id="30" w:name="executive-summary"/>
     <w:p>
       <w:pPr>
         <w:pStyle w:val="Heading2"/>
@@ -877,13 +917,496 @@
       </w:r>
     </w:p>
     <w:bookmarkEnd w:id="26"/>
-    <w:bookmarkStart w:id="27" w:name="where-the-business-is-today-october-2026"/>
+    <w:bookmarkStart w:id="27" w:name="stage-of-the-business-pre-pilot"/>
     <w:p>
       <w:pPr>
         <w:pStyle w:val="Heading3"/>
       </w:pPr>
       <w:r>
-        <w:t xml:space="preserve">Where the business is today (October 2026)</w:t>
+        <w:t xml:space="preserve">Stage of the business: pre-pilot</w:t>
+      </w:r>
+    </w:p>
+    <w:p>
+      <w:pPr>
+        <w:pStyle w:val="FirstParagraph"/>
+      </w:pPr>
+      <w:r>
+        <w:t xml:space="preserve">DEQUAD is a</w:t>
+      </w:r>
+      <w:r>
+        <w:t xml:space="preserve"> </w:t>
+      </w:r>
+      <w:r>
+        <w:rPr>
+          <w:bCs/>
+          <w:b/>
+        </w:rPr>
+        <w:t xml:space="preserve">pre-pilot</w:t>
+      </w:r>
+      <w:r>
+        <w:t xml:space="preserve"> </w:t>
+      </w:r>
+      <w:r>
+        <w:t xml:space="preserve">business. The product is built and publicly available, and the company and its safeguarding, data-protection and online-safety groundwork are in place.</w:t>
+      </w:r>
+      <w:r>
+        <w:t xml:space="preserve"> </w:t>
+      </w:r>
+      <w:r>
+        <w:rPr>
+          <w:bCs/>
+          <w:b/>
+        </w:rPr>
+        <w:t xml:space="preserve">The next milestone, the one everything else in this plan depends on, is a successful pilot with a university.</w:t>
+      </w:r>
+      <w:r>
+        <w:t xml:space="preserve"> </w:t>
+      </w:r>
+      <w:r>
+        <w:t xml:space="preserve">The plan is organised as a series of stage gates. Each stage has to be passed before money is committed to the next. So spending, investment, hiring and patent work all follow evidence, not hope.</w:t>
+      </w:r>
+    </w:p>
+    <w:tbl>
+      <w:tblPr>
+        <w:tblStyle w:val="Table"/>
+        <w:tblW w:type="pct" w:w="5000"/>
+        <w:tblLook w:firstRow="1" w:lastRow="0" w:firstColumn="0" w:lastColumn="0" w:noHBand="0" w:noVBand="0" w:val="0020"/>
+        <w:jc w:val="start"/>
+      </w:tblPr>
+      <w:tblGrid>
+        <w:gridCol w:w="1584"/>
+        <w:gridCol w:w="1584"/>
+        <w:gridCol w:w="1584"/>
+        <w:gridCol w:w="1584"/>
+        <w:gridCol w:w="1584"/>
+      </w:tblGrid>
+      <w:tr>
+        <w:trPr>
+          <w:tblHeader w:val="true"/>
+        </w:trPr>
+        <w:tc>
+          <w:tcPr/>
+          <w:p>
+            <w:pPr>
+              <w:pStyle w:val="Compact"/>
+              <w:jc w:val="left"/>
+            </w:pPr>
+            <w:r>
+              <w:t xml:space="preserve">Stage</w:t>
+            </w:r>
+          </w:p>
+        </w:tc>
+        <w:tc>
+          <w:tcPr/>
+          <w:p>
+            <w:pPr>
+              <w:pStyle w:val="Compact"/>
+              <w:jc w:val="left"/>
+            </w:pPr>
+            <w:r>
+              <w:t xml:space="preserve">Period</w:t>
+            </w:r>
+          </w:p>
+        </w:tc>
+        <w:tc>
+          <w:tcPr/>
+          <w:p>
+            <w:pPr>
+              <w:pStyle w:val="Compact"/>
+              <w:jc w:val="left"/>
+            </w:pPr>
+            <w:r>
+              <w:t xml:space="preserve">What happens</w:t>
+            </w:r>
+          </w:p>
+        </w:tc>
+        <w:tc>
+          <w:tcPr/>
+          <w:p>
+            <w:pPr>
+              <w:pStyle w:val="Compact"/>
+              <w:jc w:val="left"/>
+            </w:pPr>
+            <w:r>
+              <w:t xml:space="preserve">Gate to pass before the next stage</w:t>
+            </w:r>
+          </w:p>
+        </w:tc>
+        <w:tc>
+          <w:tcPr/>
+          <w:p>
+            <w:pPr>
+              <w:pStyle w:val="Compact"/>
+              <w:jc w:val="left"/>
+            </w:pPr>
+            <w:r>
+              <w:t xml:space="preserve">Funded by</w:t>
+            </w:r>
+          </w:p>
+        </w:tc>
+      </w:tr>
+      <w:tr>
+        <w:tc>
+          <w:tcPr/>
+          <w:p>
+            <w:pPr>
+              <w:pStyle w:val="Compact"/>
+              <w:jc w:val="left"/>
+            </w:pPr>
+            <w:r>
+              <w:rPr>
+                <w:bCs/>
+                <w:b/>
+              </w:rPr>
+              <w:t xml:space="preserve">0. Pre-pilot</w:t>
+            </w:r>
+            <w:r>
+              <w:t xml:space="preserve"> </w:t>
+            </w:r>
+            <w:r>
+              <w:rPr>
+                <w:iCs/>
+                <w:i/>
+              </w:rPr>
+              <w:t xml:space="preserve">(current)</w:t>
+            </w:r>
+          </w:p>
+        </w:tc>
+        <w:tc>
+          <w:tcPr/>
+          <w:p>
+            <w:pPr>
+              <w:pStyle w:val="Compact"/>
+              <w:jc w:val="left"/>
+            </w:pPr>
+            <w:r>
+              <w:t xml:space="preserve">Sep – Dec 2026</w:t>
+            </w:r>
+          </w:p>
+        </w:tc>
+        <w:tc>
+          <w:tcPr/>
+          <w:p>
+            <w:pPr>
+              <w:pStyle w:val="Compact"/>
+              <w:jc w:val="left"/>
+            </w:pPr>
+            <w:r>
+              <w:t xml:space="preserve">Product live on App Store, Google Play and web; pilot terms, data-sharing agreement and evaluation method agreed with the University of Bedfordshire; student launch preparation</w:t>
+            </w:r>
+          </w:p>
+        </w:tc>
+        <w:tc>
+          <w:tcPr/>
+          <w:p>
+            <w:pPr>
+              <w:pStyle w:val="Compact"/>
+              <w:jc w:val="left"/>
+            </w:pPr>
+            <w:r>
+              <w:t xml:space="preserve">Signed pilot agreement and data-sharing agreement</w:t>
+            </w:r>
+          </w:p>
+        </w:tc>
+        <w:tc>
+          <w:tcPr/>
+          <w:p>
+            <w:pPr>
+              <w:pStyle w:val="Compact"/>
+              <w:jc w:val="left"/>
+            </w:pPr>
+            <w:r>
+              <w:t xml:space="preserve">Founder’s £3,000</w:t>
+            </w:r>
+          </w:p>
+        </w:tc>
+      </w:tr>
+      <w:tr>
+        <w:tc>
+          <w:tcPr/>
+          <w:p>
+            <w:pPr>
+              <w:pStyle w:val="Compact"/>
+              <w:jc w:val="left"/>
+            </w:pPr>
+            <w:r>
+              <w:rPr>
+                <w:bCs/>
+                <w:b/>
+              </w:rPr>
+              <w:t xml:space="preserve">1. Pilot</w:t>
+            </w:r>
+          </w:p>
+        </w:tc>
+        <w:tc>
+          <w:tcPr/>
+          <w:p>
+            <w:pPr>
+              <w:pStyle w:val="Compact"/>
+              <w:jc w:val="left"/>
+            </w:pPr>
+            <w:r>
+              <w:t xml:space="preserve">Jan – Mar 2027 (12 weeks, unpaid)</w:t>
+            </w:r>
+          </w:p>
+        </w:tc>
+        <w:tc>
+          <w:tcPr/>
+          <w:p>
+            <w:pPr>
+              <w:pStyle w:val="Compact"/>
+              <w:jc w:val="left"/>
+            </w:pPr>
+            <w:r>
+              <w:t xml:space="preserve">Verified students at the university use DEQUAD; safeguarding alerts routed to the university’s team; fortnightly steering group</w:t>
+            </w:r>
+          </w:p>
+        </w:tc>
+        <w:tc>
+          <w:tcPr/>
+          <w:p>
+            <w:pPr>
+              <w:pStyle w:val="Compact"/>
+              <w:jc w:val="left"/>
+            </w:pPr>
+            <w:r>
+              <w:t xml:space="preserve">Pilot success criteria met (Section 8.2)</w:t>
+            </w:r>
+          </w:p>
+        </w:tc>
+        <w:tc>
+          <w:tcPr/>
+          <w:p>
+            <w:pPr>
+              <w:pStyle w:val="Compact"/>
+              <w:jc w:val="left"/>
+            </w:pPr>
+            <w:r>
+              <w:t xml:space="preserve">Founder’s £3,000</w:t>
+            </w:r>
+          </w:p>
+        </w:tc>
+      </w:tr>
+      <w:tr>
+        <w:tc>
+          <w:tcPr/>
+          <w:p>
+            <w:pPr>
+              <w:pStyle w:val="Compact"/>
+              <w:jc w:val="left"/>
+            </w:pPr>
+            <w:r>
+              <w:rPr>
+                <w:bCs/>
+                <w:b/>
+              </w:rPr>
+              <w:t xml:space="preserve">2. Conversion</w:t>
+            </w:r>
+          </w:p>
+        </w:tc>
+        <w:tc>
+          <w:tcPr/>
+          <w:p>
+            <w:pPr>
+              <w:pStyle w:val="Compact"/>
+              <w:jc w:val="left"/>
+            </w:pPr>
+            <w:r>
+              <w:t xml:space="preserve">Apr – Sep 2027</w:t>
+            </w:r>
+          </w:p>
+        </w:tc>
+        <w:tc>
+          <w:tcPr/>
+          <w:p>
+            <w:pPr>
+              <w:pStyle w:val="Compact"/>
+              <w:jc w:val="left"/>
+            </w:pPr>
+            <w:r>
+              <w:t xml:space="preserve">Pilot readout;</w:t>
+            </w:r>
+            <w:r>
+              <w:t xml:space="preserve"> </w:t>
+            </w:r>
+            <w:r>
+              <w:rPr>
+                <w:bCs/>
+                <w:b/>
+              </w:rPr>
+              <w:t xml:space="preserve">letter of intent signed</w:t>
+            </w:r>
+            <w:r>
+              <w:t xml:space="preserve">; £11,000 post-pilot investment released; trademark and Cyber Essentials; freshers’ 2027 campaign</w:t>
+            </w:r>
+          </w:p>
+        </w:tc>
+        <w:tc>
+          <w:tcPr/>
+          <w:p>
+            <w:pPr>
+              <w:pStyle w:val="Compact"/>
+              <w:jc w:val="left"/>
+            </w:pPr>
+            <w:r>
+              <w:t xml:space="preserve">Signed, paid partner licence</w:t>
+            </w:r>
+          </w:p>
+        </w:tc>
+        <w:tc>
+          <w:tcPr/>
+          <w:p>
+            <w:pPr>
+              <w:pStyle w:val="Compact"/>
+              <w:jc w:val="left"/>
+            </w:pPr>
+            <w:r>
+              <w:t xml:space="preserve">£11,000 post-pilot equity</w:t>
+            </w:r>
+          </w:p>
+        </w:tc>
+      </w:tr>
+      <w:tr>
+        <w:tc>
+          <w:tcPr/>
+          <w:p>
+            <w:pPr>
+              <w:pStyle w:val="Compact"/>
+              <w:jc w:val="left"/>
+            </w:pPr>
+            <w:r>
+              <w:rPr>
+                <w:bCs/>
+                <w:b/>
+              </w:rPr>
+              <w:t xml:space="preserve">3. First paid licence and growth</w:t>
+            </w:r>
+          </w:p>
+        </w:tc>
+        <w:tc>
+          <w:tcPr/>
+          <w:p>
+            <w:pPr>
+              <w:pStyle w:val="Compact"/>
+              <w:jc w:val="left"/>
+            </w:pPr>
+            <w:r>
+              <w:t xml:space="preserve">Oct 2027 – Aug 2029</w:t>
+            </w:r>
+          </w:p>
+        </w:tc>
+        <w:tc>
+          <w:tcPr/>
+          <w:p>
+            <w:pPr>
+              <w:pStyle w:val="Compact"/>
+              <w:jc w:val="left"/>
+            </w:pPr>
+            <w:r>
+              <w:t xml:space="preserve">First licence (Oct 2027); further licences and Starter subscriptions; first paid roles in Year 3</w:t>
+            </w:r>
+          </w:p>
+        </w:tc>
+        <w:tc>
+          <w:tcPr/>
+          <w:p>
+            <w:pPr>
+              <w:pStyle w:val="Compact"/>
+              <w:jc w:val="left"/>
+            </w:pPr>
+            <w:r>
+              <w:t xml:space="preserve">Licence renewal and 3 paying universities</w:t>
+            </w:r>
+          </w:p>
+        </w:tc>
+        <w:tc>
+          <w:tcPr/>
+          <w:p>
+            <w:pPr>
+              <w:pStyle w:val="Compact"/>
+              <w:jc w:val="left"/>
+            </w:pPr>
+            <w:r>
+              <w:t xml:space="preserve">Licence revenue</w:t>
+            </w:r>
+          </w:p>
+        </w:tc>
+      </w:tr>
+      <w:tr>
+        <w:tc>
+          <w:tcPr/>
+          <w:p>
+            <w:pPr>
+              <w:pStyle w:val="Compact"/>
+              <w:jc w:val="left"/>
+            </w:pPr>
+            <w:r>
+              <w:rPr>
+                <w:bCs/>
+                <w:b/>
+              </w:rPr>
+              <w:t xml:space="preserve">4. After the endorsement period</w:t>
+            </w:r>
+          </w:p>
+        </w:tc>
+        <w:tc>
+          <w:tcPr/>
+          <w:p>
+            <w:pPr>
+              <w:pStyle w:val="Compact"/>
+              <w:jc w:val="left"/>
+            </w:pPr>
+            <w:r>
+              <w:t xml:space="preserve">From Sep 2029</w:t>
+            </w:r>
+          </w:p>
+        </w:tc>
+        <w:tc>
+          <w:tcPr/>
+          <w:p>
+            <w:pPr>
+              <w:pStyle w:val="Compact"/>
+              <w:jc w:val="left"/>
+            </w:pPr>
+            <w:r>
+              <w:t xml:space="preserve">Patent exploration with Panoramix IP (only after the three-year endorsement period and a successful university conversion); optional pre-seed round</w:t>
+            </w:r>
+          </w:p>
+        </w:tc>
+        <w:tc>
+          <w:tcPr/>
+          <w:p>
+            <w:pPr>
+              <w:pStyle w:val="Compact"/>
+              <w:jc w:val="left"/>
+            </w:pPr>
+            <w:r>
+              <w:t xml:space="preserve">—</w:t>
+            </w:r>
+          </w:p>
+        </w:tc>
+        <w:tc>
+          <w:tcPr/>
+          <w:p>
+            <w:pPr>
+              <w:pStyle w:val="Compact"/>
+              <w:jc w:val="left"/>
+            </w:pPr>
+            <w:r>
+              <w:t xml:space="preserve">Licence revenue</w:t>
+            </w:r>
+          </w:p>
+        </w:tc>
+      </w:tr>
+    </w:tbl>
+    <w:bookmarkEnd w:id="27"/>
+    <w:bookmarkStart w:id="28" w:name="pre-pilot-position-october-2026"/>
+    <w:p>
+      <w:pPr>
+        <w:pStyle w:val="Heading3"/>
+      </w:pPr>
+      <w:r>
+        <w:t xml:space="preserve">Pre-pilot position (October 2026)</w:t>
       </w:r>
     </w:p>
     <w:tbl>
@@ -1045,7 +1568,7 @@
               <w:jc w:val="left"/>
             </w:pPr>
             <w:r>
-              <w:t xml:space="preserve">Closed beta with verified University of Bedfordshire students.</w:t>
+              <w:t xml:space="preserve">Pre-pilot beta with verified University of Bedfordshire students. The product is publicly available to any UK student with a university email address.</w:t>
             </w:r>
           </w:p>
         </w:tc>
@@ -1075,7 +1598,7 @@
                 <w:bCs/>
                 <w:b/>
               </w:rPr>
-              <w:t xml:space="preserve">Conversations with the University of Bedfordshire about a pilot are ongoing.</w:t>
+              <w:t xml:space="preserve">Pre-pilot: conversations with the University of Bedfordshire about a 12-week pilot are ongoing.</w:t>
             </w:r>
             <w:r>
               <w:t xml:space="preserve"> </w:t>
@@ -1087,8 +1610,8 @@
         </w:tc>
       </w:tr>
     </w:tbl>
-    <w:bookmarkEnd w:id="27"/>
-    <w:bookmarkStart w:id="28" w:name="the-financial-plan-at-a-glance"/>
+    <w:bookmarkEnd w:id="28"/>
+    <w:bookmarkStart w:id="29" w:name="the-financial-plan-at-a-glance"/>
     <w:p>
       <w:pPr>
         <w:pStyle w:val="Heading3"/>
@@ -1632,9 +2155,9 @@
         </w:pict>
       </w:r>
     </w:p>
-    <w:bookmarkEnd w:id="28"/>
     <w:bookmarkEnd w:id="29"/>
-    <w:bookmarkStart w:id="32" w:name="products-and-services"/>
+    <w:bookmarkEnd w:id="30"/>
+    <w:bookmarkStart w:id="33" w:name="products-and-services"/>
     <w:p>
       <w:pPr>
         <w:pStyle w:val="Heading2"/>
@@ -1643,7 +2166,7 @@
         <w:t xml:space="preserve">2. Products and Services</w:t>
       </w:r>
     </w:p>
-    <w:bookmarkStart w:id="30" w:name="the-platform"/>
+    <w:bookmarkStart w:id="31" w:name="the-platform"/>
     <w:p>
       <w:pPr>
         <w:pStyle w:val="Heading3"/>
@@ -1956,8 +2479,8 @@
         </w:tc>
       </w:tr>
     </w:tbl>
-    <w:bookmarkEnd w:id="30"/>
-    <w:bookmarkStart w:id="31" w:name="how-dequad-makes-money"/>
+    <w:bookmarkEnd w:id="31"/>
+    <w:bookmarkStart w:id="32" w:name="how-dequad-makes-money"/>
     <w:p>
       <w:pPr>
         <w:pStyle w:val="Heading3"/>
@@ -2420,9 +2943,9 @@
         </w:pict>
       </w:r>
     </w:p>
-    <w:bookmarkEnd w:id="31"/>
     <w:bookmarkEnd w:id="32"/>
-    <w:bookmarkStart w:id="37" w:name="innovation-viability-and-scalability"/>
+    <w:bookmarkEnd w:id="33"/>
+    <w:bookmarkStart w:id="38" w:name="innovation-viability-and-scalability"/>
     <w:p>
       <w:pPr>
         <w:pStyle w:val="Heading2"/>
@@ -2431,7 +2954,7 @@
         <w:t xml:space="preserve">3. Innovation, Viability and Scalability</w:t>
       </w:r>
     </w:p>
-    <w:bookmarkStart w:id="33" w:name="innovation"/>
+    <w:bookmarkStart w:id="34" w:name="innovation"/>
     <w:p>
       <w:pPr>
         <w:pStyle w:val="Heading3"/>
@@ -2576,8 +3099,8 @@
         <w:t xml:space="preserve">A competitor could copy an email-domain check in weeks. It would be much harder to copy the safeguarding taxonomy, the human-review operating model, institutional trust and the longitudinal wellbeing data that builds up at each partner university. Over time, the verified network at each university also becomes more valuable to every student who joins it. Section 3.4 sets out the specific barriers to entry DEQUAD is building and how each one is protected.</w:t>
       </w:r>
     </w:p>
-    <w:bookmarkEnd w:id="33"/>
-    <w:bookmarkStart w:id="34" w:name="viability"/>
+    <w:bookmarkEnd w:id="34"/>
+    <w:bookmarkStart w:id="35" w:name="viability"/>
     <w:p>
       <w:pPr>
         <w:pStyle w:val="Heading3"/>
@@ -2731,8 +3254,8 @@
         <w:t xml:space="preserve">Yusuf Quadri has put £3,000 of his own money into the company and signed a commitment undertaking (Appendix C). Friends and family (£3,000) and a Nigerian company (£8,000) have agreed to invest once the pilot proves the product with a real university.</w:t>
       </w:r>
     </w:p>
-    <w:bookmarkEnd w:id="34"/>
-    <w:bookmarkStart w:id="35" w:name="scalability"/>
+    <w:bookmarkEnd w:id="35"/>
+    <w:bookmarkStart w:id="36" w:name="scalability"/>
     <w:p>
       <w:pPr>
         <w:pStyle w:val="Heading3"/>
@@ -2941,8 +3464,8 @@
         <w:t xml:space="preserve">: the founder paid, a full-time Software Engineer, three full-time hires at £25,000 a year, and a part-time Safeguarding &amp; Trust Lead. All of these roles are UK-based and funded from revenue.</w:t>
       </w:r>
     </w:p>
-    <w:bookmarkEnd w:id="35"/>
-    <w:bookmarkStart w:id="36" w:name="X3ba0d2948c6d8b8df0a7c81e1458b4fe0bf05df"/>
+    <w:bookmarkEnd w:id="36"/>
+    <w:bookmarkStart w:id="37" w:name="X3ba0d2948c6d8b8df0a7c81e1458b4fe0bf05df"/>
     <w:p>
       <w:pPr>
         <w:pStyle w:val="Heading3"/>
@@ -3689,9 +4212,9 @@
         </w:pict>
       </w:r>
     </w:p>
-    <w:bookmarkEnd w:id="36"/>
     <w:bookmarkEnd w:id="37"/>
-    <w:bookmarkStart w:id="40" w:name="research-and-development"/>
+    <w:bookmarkEnd w:id="38"/>
+    <w:bookmarkStart w:id="41" w:name="research-and-development"/>
     <w:p>
       <w:pPr>
         <w:pStyle w:val="Heading2"/>
@@ -3737,7 +4260,7 @@
         <w:t xml:space="preserve">, are original engineering by the founding team. R&amp;D in Years 1–2 is done by the founder and the equity-only engineering team without pay. No SME R&amp;D tax relief is assumed in the forecasts; the company will review eligibility with its accountant once qualifying PAYE costs exist (from Year 3).</w:t>
       </w:r>
     </w:p>
-    <w:bookmarkStart w:id="38" w:name="rd-completed-to-date"/>
+    <w:bookmarkStart w:id="39" w:name="rd-completed-to-date"/>
     <w:p>
       <w:pPr>
         <w:pStyle w:val="Heading3"/>
@@ -4040,8 +4563,8 @@
         </w:tc>
       </w:tr>
     </w:tbl>
-    <w:bookmarkEnd w:id="38"/>
-    <w:bookmarkStart w:id="39" w:name="X01ee0690cba00ba7eef2fb96d919026b2a89a00"/>
+    <w:bookmarkEnd w:id="39"/>
+    <w:bookmarkStart w:id="40" w:name="X01ee0690cba00ba7eef2fb96d919026b2a89a00"/>
     <w:p>
       <w:pPr>
         <w:pStyle w:val="Heading3"/>
@@ -4432,9 +4955,9 @@
         </w:pict>
       </w:r>
     </w:p>
-    <w:bookmarkEnd w:id="39"/>
     <w:bookmarkEnd w:id="40"/>
-    <w:bookmarkStart w:id="46" w:name="market-analysis"/>
+    <w:bookmarkEnd w:id="41"/>
+    <w:bookmarkStart w:id="47" w:name="market-analysis"/>
     <w:p>
       <w:pPr>
         <w:pStyle w:val="Heading2"/>
@@ -4443,7 +4966,7 @@
         <w:t xml:space="preserve">5. Market Analysis</w:t>
       </w:r>
     </w:p>
-    <w:bookmarkStart w:id="41" w:name="market-definition"/>
+    <w:bookmarkStart w:id="42" w:name="market-definition"/>
     <w:p>
       <w:pPr>
         <w:pStyle w:val="Heading3"/>
@@ -4764,8 +5287,8 @@
         </w:tc>
       </w:tr>
     </w:tbl>
-    <w:bookmarkEnd w:id="41"/>
-    <w:bookmarkStart w:id="42" w:name="market-size"/>
+    <w:bookmarkEnd w:id="42"/>
+    <w:bookmarkStart w:id="43" w:name="market-size"/>
     <w:p>
       <w:pPr>
         <w:pStyle w:val="Heading3"/>
@@ -5029,8 +5552,8 @@
         <w:t xml:space="preserve">The headline per-student price is deliberately low so that the buying decision sits within a Director of Student Services’ delegated budget authority. The larger long-term prize is adjacent: NHS ICB data partnerships, further-education colleges, and English-speaking international markets with the same domain-based verification. None of these is in the base-case forecast.</w:t>
       </w:r>
     </w:p>
-    <w:bookmarkEnd w:id="42"/>
-    <w:bookmarkStart w:id="43" w:name="market-drivers"/>
+    <w:bookmarkEnd w:id="43"/>
+    <w:bookmarkStart w:id="44" w:name="market-drivers"/>
     <w:p>
       <w:pPr>
         <w:pStyle w:val="Heading3"/>
@@ -5140,8 +5663,8 @@
         <w:t xml:space="preserve">Universities are under financial pressure. Low-cost, per-student SaaS that reduces counselling demand and improves retention is easier to justify than more staff. Our price is set for this environment.</w:t>
       </w:r>
     </w:p>
-    <w:bookmarkEnd w:id="43"/>
-    <w:bookmarkStart w:id="44" w:name="customer-research"/>
+    <w:bookmarkEnd w:id="44"/>
+    <w:bookmarkStart w:id="45" w:name="customer-research"/>
     <w:p>
       <w:pPr>
         <w:pStyle w:val="Heading3"/>
@@ -5304,8 +5827,8 @@
         <w:t xml:space="preserve">Pilots and contracts below formal tender thresholds can usually be approved within student services. This is why the plan uses unpaid pilots and a low-cost Starter tier as the way in.</w:t>
       </w:r>
     </w:p>
-    <w:bookmarkEnd w:id="44"/>
-    <w:bookmarkStart w:id="45" w:name="research-evidence-pack"/>
+    <w:bookmarkEnd w:id="45"/>
+    <w:bookmarkStart w:id="46" w:name="research-evidence-pack"/>
     <w:p>
       <w:pPr>
         <w:pStyle w:val="Heading3"/>
@@ -5616,9 +6139,9 @@
         </w:pict>
       </w:r>
     </w:p>
-    <w:bookmarkEnd w:id="45"/>
     <w:bookmarkEnd w:id="46"/>
-    <w:bookmarkStart w:id="50" w:name="competitor-analysis"/>
+    <w:bookmarkEnd w:id="47"/>
+    <w:bookmarkStart w:id="51" w:name="competitor-analysis"/>
     <w:p>
       <w:pPr>
         <w:pStyle w:val="Heading2"/>
@@ -5635,7 +6158,7 @@
         <w:t xml:space="preserve">We compared DEQUAD with six alternatives that UK students or universities use today. They fall into three groups: institutional peer support (Togetherall, TalkCampus), institutional engagement (UniBuddy), youth mental-health services (Kooth / Qwell), and consumer social tools (Bumble For Friends, Discord and WhatsApp groups).</w:t>
       </w:r>
     </w:p>
-    <w:bookmarkStart w:id="47" w:name="competitor-profiles"/>
+    <w:bookmarkStart w:id="48" w:name="competitor-profiles"/>
     <w:p>
       <w:pPr>
         <w:pStyle w:val="Heading3"/>
@@ -6205,8 +6728,8 @@
         </w:tc>
       </w:tr>
     </w:tbl>
-    <w:bookmarkEnd w:id="47"/>
-    <w:bookmarkStart w:id="48" w:name="feature-and-benefit-comparison"/>
+    <w:bookmarkEnd w:id="48"/>
+    <w:bookmarkStart w:id="49" w:name="feature-and-benefit-comparison"/>
     <w:p>
       <w:pPr>
         <w:pStyle w:val="Heading3"/>
@@ -7372,8 +7895,8 @@
         <w:t xml:space="preserve">means the capability exists in a limited or different form.</w:t>
       </w:r>
     </w:p>
-    <w:bookmarkEnd w:id="48"/>
-    <w:bookmarkStart w:id="49" w:name="where-dequad-wins-and-where-it-does-not"/>
+    <w:bookmarkEnd w:id="49"/>
+    <w:bookmarkStart w:id="50" w:name="where-dequad-wins-and-where-it-does-not"/>
     <w:p>
       <w:pPr>
         <w:pStyle w:val="Heading3"/>
@@ -7484,9 +8007,9 @@
         </w:pict>
       </w:r>
     </w:p>
-    <w:bookmarkEnd w:id="49"/>
     <w:bookmarkEnd w:id="50"/>
-    <w:bookmarkStart w:id="55" w:name="staff-profile-and-recruitment-strategy"/>
+    <w:bookmarkEnd w:id="51"/>
+    <w:bookmarkStart w:id="56" w:name="staff-profile-and-recruitment-strategy"/>
     <w:p>
       <w:pPr>
         <w:pStyle w:val="Heading2"/>
@@ -7495,7 +8018,7 @@
         <w:t xml:space="preserve">7. Staff Profile and Recruitment Strategy</w:t>
       </w:r>
     </w:p>
-    <w:bookmarkStart w:id="51" w:name="founder"/>
+    <w:bookmarkStart w:id="52" w:name="founder"/>
     <w:p>
       <w:pPr>
         <w:pStyle w:val="Heading3"/>
@@ -7665,8 +8188,8 @@
         <w:t xml:space="preserve">Engineering is led day to day by Adedapo Ajuwon (Senior Software Engineer, below), with the founder as product owner. The codebase is documented, version-controlled and deployed through managed services (Expo EAS, MongoDB Atlas). This means no single person’s knowledge is needed to keep it running. A paid Software Engineer role (0.5 FTE in the base case, full-time in the growth case) is the first technical hire in Year 3.</w:t>
       </w:r>
     </w:p>
-    <w:bookmarkEnd w:id="51"/>
-    <w:bookmarkStart w:id="52" w:name="wider-founding-team-equity-only"/>
+    <w:bookmarkEnd w:id="52"/>
+    <w:bookmarkStart w:id="53" w:name="wider-founding-team-equity-only"/>
     <w:p>
       <w:pPr>
         <w:pStyle w:val="Heading3"/>
@@ -7875,8 +8398,8 @@
         <w:t xml:space="preserve">These team members hold EMI share options (4-year vesting, 1-year cliff). No salary is assumed for them in Years 1–2. Adedapo Ajuwon will be offered the paid Software Engineer role first when it opens in Year 3. CVs are at Appendix N.</w:t>
       </w:r>
     </w:p>
-    <w:bookmarkEnd w:id="52"/>
-    <w:bookmarkStart w:id="53" w:name="hiring-plan"/>
+    <w:bookmarkEnd w:id="53"/>
+    <w:bookmarkStart w:id="54" w:name="hiring-plan"/>
     <w:p>
       <w:pPr>
         <w:pStyle w:val="Heading3"/>
@@ -8363,8 +8886,8 @@
         <w:t xml:space="preserve">The founder will only make a paid hire when cash at bank, plus licence income already contracted for the next 12 months, covers the new role’s fully loaded cost for 12 months on top of all existing commitments. This is how the plan keeps job creation and cash safety in step.</w:t>
       </w:r>
     </w:p>
-    <w:bookmarkEnd w:id="53"/>
-    <w:bookmarkStart w:id="54" w:name="recruitment-strategy"/>
+    <w:bookmarkEnd w:id="54"/>
+    <w:bookmarkStart w:id="55" w:name="recruitment-strategy"/>
     <w:p>
       <w:pPr>
         <w:pStyle w:val="Heading3"/>
@@ -8468,9 +8991,9 @@
         </w:pict>
       </w:r>
     </w:p>
-    <w:bookmarkEnd w:id="54"/>
     <w:bookmarkEnd w:id="55"/>
-    <w:bookmarkStart w:id="61" w:name="marketing-and-sales-strategy"/>
+    <w:bookmarkEnd w:id="56"/>
+    <w:bookmarkStart w:id="65" w:name="marketing-and-sales-strategy"/>
     <w:p>
       <w:pPr>
         <w:pStyle w:val="Heading2"/>
@@ -8479,7 +9002,7 @@
         <w:t xml:space="preserve">8. Marketing and Sales Strategy</w:t>
       </w:r>
     </w:p>
-    <w:bookmarkStart w:id="56" w:name="positioning"/>
+    <w:bookmarkStart w:id="57" w:name="positioning"/>
     <w:p>
       <w:pPr>
         <w:pStyle w:val="Heading3"/>
@@ -8709,14 +9232,14 @@
         </w:tc>
       </w:tr>
     </w:tbl>
-    <w:bookmarkEnd w:id="56"/>
-    <w:bookmarkStart w:id="57" w:name="go-to-market-land-prove-expand"/>
+    <w:bookmarkEnd w:id="57"/>
+    <w:bookmarkStart w:id="61" w:name="Xa3ed2e604da00469b1c9059a48683a0976f786f"/>
     <w:p>
       <w:pPr>
         <w:pStyle w:val="Heading3"/>
       </w:pPr>
       <w:r>
-        <w:t xml:space="preserve">8.2 Go-to-market:</w:t>
+        <w:t xml:space="preserve">8.2 Go-to-market from pre-pilot to scale:</w:t>
       </w:r>
       <w:r>
         <w:t xml:space="preserve"> </w:t>
@@ -8725,7 +9248,7 @@
         <w:t xml:space="preserve">“</w:t>
       </w:r>
       <w:r>
-        <w:t xml:space="preserve">land, prove, expand</w:t>
+        <w:t xml:space="preserve">prepare, prove, convert, expand</w:t>
       </w:r>
       <w:r>
         <w:t xml:space="preserve">”</w:t>
@@ -9005,8 +9528,815 @@
         </w:tc>
       </w:tr>
     </w:tbl>
-    <w:bookmarkEnd w:id="57"/>
-    <w:bookmarkStart w:id="58" w:name="student-acquisition"/>
+    <w:bookmarkStart w:id="58" w:name="X1b6a431067ea2499d4a454d5d0c8f45026476d8"/>
+    <w:p>
+      <w:pPr>
+        <w:pStyle w:val="Heading4"/>
+      </w:pPr>
+      <w:r>
+        <w:t xml:space="preserve">Proposed pilot design (to be agreed with the University of Bedfordshire)</w:t>
+      </w:r>
+    </w:p>
+    <w:tbl>
+      <w:tblPr>
+        <w:tblStyle w:val="Table"/>
+        <w:tblW w:type="pct" w:w="5000"/>
+        <w:tblLook w:firstRow="1" w:lastRow="0" w:firstColumn="0" w:lastColumn="0" w:noHBand="0" w:noVBand="0" w:val="0020"/>
+        <w:jc w:val="start"/>
+      </w:tblPr>
+      <w:tblGrid>
+        <w:gridCol w:w="3960"/>
+        <w:gridCol w:w="3960"/>
+      </w:tblGrid>
+      <w:tr>
+        <w:trPr>
+          <w:tblHeader w:val="true"/>
+        </w:trPr>
+        <w:tc>
+          <w:tcPr/>
+          <w:p>
+            <w:pPr>
+              <w:pStyle w:val="Compact"/>
+              <w:jc w:val="left"/>
+            </w:pPr>
+            <w:r>
+              <w:t xml:space="preserve">Element</w:t>
+            </w:r>
+          </w:p>
+        </w:tc>
+        <w:tc>
+          <w:tcPr/>
+          <w:p>
+            <w:pPr>
+              <w:pStyle w:val="Compact"/>
+              <w:jc w:val="left"/>
+            </w:pPr>
+            <w:r>
+              <w:t xml:space="preserve">Proposal</w:t>
+            </w:r>
+          </w:p>
+        </w:tc>
+      </w:tr>
+      <w:tr>
+        <w:tc>
+          <w:tcPr/>
+          <w:p>
+            <w:pPr>
+              <w:pStyle w:val="Compact"/>
+              <w:jc w:val="left"/>
+            </w:pPr>
+            <w:r>
+              <w:t xml:space="preserve">Duration and cost</w:t>
+            </w:r>
+          </w:p>
+        </w:tc>
+        <w:tc>
+          <w:tcPr/>
+          <w:p>
+            <w:pPr>
+              <w:pStyle w:val="Compact"/>
+              <w:jc w:val="left"/>
+            </w:pPr>
+            <w:r>
+              <w:t xml:space="preserve">12 weeks over the spring term (January – March 2027);</w:t>
+            </w:r>
+            <w:r>
+              <w:t xml:space="preserve"> </w:t>
+            </w:r>
+            <w:r>
+              <w:rPr>
+                <w:bCs/>
+                <w:b/>
+              </w:rPr>
+              <w:t xml:space="preserve">free to the university</w:t>
+            </w:r>
+          </w:p>
+        </w:tc>
+      </w:tr>
+      <w:tr>
+        <w:tc>
+          <w:tcPr/>
+          <w:p>
+            <w:pPr>
+              <w:pStyle w:val="Compact"/>
+              <w:jc w:val="left"/>
+            </w:pPr>
+            <w:r>
+              <w:t xml:space="preserve">Participants</w:t>
+            </w:r>
+          </w:p>
+        </w:tc>
+        <w:tc>
+          <w:tcPr/>
+          <w:p>
+            <w:pPr>
+              <w:pStyle w:val="Compact"/>
+              <w:jc w:val="left"/>
+            </w:pPr>
+            <w:r>
+              <w:t xml:space="preserve">Verified students who opt in; target</w:t>
+            </w:r>
+            <w:r>
+              <w:t xml:space="preserve"> </w:t>
+            </w:r>
+            <w:r>
+              <w:rPr>
+                <w:bCs/>
+                <w:b/>
+              </w:rPr>
+              <w:t xml:space="preserve">at least 150</w:t>
+            </w:r>
+            <w:r>
+              <w:t xml:space="preserve"> </w:t>
+            </w:r>
+            <w:r>
+              <w:t xml:space="preserve">verified sign-ups</w:t>
+            </w:r>
+          </w:p>
+        </w:tc>
+      </w:tr>
+      <w:tr>
+        <w:tc>
+          <w:tcPr/>
+          <w:p>
+            <w:pPr>
+              <w:pStyle w:val="Compact"/>
+              <w:jc w:val="left"/>
+            </w:pPr>
+            <w:r>
+              <w:t xml:space="preserve">University involvement</w:t>
+            </w:r>
+          </w:p>
+        </w:tc>
+        <w:tc>
+          <w:tcPr/>
+          <w:p>
+            <w:pPr>
+              <w:pStyle w:val="Compact"/>
+              <w:jc w:val="left"/>
+            </w:pPr>
+            <w:r>
+              <w:t xml:space="preserve">Safeguarding alerts routed to the university’s designated safeguarding lead; dashboard access for student services; fortnightly steering group (student services, safeguarding lead, students’ union, DEQUAD)</w:t>
+            </w:r>
+          </w:p>
+        </w:tc>
+      </w:tr>
+      <w:tr>
+        <w:tc>
+          <w:tcPr/>
+          <w:p>
+            <w:pPr>
+              <w:pStyle w:val="Compact"/>
+              <w:jc w:val="left"/>
+            </w:pPr>
+            <w:r>
+              <w:t xml:space="preserve">Data protection</w:t>
+            </w:r>
+          </w:p>
+        </w:tc>
+        <w:tc>
+          <w:tcPr/>
+          <w:p>
+            <w:pPr>
+              <w:pStyle w:val="Compact"/>
+              <w:jc w:val="left"/>
+            </w:pPr>
+            <w:r>
+              <w:t xml:space="preserve">Data-sharing agreement and university sign-off of the DPIA (Appendix E)</w:t>
+            </w:r>
+            <w:r>
+              <w:t xml:space="preserve"> </w:t>
+            </w:r>
+            <w:r>
+              <w:rPr>
+                <w:bCs/>
+                <w:b/>
+              </w:rPr>
+              <w:t xml:space="preserve">before</w:t>
+            </w:r>
+            <w:r>
+              <w:t xml:space="preserve"> </w:t>
+            </w:r>
+            <w:r>
+              <w:t xml:space="preserve">launch; data deleted or returned at the end if the university does not continue</w:t>
+            </w:r>
+          </w:p>
+        </w:tc>
+      </w:tr>
+      <w:tr>
+        <w:tc>
+          <w:tcPr/>
+          <w:p>
+            <w:pPr>
+              <w:pStyle w:val="Compact"/>
+              <w:jc w:val="left"/>
+            </w:pPr>
+            <w:r>
+              <w:t xml:space="preserve">Evaluation</w:t>
+            </w:r>
+          </w:p>
+        </w:tc>
+        <w:tc>
+          <w:tcPr/>
+          <w:p>
+            <w:pPr>
+              <w:pStyle w:val="Compact"/>
+              <w:jc w:val="left"/>
+            </w:pPr>
+            <w:r>
+              <w:t xml:space="preserve">Method in Appendix D; joint readout in April 2027</w:t>
+            </w:r>
+          </w:p>
+        </w:tc>
+      </w:tr>
+    </w:tbl>
+    <w:bookmarkEnd w:id="58"/>
+    <w:bookmarkStart w:id="59" w:name="X0ed947b562769da34ee3af6e32434a5c5e16cc1"/>
+    <w:p>
+      <w:pPr>
+        <w:pStyle w:val="Heading4"/>
+      </w:pPr>
+      <w:r>
+        <w:t xml:space="preserve">Pilot success criteria (proposed, to be agreed before launch)</w:t>
+      </w:r>
+    </w:p>
+    <w:tbl>
+      <w:tblPr>
+        <w:tblStyle w:val="Table"/>
+        <w:tblW w:type="pct" w:w="5000"/>
+        <w:tblLook w:firstRow="1" w:lastRow="0" w:firstColumn="0" w:lastColumn="0" w:noHBand="0" w:noVBand="0" w:val="0020"/>
+        <w:jc w:val="start"/>
+      </w:tblPr>
+      <w:tblGrid>
+        <w:gridCol w:w="3960"/>
+        <w:gridCol w:w="3960"/>
+      </w:tblGrid>
+      <w:tr>
+        <w:trPr>
+          <w:tblHeader w:val="true"/>
+        </w:trPr>
+        <w:tc>
+          <w:tcPr/>
+          <w:p>
+            <w:pPr>
+              <w:pStyle w:val="Compact"/>
+              <w:jc w:val="left"/>
+            </w:pPr>
+            <w:r>
+              <w:t xml:space="preserve">Measure</w:t>
+            </w:r>
+          </w:p>
+        </w:tc>
+        <w:tc>
+          <w:tcPr/>
+          <w:p>
+            <w:pPr>
+              <w:pStyle w:val="Compact"/>
+              <w:jc w:val="left"/>
+            </w:pPr>
+            <w:r>
+              <w:t xml:space="preserve">Target</w:t>
+            </w:r>
+          </w:p>
+        </w:tc>
+      </w:tr>
+      <w:tr>
+        <w:tc>
+          <w:tcPr/>
+          <w:p>
+            <w:pPr>
+              <w:pStyle w:val="Compact"/>
+              <w:jc w:val="left"/>
+            </w:pPr>
+            <w:r>
+              <w:t xml:space="preserve">Verified student sign-ups</w:t>
+            </w:r>
+          </w:p>
+        </w:tc>
+        <w:tc>
+          <w:tcPr/>
+          <w:p>
+            <w:pPr>
+              <w:pStyle w:val="Compact"/>
+              <w:jc w:val="left"/>
+            </w:pPr>
+            <w:r>
+              <w:t xml:space="preserve">≥ 150</w:t>
+            </w:r>
+          </w:p>
+        </w:tc>
+      </w:tr>
+      <w:tr>
+        <w:tc>
+          <w:tcPr/>
+          <w:p>
+            <w:pPr>
+              <w:pStyle w:val="Compact"/>
+              <w:jc w:val="left"/>
+            </w:pPr>
+            <w:r>
+              <w:t xml:space="preserve">Students active in week 8</w:t>
+            </w:r>
+          </w:p>
+        </w:tc>
+        <w:tc>
+          <w:tcPr/>
+          <w:p>
+            <w:pPr>
+              <w:pStyle w:val="Compact"/>
+              <w:jc w:val="left"/>
+            </w:pPr>
+            <w:r>
+              <w:t xml:space="preserve">≥ 40% of sign-ups</w:t>
+            </w:r>
+          </w:p>
+        </w:tc>
+      </w:tr>
+      <w:tr>
+        <w:tc>
+          <w:tcPr/>
+          <w:p>
+            <w:pPr>
+              <w:pStyle w:val="Compact"/>
+              <w:jc w:val="left"/>
+            </w:pPr>
+            <w:r>
+              <w:t xml:space="preserve">Daily mood check-in completion (active students)</w:t>
+            </w:r>
+          </w:p>
+        </w:tc>
+        <w:tc>
+          <w:tcPr/>
+          <w:p>
+            <w:pPr>
+              <w:pStyle w:val="Compact"/>
+              <w:jc w:val="left"/>
+            </w:pPr>
+            <w:r>
+              <w:t xml:space="preserve">≥ 50%</w:t>
+            </w:r>
+          </w:p>
+        </w:tc>
+      </w:tr>
+      <w:tr>
+        <w:tc>
+          <w:tcPr/>
+          <w:p>
+            <w:pPr>
+              <w:pStyle w:val="Compact"/>
+              <w:jc w:val="left"/>
+            </w:pPr>
+            <w:r>
+              <w:t xml:space="preserve">High-risk safeguarding alerts reviewed by a human</w:t>
+            </w:r>
+          </w:p>
+        </w:tc>
+        <w:tc>
+          <w:tcPr/>
+          <w:p>
+            <w:pPr>
+              <w:pStyle w:val="Compact"/>
+              <w:jc w:val="left"/>
+            </w:pPr>
+            <w:r>
+              <w:t xml:space="preserve">100%, within 1 hour in service hours</w:t>
+            </w:r>
+          </w:p>
+        </w:tc>
+      </w:tr>
+      <w:tr>
+        <w:tc>
+          <w:tcPr/>
+          <w:p>
+            <w:pPr>
+              <w:pStyle w:val="Compact"/>
+              <w:jc w:val="left"/>
+            </w:pPr>
+            <w:r>
+              <w:t xml:space="preserve">Agreement between automated alerts and reviewer decisions</w:t>
+            </w:r>
+          </w:p>
+        </w:tc>
+        <w:tc>
+          <w:tcPr/>
+          <w:p>
+            <w:pPr>
+              <w:pStyle w:val="Compact"/>
+              <w:jc w:val="left"/>
+            </w:pPr>
+            <w:r>
+              <w:t xml:space="preserve">≥ 80%</w:t>
+            </w:r>
+          </w:p>
+        </w:tc>
+      </w:tr>
+      <w:tr>
+        <w:tc>
+          <w:tcPr/>
+          <w:p>
+            <w:pPr>
+              <w:pStyle w:val="Compact"/>
+              <w:jc w:val="left"/>
+            </w:pPr>
+            <w:r>
+              <w:t xml:space="preserve">Student-services staff satisfaction</w:t>
+            </w:r>
+          </w:p>
+        </w:tc>
+        <w:tc>
+          <w:tcPr/>
+          <w:p>
+            <w:pPr>
+              <w:pStyle w:val="Compact"/>
+              <w:jc w:val="left"/>
+            </w:pPr>
+            <w:r>
+              <w:t xml:space="preserve">≥ 4 out of 5</w:t>
+            </w:r>
+          </w:p>
+        </w:tc>
+      </w:tr>
+      <w:tr>
+        <w:tc>
+          <w:tcPr/>
+          <w:p>
+            <w:pPr>
+              <w:pStyle w:val="Compact"/>
+              <w:jc w:val="left"/>
+            </w:pPr>
+            <w:r>
+              <w:rPr>
+                <w:bCs/>
+                <w:b/>
+              </w:rPr>
+              <w:t xml:space="preserve">Commercial outcome</w:t>
+            </w:r>
+          </w:p>
+        </w:tc>
+        <w:tc>
+          <w:tcPr/>
+          <w:p>
+            <w:pPr>
+              <w:pStyle w:val="Compact"/>
+              <w:jc w:val="left"/>
+            </w:pPr>
+            <w:r>
+              <w:rPr>
+                <w:bCs/>
+                <w:b/>
+              </w:rPr>
+              <w:t xml:space="preserve">Letter of intent to take a paid licence</w:t>
+            </w:r>
+            <w:r>
+              <w:t xml:space="preserve"> </w:t>
+            </w:r>
+            <w:r>
+              <w:t xml:space="preserve">(template at Appendix H)</w:t>
+            </w:r>
+          </w:p>
+        </w:tc>
+      </w:tr>
+    </w:tbl>
+    <w:bookmarkEnd w:id="59"/>
+    <w:bookmarkStart w:id="60" w:name="pre-pilot-readiness-checklist"/>
+    <w:p>
+      <w:pPr>
+        <w:pStyle w:val="Heading4"/>
+      </w:pPr>
+      <w:r>
+        <w:t xml:space="preserve">Pre-pilot readiness checklist</w:t>
+      </w:r>
+    </w:p>
+    <w:tbl>
+      <w:tblPr>
+        <w:tblStyle w:val="Table"/>
+        <w:tblW w:type="pct" w:w="5000"/>
+        <w:tblLook w:firstRow="1" w:lastRow="0" w:firstColumn="0" w:lastColumn="0" w:noHBand="0" w:noVBand="0" w:val="0020"/>
+        <w:jc w:val="start"/>
+      </w:tblPr>
+      <w:tblGrid>
+        <w:gridCol w:w="3960"/>
+        <w:gridCol w:w="3960"/>
+      </w:tblGrid>
+      <w:tr>
+        <w:trPr>
+          <w:tblHeader w:val="true"/>
+        </w:trPr>
+        <w:tc>
+          <w:tcPr/>
+          <w:p>
+            <w:pPr>
+              <w:pStyle w:val="Compact"/>
+              <w:jc w:val="left"/>
+            </w:pPr>
+            <w:r>
+              <w:t xml:space="preserve">Item</w:t>
+            </w:r>
+          </w:p>
+        </w:tc>
+        <w:tc>
+          <w:tcPr/>
+          <w:p>
+            <w:pPr>
+              <w:pStyle w:val="Compact"/>
+              <w:jc w:val="left"/>
+            </w:pPr>
+            <w:r>
+              <w:t xml:space="preserve">Status (October 2026)</w:t>
+            </w:r>
+          </w:p>
+        </w:tc>
+      </w:tr>
+      <w:tr>
+        <w:tc>
+          <w:tcPr/>
+          <w:p>
+            <w:pPr>
+              <w:pStyle w:val="Compact"/>
+              <w:jc w:val="left"/>
+            </w:pPr>
+            <w:r>
+              <w:t xml:space="preserve">Product live on Apple App Store, Google Play and web</w:t>
+            </w:r>
+          </w:p>
+        </w:tc>
+        <w:tc>
+          <w:tcPr/>
+          <w:p>
+            <w:pPr>
+              <w:pStyle w:val="Compact"/>
+              <w:jc w:val="left"/>
+            </w:pPr>
+            <w:r>
+              <w:t xml:space="preserve">✅ Done</w:t>
+            </w:r>
+          </w:p>
+        </w:tc>
+      </w:tr>
+      <w:tr>
+        <w:tc>
+          <w:tcPr/>
+          <w:p>
+            <w:pPr>
+              <w:pStyle w:val="Compact"/>
+              <w:jc w:val="left"/>
+            </w:pPr>
+            <w:r>
+              <w:t xml:space="preserve">Safeguarding escalation policy and graded alerts</w:t>
+            </w:r>
+          </w:p>
+        </w:tc>
+        <w:tc>
+          <w:tcPr/>
+          <w:p>
+            <w:pPr>
+              <w:pStyle w:val="Compact"/>
+              <w:jc w:val="left"/>
+            </w:pPr>
+            <w:r>
+              <w:t xml:space="preserve">✅ Done</w:t>
+            </w:r>
+          </w:p>
+        </w:tc>
+      </w:tr>
+      <w:tr>
+        <w:tc>
+          <w:tcPr/>
+          <w:p>
+            <w:pPr>
+              <w:pStyle w:val="Compact"/>
+              <w:jc w:val="left"/>
+            </w:pPr>
+            <w:r>
+              <w:t xml:space="preserve">Partner-university licence tooling (unlocks full access for a university’s students)</w:t>
+            </w:r>
+          </w:p>
+        </w:tc>
+        <w:tc>
+          <w:tcPr/>
+          <w:p>
+            <w:pPr>
+              <w:pStyle w:val="Compact"/>
+              <w:jc w:val="left"/>
+            </w:pPr>
+            <w:r>
+              <w:t xml:space="preserve">✅ Done</w:t>
+            </w:r>
+          </w:p>
+        </w:tc>
+      </w:tr>
+      <w:tr>
+        <w:tc>
+          <w:tcPr/>
+          <w:p>
+            <w:pPr>
+              <w:pStyle w:val="Compact"/>
+              <w:jc w:val="left"/>
+            </w:pPr>
+            <w:r>
+              <w:t xml:space="preserve">Data Protection Impact Assessment</w:t>
+            </w:r>
+          </w:p>
+        </w:tc>
+        <w:tc>
+          <w:tcPr/>
+          <w:p>
+            <w:pPr>
+              <w:pStyle w:val="Compact"/>
+              <w:jc w:val="left"/>
+            </w:pPr>
+            <w:r>
+              <w:t xml:space="preserve">✅ Drafted (Appendix E); university sign-off before launch</w:t>
+            </w:r>
+          </w:p>
+        </w:tc>
+      </w:tr>
+      <w:tr>
+        <w:tc>
+          <w:tcPr/>
+          <w:p>
+            <w:pPr>
+              <w:pStyle w:val="Compact"/>
+              <w:jc w:val="left"/>
+            </w:pPr>
+            <w:r>
+              <w:t xml:space="preserve">Online Safety Act risk assessment</w:t>
+            </w:r>
+          </w:p>
+        </w:tc>
+        <w:tc>
+          <w:tcPr/>
+          <w:p>
+            <w:pPr>
+              <w:pStyle w:val="Compact"/>
+              <w:jc w:val="left"/>
+            </w:pPr>
+            <w:r>
+              <w:t xml:space="preserve">✅ Done (Appendix I)</w:t>
+            </w:r>
+          </w:p>
+        </w:tc>
+      </w:tr>
+      <w:tr>
+        <w:tc>
+          <w:tcPr/>
+          <w:p>
+            <w:pPr>
+              <w:pStyle w:val="Compact"/>
+              <w:jc w:val="left"/>
+            </w:pPr>
+            <w:r>
+              <w:t xml:space="preserve">Pilot evaluation method</w:t>
+            </w:r>
+          </w:p>
+        </w:tc>
+        <w:tc>
+          <w:tcPr/>
+          <w:p>
+            <w:pPr>
+              <w:pStyle w:val="Compact"/>
+              <w:jc w:val="left"/>
+            </w:pPr>
+            <w:r>
+              <w:t xml:space="preserve">✅ Done (Appendix D)</w:t>
+            </w:r>
+          </w:p>
+        </w:tc>
+      </w:tr>
+      <w:tr>
+        <w:tc>
+          <w:tcPr/>
+          <w:p>
+            <w:pPr>
+              <w:pStyle w:val="Compact"/>
+              <w:jc w:val="left"/>
+            </w:pPr>
+            <w:r>
+              <w:t xml:space="preserve">Letter-of-intent template</w:t>
+            </w:r>
+          </w:p>
+        </w:tc>
+        <w:tc>
+          <w:tcPr/>
+          <w:p>
+            <w:pPr>
+              <w:pStyle w:val="Compact"/>
+              <w:jc w:val="left"/>
+            </w:pPr>
+            <w:r>
+              <w:t xml:space="preserve">✅ Done (Appendix H)</w:t>
+            </w:r>
+          </w:p>
+        </w:tc>
+      </w:tr>
+      <w:tr>
+        <w:tc>
+          <w:tcPr/>
+          <w:p>
+            <w:pPr>
+              <w:pStyle w:val="Compact"/>
+              <w:jc w:val="left"/>
+            </w:pPr>
+            <w:r>
+              <w:t xml:space="preserve">Pilot agreement and data-sharing agreement</w:t>
+            </w:r>
+          </w:p>
+        </w:tc>
+        <w:tc>
+          <w:tcPr/>
+          <w:p>
+            <w:pPr>
+              <w:pStyle w:val="Compact"/>
+              <w:jc w:val="left"/>
+            </w:pPr>
+            <w:r>
+              <w:t xml:space="preserve">⏳ To draft with NatWest in-kind legal support, by Dec 2026</w:t>
+            </w:r>
+          </w:p>
+        </w:tc>
+      </w:tr>
+      <w:tr>
+        <w:tc>
+          <w:tcPr/>
+          <w:p>
+            <w:pPr>
+              <w:pStyle w:val="Compact"/>
+              <w:jc w:val="left"/>
+            </w:pPr>
+            <w:r>
+              <w:t xml:space="preserve">Confidentiality and IP-assignment deeds for all contributors</w:t>
+            </w:r>
+          </w:p>
+        </w:tc>
+        <w:tc>
+          <w:tcPr/>
+          <w:p>
+            <w:pPr>
+              <w:pStyle w:val="Compact"/>
+              <w:jc w:val="left"/>
+            </w:pPr>
+            <w:r>
+              <w:t xml:space="preserve">⏳ By Dec 2026</w:t>
+            </w:r>
+          </w:p>
+        </w:tc>
+      </w:tr>
+      <w:tr>
+        <w:tc>
+          <w:tcPr/>
+          <w:p>
+            <w:pPr>
+              <w:pStyle w:val="Compact"/>
+              <w:jc w:val="left"/>
+            </w:pPr>
+            <w:r>
+              <w:t xml:space="preserve">University safeguarding contacts configured; staff briefing session</w:t>
+            </w:r>
+          </w:p>
+        </w:tc>
+        <w:tc>
+          <w:tcPr/>
+          <w:p>
+            <w:pPr>
+              <w:pStyle w:val="Compact"/>
+              <w:jc w:val="left"/>
+            </w:pPr>
+            <w:r>
+              <w:t xml:space="preserve">⏳ Two weeks before launch</w:t>
+            </w:r>
+          </w:p>
+        </w:tc>
+      </w:tr>
+      <w:tr>
+        <w:tc>
+          <w:tcPr/>
+          <w:p>
+            <w:pPr>
+              <w:pStyle w:val="Compact"/>
+              <w:jc w:val="left"/>
+            </w:pPr>
+            <w:r>
+              <w:t xml:space="preserve">Student launch materials and ambassador recruitment</w:t>
+            </w:r>
+          </w:p>
+        </w:tc>
+        <w:tc>
+          <w:tcPr/>
+          <w:p>
+            <w:pPr>
+              <w:pStyle w:val="Compact"/>
+              <w:jc w:val="left"/>
+            </w:pPr>
+            <w:r>
+              <w:t xml:space="preserve">⏳ Dec 2026</w:t>
+            </w:r>
+          </w:p>
+        </w:tc>
+      </w:tr>
+    </w:tbl>
+    <w:bookmarkEnd w:id="60"/>
+    <w:bookmarkEnd w:id="61"/>
+    <w:bookmarkStart w:id="62" w:name="student-acquisition"/>
     <w:p>
       <w:pPr>
         <w:pStyle w:val="Heading3"/>
@@ -9158,8 +10488,8 @@
         <w:t xml:space="preserve">Instagram and TikTok content made by and for students; search-optimised guides on making friends at university.</w:t>
       </w:r>
     </w:p>
-    <w:bookmarkEnd w:id="58"/>
-    <w:bookmarkStart w:id="59" w:name="institutional-sales"/>
+    <w:bookmarkEnd w:id="62"/>
+    <w:bookmarkStart w:id="63" w:name="institutional-sales"/>
     <w:p>
       <w:pPr>
         <w:pStyle w:val="Heading3"/>
@@ -9256,8 +10586,8 @@
         <w:t xml:space="preserve">3–6 months from first meeting to contract for sub-threshold contracts, aligned to academic-year budgets.</w:t>
       </w:r>
     </w:p>
-    <w:bookmarkEnd w:id="59"/>
-    <w:bookmarkStart w:id="60" w:name="sales-and-marketing-kpis"/>
+    <w:bookmarkEnd w:id="63"/>
+    <w:bookmarkStart w:id="64" w:name="sales-and-marketing-kpis"/>
     <w:p>
       <w:pPr>
         <w:pStyle w:val="Heading3"/>
@@ -9590,9 +10920,9 @@
         </w:pict>
       </w:r>
     </w:p>
-    <w:bookmarkEnd w:id="60"/>
-    <w:bookmarkEnd w:id="61"/>
-    <w:bookmarkStart w:id="63" w:name="swot-analysis"/>
+    <w:bookmarkEnd w:id="64"/>
+    <w:bookmarkEnd w:id="65"/>
+    <w:bookmarkStart w:id="67" w:name="swot-analysis"/>
     <w:p>
       <w:pPr>
         <w:pStyle w:val="Heading2"/>
@@ -9670,7 +11000,17 @@
               <w:jc w:val="left"/>
             </w:pPr>
             <w:r>
-              <w:t xml:space="preserve">Small funding base (£14,000) for a two-sided market</w:t>
+              <w:rPr>
+                <w:bCs/>
+                <w:b/>
+              </w:rPr>
+              <w:t xml:space="preserve">Pre-pilot stage:</w:t>
+            </w:r>
+            <w:r>
+              <w:t xml:space="preserve"> </w:t>
+            </w:r>
+            <w:r>
+              <w:t xml:space="preserve">no pilot, letter of intent or paying institution yet; £11,000 of the £14,000 funding depends on the pilot</w:t>
             </w:r>
           </w:p>
         </w:tc>
@@ -9696,7 +11036,7 @@
               <w:jc w:val="left"/>
             </w:pPr>
             <w:r>
-              <w:t xml:space="preserve">Bedfordshire pilot still under discussion; no signed pilot, letter of intent or paying institution yet</w:t>
+              <w:t xml:space="preserve">Small funding base for a two-sided market</w:t>
             </w:r>
           </w:p>
         </w:tc>
@@ -10011,7 +11351,7 @@
         </w:tc>
       </w:tr>
     </w:tbl>
-    <w:bookmarkStart w:id="62" w:name="how-we-respond-to-the-main-risks"/>
+    <w:bookmarkStart w:id="66" w:name="how-we-respond-to-the-main-risks"/>
     <w:p>
       <w:pPr>
         <w:pStyle w:val="Heading3"/>
@@ -10206,9 +11546,9 @@
         </w:pict>
       </w:r>
     </w:p>
-    <w:bookmarkEnd w:id="62"/>
-    <w:bookmarkEnd w:id="63"/>
-    <w:bookmarkStart w:id="69" w:name="X332637ab1f725c36169749d50eae89fbbdc6f6c"/>
+    <w:bookmarkEnd w:id="66"/>
+    <w:bookmarkEnd w:id="67"/>
+    <w:bookmarkStart w:id="73" w:name="X332637ab1f725c36169749d50eae89fbbdc6f6c"/>
     <w:p>
       <w:pPr>
         <w:pStyle w:val="Heading2"/>
@@ -10217,7 +11557,7 @@
         <w:t xml:space="preserve">10. Investment Strategy and Funding Requirement</w:t>
       </w:r>
     </w:p>
-    <w:bookmarkStart w:id="64" w:name="funding-requirement"/>
+    <w:bookmarkStart w:id="68" w:name="funding-requirement"/>
     <w:p>
       <w:pPr>
         <w:pStyle w:val="Heading3"/>
@@ -10627,8 +11967,8 @@
         <w:t xml:space="preserve">As well as cash, the investment is an early commercial link to one of Africa’s largest higher-education markets. That supports the international scalability case in Section 3.3. Any expansion into that market is a post-Year-3 opportunity and is not in the forecast.</w:t>
       </w:r>
     </w:p>
-    <w:bookmarkEnd w:id="64"/>
-    <w:bookmarkStart w:id="65" w:name="use-of-funds"/>
+    <w:bookmarkEnd w:id="68"/>
+    <w:bookmarkStart w:id="69" w:name="use-of-funds"/>
     <w:p>
       <w:pPr>
         <w:pStyle w:val="Heading3"/>
@@ -10913,8 +12253,8 @@
         <w:t xml:space="preserve">Year 1 net trading cash outflow is £5,320. The company ends Year 1 with £8,680 in the bank. From Year 2, licence fees invoiced annually in advance turn cash flow positive. The pre-pilot period is deliberately lean, and spending on institutional-sales items (trademark, Cyber Essentials, devices) waits until the letter of intent is signed.</w:t>
       </w:r>
     </w:p>
-    <w:bookmarkEnd w:id="65"/>
-    <w:bookmarkStart w:id="66" w:name="why-the-round-is-small"/>
+    <w:bookmarkEnd w:id="69"/>
+    <w:bookmarkStart w:id="70" w:name="why-the-round-is-small"/>
     <w:p>
       <w:pPr>
         <w:pStyle w:val="Heading3"/>
@@ -10931,8 +12271,8 @@
         <w:t xml:space="preserve">The founder has deliberately raised only what the plan needs, and has tied it to proof. Raising a large equity round before a university has paid would mean giving away a large share of the company at a low valuation. The disciplined route is to prove conversion with one paying university first, which makes DEQUAD investable on much better terms.</w:t>
       </w:r>
     </w:p>
-    <w:bookmarkEnd w:id="66"/>
-    <w:bookmarkStart w:id="67" w:name="future-investment-optional-not-assumed"/>
+    <w:bookmarkEnd w:id="70"/>
+    <w:bookmarkStart w:id="71" w:name="future-investment-optional-not-assumed"/>
     <w:p>
       <w:pPr>
         <w:pStyle w:val="Heading3"/>
@@ -10962,8 +12302,8 @@
         <w:t xml:space="preserve">, for example under SEIS/EIS. The purpose would be to speed up the hiring in the growth case and expand to further-education and international markets. This is an option, not a requirement. None of the forecasts in this plan include it.</w:t>
       </w:r>
     </w:p>
-    <w:bookmarkEnd w:id="67"/>
-    <w:bookmarkStart w:id="68" w:name="X147902193262d0a704e90425d0db73417192536"/>
+    <w:bookmarkEnd w:id="71"/>
+    <w:bookmarkStart w:id="72" w:name="X147902193262d0a704e90425d0db73417192536"/>
     <w:p>
       <w:pPr>
         <w:pStyle w:val="Heading3"/>
@@ -11626,9 +12966,9 @@
         </w:pict>
       </w:r>
     </w:p>
-    <w:bookmarkEnd w:id="68"/>
-    <w:bookmarkEnd w:id="69"/>
-    <w:bookmarkStart w:id="73" w:name="revenue-and-cost-of-sales-forecast"/>
+    <w:bookmarkEnd w:id="72"/>
+    <w:bookmarkEnd w:id="73"/>
+    <w:bookmarkStart w:id="77" w:name="revenue-and-cost-of-sales-forecast"/>
     <w:p>
       <w:pPr>
         <w:pStyle w:val="Heading2"/>
@@ -11645,7 +12985,7 @@
         <w:t xml:space="preserve">All figures are in GBP and exclude VAT. DEQUAD is not VAT-registered: base-case turnover stays below the £90,000 registration threshold. Year 1 = September 2026 to August 2027.</w:t>
       </w:r>
     </w:p>
-    <w:bookmarkStart w:id="70" w:name="customer-acquisition-base-case"/>
+    <w:bookmarkStart w:id="74" w:name="customer-acquisition-base-case"/>
     <w:p>
       <w:pPr>
         <w:pStyle w:val="Heading3"/>
@@ -13433,8 +14773,8 @@
         </w:tc>
       </w:tr>
     </w:tbl>
-    <w:bookmarkEnd w:id="70"/>
-    <w:bookmarkStart w:id="71" w:name="revenue-forecast"/>
+    <w:bookmarkEnd w:id="74"/>
+    <w:bookmarkStart w:id="75" w:name="revenue-forecast"/>
     <w:p>
       <w:pPr>
         <w:pStyle w:val="Heading3"/>
@@ -13857,8 +15197,8 @@
         <w:t xml:space="preserve">Licence revenue is recognised evenly over each 12-month term, although cash arrives up front (Section 12). Premium revenue is shown gross; app-store and payment fees sit in cost of sales.</w:t>
       </w:r>
     </w:p>
-    <w:bookmarkEnd w:id="71"/>
-    <w:bookmarkStart w:id="72" w:name="cost-of-sales"/>
+    <w:bookmarkEnd w:id="75"/>
+    <w:bookmarkStart w:id="76" w:name="cost-of-sales"/>
     <w:p>
       <w:pPr>
         <w:pStyle w:val="Heading3"/>
@@ -14586,9 +15926,9 @@
         </w:pict>
       </w:r>
     </w:p>
-    <w:bookmarkEnd w:id="72"/>
-    <w:bookmarkEnd w:id="73"/>
-    <w:bookmarkStart w:id="77" w:name="cash-flow-forecast"/>
+    <w:bookmarkEnd w:id="76"/>
+    <w:bookmarkEnd w:id="77"/>
+    <w:bookmarkStart w:id="81" w:name="cash-flow-forecast"/>
     <w:p>
       <w:pPr>
         <w:pStyle w:val="Heading2"/>
@@ -14597,7 +15937,7 @@
         <w:t xml:space="preserve">12. Cash Flow Forecast</w:t>
       </w:r>
     </w:p>
-    <w:bookmarkStart w:id="74" w:name="annual-cash-flow-base-case"/>
+    <w:bookmarkStart w:id="78" w:name="annual-cash-flow-base-case"/>
     <w:p>
       <w:pPr>
         <w:pStyle w:val="Heading3"/>
@@ -15648,8 +16988,8 @@
         <w:t xml:space="preserve">Licences are invoiced on signature, one month before each term starts, and paid on 30-day terms. Premium and Starter are collected monthly by card. Suppliers are paid in the month incurred, by card or direct debit. Insurance is paid in monthly instalments. Corporation tax is paid nine months and one day after each 31 August year end.</w:t>
       </w:r>
     </w:p>
-    <w:bookmarkEnd w:id="74"/>
-    <w:bookmarkStart w:id="75" w:name="monthly-cash-flow"/>
+    <w:bookmarkEnd w:id="78"/>
+    <w:bookmarkStart w:id="79" w:name="monthly-cash-flow"/>
     <w:p>
       <w:pPr>
         <w:pStyle w:val="Heading3"/>
@@ -15667,7 +17007,13 @@
           <w:bCs/>
           <w:b/>
         </w:rPr>
-        <w:t xml:space="preserve">Year 1 (FY27): Sep 2026 – Aug 2027</w:t>
+        <w:t xml:space="preserve">Year 1 (FY27): Sep 2026 – Aug 2027.</w:t>
+      </w:r>
+      <w:r>
+        <w:t xml:space="preserve"> </w:t>
+      </w:r>
+      <w:r>
+        <w:t xml:space="preserve">By stage: pre-pilot Sep–Dec 2026 and pilot Jan–Mar 2027, both funded by the founder’s £3,000; conversion Apr–Aug 2027, after the £11,000 post-pilot investment is received.</w:t>
       </w:r>
     </w:p>
     <w:tbl>
@@ -22371,8 +23717,8 @@
         <w:t xml:space="preserve">The tightest point is Mar-27 (£823), at the end of the pilot and just before the post-pilot investment arrives. Until then the business runs only on the founder’s £3,000, with marketing held to a minimum and every institutional-sales cost deferred. From April 2027 the balance does not fall below about £7,000. If the letter of intent takes longer to sign, the founder will keep the business in this lean mode (about £300 a month) until it is signed.</w:t>
       </w:r>
     </w:p>
-    <w:bookmarkEnd w:id="75"/>
-    <w:bookmarkStart w:id="76" w:name="X3c31fc83131edfd09e2e35d3d9fe16f99ee6cfe"/>
+    <w:bookmarkEnd w:id="79"/>
+    <w:bookmarkStart w:id="80" w:name="X3c31fc83131edfd09e2e35d3d9fe16f99ee6cfe"/>
     <w:p>
       <w:pPr>
         <w:pStyle w:val="Heading3"/>
@@ -22420,9 +23766,9 @@
         </w:pict>
       </w:r>
     </w:p>
-    <w:bookmarkEnd w:id="76"/>
-    <w:bookmarkEnd w:id="77"/>
-    <w:bookmarkStart w:id="78" w:name="profit-loss-forecast-base-case"/>
+    <w:bookmarkEnd w:id="80"/>
+    <w:bookmarkEnd w:id="81"/>
+    <w:bookmarkStart w:id="82" w:name="profit-loss-forecast-base-case"/>
     <w:p>
       <w:pPr>
         <w:pStyle w:val="Heading2"/>
@@ -24512,8 +25858,8 @@
         </w:pict>
       </w:r>
     </w:p>
-    <w:bookmarkEnd w:id="78"/>
-    <w:bookmarkStart w:id="79" w:name="balance-sheet-forecast-base-case"/>
+    <w:bookmarkEnd w:id="82"/>
+    <w:bookmarkStart w:id="83" w:name="balance-sheet-forecast-base-case"/>
     <w:p>
       <w:pPr>
         <w:pStyle w:val="Heading2"/>
@@ -25400,8 +26746,8 @@
         </w:pict>
       </w:r>
     </w:p>
-    <w:bookmarkEnd w:id="79"/>
-    <w:bookmarkStart w:id="80" w:name="forecasted-stock-levels"/>
+    <w:bookmarkEnd w:id="83"/>
+    <w:bookmarkStart w:id="84" w:name="forecasted-stock-levels"/>
     <w:p>
       <w:pPr>
         <w:pStyle w:val="Heading2"/>
@@ -25651,8 +26997,8 @@
         </w:pict>
       </w:r>
     </w:p>
-    <w:bookmarkEnd w:id="80"/>
-    <w:bookmarkStart w:id="81" w:name="X1d591f3b37592da90d45bc93a18d9f17b3c9093"/>
+    <w:bookmarkEnd w:id="84"/>
+    <w:bookmarkStart w:id="85" w:name="X1d591f3b37592da90d45bc93a18d9f17b3c9093"/>
     <w:p>
       <w:pPr>
         <w:pStyle w:val="Heading2"/>
@@ -26673,8 +28019,8 @@
         </w:pict>
       </w:r>
     </w:p>
-    <w:bookmarkEnd w:id="81"/>
-    <w:bookmarkStart w:id="82" w:name="forecasted-fixed-asset-schedule"/>
+    <w:bookmarkEnd w:id="85"/>
+    <w:bookmarkStart w:id="86" w:name="forecasted-fixed-asset-schedule"/>
     <w:p>
       <w:pPr>
         <w:pStyle w:val="Heading2"/>
@@ -27536,8 +28882,8 @@
         </w:pict>
       </w:r>
     </w:p>
-    <w:bookmarkEnd w:id="82"/>
-    <w:bookmarkStart w:id="86" w:name="forecasted-staff-costs"/>
+    <w:bookmarkEnd w:id="86"/>
+    <w:bookmarkStart w:id="90" w:name="forecasted-staff-costs"/>
     <w:p>
       <w:pPr>
         <w:pStyle w:val="Heading2"/>
@@ -27546,7 +28892,7 @@
         <w:t xml:space="preserve">18. Forecasted Staff Costs</w:t>
       </w:r>
     </w:p>
-    <w:bookmarkStart w:id="83" w:name="roles-and-pay-base-case"/>
+    <w:bookmarkStart w:id="87" w:name="roles-and-pay-base-case"/>
     <w:p>
       <w:pPr>
         <w:pStyle w:val="Heading3"/>
@@ -27968,8 +29314,8 @@
         </w:tc>
       </w:tr>
     </w:tbl>
-    <w:bookmarkEnd w:id="83"/>
-    <w:bookmarkStart w:id="84" w:name="total-staff-costs-base-case"/>
+    <w:bookmarkEnd w:id="87"/>
+    <w:bookmarkStart w:id="88" w:name="total-staff-costs-base-case"/>
     <w:p>
       <w:pPr>
         <w:pStyle w:val="Heading3"/>
@@ -28694,8 +30040,8 @@
         <w:t xml:space="preserve">paid as a director through PAYE from Year 3. Before then, unpaid (Section 7.1).</w:t>
       </w:r>
     </w:p>
-    <w:bookmarkEnd w:id="84"/>
-    <w:bookmarkStart w:id="85" w:name="growth-case-staffing"/>
+    <w:bookmarkEnd w:id="88"/>
+    <w:bookmarkStart w:id="89" w:name="growth-case-staffing"/>
     <w:p>
       <w:pPr>
         <w:pStyle w:val="Heading3"/>
@@ -29518,9 +30864,9 @@
         </w:pict>
       </w:r>
     </w:p>
-    <w:bookmarkEnd w:id="85"/>
-    <w:bookmarkEnd w:id="86"/>
-    <w:bookmarkStart w:id="88" w:name="appendices"/>
+    <w:bookmarkEnd w:id="89"/>
+    <w:bookmarkEnd w:id="90"/>
+    <w:bookmarkStart w:id="92" w:name="appendices"/>
     <w:p>
       <w:pPr>
         <w:pStyle w:val="Heading2"/>
@@ -30179,7 +31525,7 @@
         </w:tc>
       </w:tr>
     </w:tbl>
-    <w:bookmarkStart w:id="87" w:name="founder-cv-summary"/>
+    <w:bookmarkStart w:id="91" w:name="founder-cv-summary"/>
     <w:p>
       <w:pPr>
         <w:pStyle w:val="Heading3"/>
@@ -30213,10 +31559,10 @@
         </w:pict>
       </w:r>
     </w:p>
-    <w:bookmarkEnd w:id="87"/>
-    <w:bookmarkEnd w:id="88"/>
-    <w:bookmarkEnd w:id="89"/>
-    <w:bookmarkStart w:id="93" w:name="appendix-f-financial-model-summary"/>
+    <w:bookmarkEnd w:id="91"/>
+    <w:bookmarkEnd w:id="92"/>
+    <w:bookmarkEnd w:id="93"/>
+    <w:bookmarkStart w:id="97" w:name="appendix-f-financial-model-summary"/>
     <w:p>
       <w:pPr>
         <w:pStyle w:val="Heading1"/>
@@ -30274,7 +31620,7 @@
         <w:t xml:space="preserve">). The model checks that the balance sheet balances in every year.</w:t>
       </w:r>
     </w:p>
-    <w:bookmarkStart w:id="90" w:name="f.1-key-assumptions"/>
+    <w:bookmarkStart w:id="94" w:name="f.1-key-assumptions"/>
     <w:p>
       <w:pPr>
         <w:pStyle w:val="Heading3"/>
@@ -30558,8 +31904,8 @@
         </w:tc>
       </w:tr>
     </w:tbl>
-    <w:bookmarkEnd w:id="90"/>
-    <w:bookmarkStart w:id="91" w:name="f.2-growth-case-profit-loss"/>
+    <w:bookmarkEnd w:id="94"/>
+    <w:bookmarkStart w:id="95" w:name="f.2-growth-case-profit-loss"/>
     <w:p>
       <w:pPr>
         <w:pStyle w:val="Heading3"/>
@@ -32186,8 +33532,8 @@
         </w:tc>
       </w:tr>
     </w:tbl>
-    <w:bookmarkEnd w:id="91"/>
-    <w:bookmarkStart w:id="92" w:name="f.3-growth-case-cash-flow"/>
+    <w:bookmarkEnd w:id="95"/>
+    <w:bookmarkStart w:id="96" w:name="f.3-growth-case-cash-flow"/>
     <w:p>
       <w:pPr>
         <w:pStyle w:val="Heading3"/>
@@ -33248,11 +34594,11 @@
           <w:iCs/>
           <w:i/>
         </w:rPr>
-        <w:t xml:space="preserve">All figures are forecasts, not guarantees. This business plan was prepared by Yusuf Quadri (Founder &amp; CEO) for the UK Innovator Founder endorsement application to UKES. Version 6.0, October 2026.</w:t>
+        <w:t xml:space="preserve">All figures are forecasts, not guarantees. This pre-pilot stage business plan was prepared by Yusuf Quadri (Founder &amp; CEO) for the UK Innovator Founder endorsement application to UKES. Version 7.0, October 2026.</w:t>
       </w:r>
     </w:p>
-    <w:bookmarkEnd w:id="92"/>
-    <w:bookmarkEnd w:id="93"/>
+    <w:bookmarkEnd w:id="96"/>
+    <w:bookmarkEnd w:id="97"/>
     <w:sectPr/>
   </w:body>
 </w:document>

</xml_diff>